<commit_message>
docs(bd): add Ian task-status tracker (§0) to Friday actionables
Pulls Ian-owned items out of the prose into a status table: Awards Finder DONE,
California/Greystar scout DONE, design-build/prime-consultant research DONE, Biz
Brain build-out DONE+ongoing, ad-hoc org enrichment EXISTS (people = gap), social
automation in-progress, + the open items. Regenerated DOCX.

Co-Authored-By: Claude Opus 4.8 <noreply@anthropic.com>
</commit_message>
<xml_diff>
--- a/docs/BD-Meeting-Actionables-2026-06-19.docx
+++ b/docs/BD-Meeting-Actionables-2026-06-19.docx
@@ -10,7 +10,7 @@
           <w:sz w:val="24"/>
           <w:szCs w:val="24"/>
         </w:rPr>
-        <w:id w:val="-1947531938"/>
+        <w:id w:val="-63876104"/>
         <w:docPartObj>
           <w:docPartGallery w:val="Table of Contents"/>
           <w:docPartUnique/>
@@ -52,7 +52,7 @@
           <w:r>
             <w:fldChar w:fldCharType="separate"/>
           </w:r>
-          <w:hyperlink w:anchor="_Toc232957124" w:history="1">
+          <w:hyperlink w:anchor="_Toc232957770" w:history="1">
             <w:r>
               <w:rPr>
                 <w:rStyle w:val="Hyperlink"/>
@@ -79,7 +79,7 @@
                 <w:noProof/>
                 <w:webHidden/>
               </w:rPr>
-              <w:instrText xml:space="preserve"> PAGEREF _Toc232957124 \h </w:instrText>
+              <w:instrText xml:space="preserve"> PAGEREF _Toc232957770 \h </w:instrText>
             </w:r>
             <w:r>
               <w:rPr>
@@ -120,13 +120,13 @@
               <w:noProof/>
             </w:rPr>
           </w:pPr>
-          <w:hyperlink w:anchor="_Toc232957125" w:history="1">
+          <w:hyperlink w:anchor="_Toc232957771" w:history="1">
             <w:r>
               <w:rPr>
                 <w:rStyle w:val="Hyperlink"/>
                 <w:noProof/>
               </w:rPr>
-              <w:t>1. Firm-level actionables (lists, qualifications, proposals)</w:t>
+              <w:t>0. Ian’s tasks — status tracker (added 2026-06-21)</w:t>
             </w:r>
             <w:r>
               <w:rPr>
@@ -147,7 +147,7 @@
                 <w:noProof/>
                 <w:webHidden/>
               </w:rPr>
-              <w:instrText xml:space="preserve"> PAGEREF _Toc232957125 \h </w:instrText>
+              <w:instrText xml:space="preserve"> PAGEREF _Toc232957771 \h </w:instrText>
             </w:r>
             <w:r>
               <w:rPr>
@@ -188,13 +188,13 @@
               <w:noProof/>
             </w:rPr>
           </w:pPr>
-          <w:hyperlink w:anchor="_Toc232957126" w:history="1">
+          <w:hyperlink w:anchor="_Toc232957772" w:history="1">
             <w:r>
               <w:rPr>
                 <w:rStyle w:val="Hyperlink"/>
                 <w:noProof/>
               </w:rPr>
-              <w:t>2. The “Biz Brain” + CRM + process</w:t>
+              <w:t>1. Firm-level actionables (lists, qualifications, proposals)</w:t>
             </w:r>
             <w:r>
               <w:rPr>
@@ -215,7 +215,7 @@
                 <w:noProof/>
                 <w:webHidden/>
               </w:rPr>
-              <w:instrText xml:space="preserve"> PAGEREF _Toc232957126 \h </w:instrText>
+              <w:instrText xml:space="preserve"> PAGEREF _Toc232957772 \h </w:instrText>
             </w:r>
             <w:r>
               <w:rPr>
@@ -235,7 +235,7 @@
                 <w:noProof/>
                 <w:webHidden/>
               </w:rPr>
-              <w:t>3</w:t>
+              <w:t>4</w:t>
             </w:r>
             <w:r>
               <w:rPr>
@@ -256,13 +256,13 @@
               <w:noProof/>
             </w:rPr>
           </w:pPr>
-          <w:hyperlink w:anchor="_Toc232957127" w:history="1">
+          <w:hyperlink w:anchor="_Toc232957773" w:history="1">
             <w:r>
               <w:rPr>
                 <w:rStyle w:val="Hyperlink"/>
                 <w:noProof/>
               </w:rPr>
-              <w:t>3. Website overhaul — decision at Monday partnership meeting</w:t>
+              <w:t>2. The “Biz Brain” + CRM + process</w:t>
             </w:r>
             <w:r>
               <w:rPr>
@@ -283,7 +283,7 @@
                 <w:noProof/>
                 <w:webHidden/>
               </w:rPr>
-              <w:instrText xml:space="preserve"> PAGEREF _Toc232957127 \h </w:instrText>
+              <w:instrText xml:space="preserve"> PAGEREF _Toc232957773 \h </w:instrText>
             </w:r>
             <w:r>
               <w:rPr>
@@ -303,7 +303,7 @@
                 <w:noProof/>
                 <w:webHidden/>
               </w:rPr>
-              <w:t>4</w:t>
+              <w:t>5</w:t>
             </w:r>
             <w:r>
               <w:rPr>
@@ -324,13 +324,13 @@
               <w:noProof/>
             </w:rPr>
           </w:pPr>
-          <w:hyperlink w:anchor="_Toc232957128" w:history="1">
+          <w:hyperlink w:anchor="_Toc232957774" w:history="1">
             <w:r>
               <w:rPr>
                 <w:rStyle w:val="Hyperlink"/>
                 <w:noProof/>
               </w:rPr>
-              <w:t>4. Marketing / promotion</w:t>
+              <w:t>3. Website overhaul — decision at Monday partnership meeting</w:t>
             </w:r>
             <w:r>
               <w:rPr>
@@ -351,7 +351,7 @@
                 <w:noProof/>
                 <w:webHidden/>
               </w:rPr>
-              <w:instrText xml:space="preserve"> PAGEREF _Toc232957128 \h </w:instrText>
+              <w:instrText xml:space="preserve"> PAGEREF _Toc232957774 \h </w:instrText>
             </w:r>
             <w:r>
               <w:rPr>
@@ -371,7 +371,7 @@
                 <w:noProof/>
                 <w:webHidden/>
               </w:rPr>
-              <w:t>4</w:t>
+              <w:t>6</w:t>
             </w:r>
             <w:r>
               <w:rPr>
@@ -392,13 +392,13 @@
               <w:noProof/>
             </w:rPr>
           </w:pPr>
-          <w:hyperlink w:anchor="_Toc232957129" w:history="1">
+          <w:hyperlink w:anchor="_Toc232957775" w:history="1">
             <w:r>
               <w:rPr>
                 <w:rStyle w:val="Hyperlink"/>
                 <w:noProof/>
               </w:rPr>
-              <w:t>5. Target lists by region (corrected names → owner → action)</w:t>
+              <w:t>4. Marketing / promotion</w:t>
             </w:r>
             <w:r>
               <w:rPr>
@@ -419,7 +419,7 @@
                 <w:noProof/>
                 <w:webHidden/>
               </w:rPr>
-              <w:instrText xml:space="preserve"> PAGEREF _Toc232957129 \h </w:instrText>
+              <w:instrText xml:space="preserve"> PAGEREF _Toc232957775 \h </w:instrText>
             </w:r>
             <w:r>
               <w:rPr>
@@ -439,7 +439,7 @@
                 <w:noProof/>
                 <w:webHidden/>
               </w:rPr>
-              <w:t>5</w:t>
+              <w:t>6</w:t>
             </w:r>
             <w:r>
               <w:rPr>
@@ -460,13 +460,13 @@
               <w:noProof/>
             </w:rPr>
           </w:pPr>
-          <w:hyperlink w:anchor="_Toc232957130" w:history="1">
+          <w:hyperlink w:anchor="_Toc232957776" w:history="1">
             <w:r>
               <w:rPr>
                 <w:rStyle w:val="Hyperlink"/>
                 <w:noProof/>
               </w:rPr>
-              <w:t>6. New-sector / “outside the box” ideas to chase</w:t>
+              <w:t>5. Target lists by region (corrected names → owner → action)</w:t>
             </w:r>
             <w:r>
               <w:rPr>
@@ -487,7 +487,7 @@
                 <w:noProof/>
                 <w:webHidden/>
               </w:rPr>
-              <w:instrText xml:space="preserve"> PAGEREF _Toc232957130 \h </w:instrText>
+              <w:instrText xml:space="preserve"> PAGEREF _Toc232957776 \h </w:instrText>
             </w:r>
             <w:r>
               <w:rPr>
@@ -507,7 +507,7 @@
                 <w:noProof/>
                 <w:webHidden/>
               </w:rPr>
-              <w:t>8</w:t>
+              <w:t>6</w:t>
             </w:r>
             <w:r>
               <w:rPr>
@@ -528,13 +528,13 @@
               <w:noProof/>
             </w:rPr>
           </w:pPr>
-          <w:hyperlink w:anchor="_Toc232957131" w:history="1">
+          <w:hyperlink w:anchor="_Toc232957777" w:history="1">
             <w:r>
               <w:rPr>
                 <w:rStyle w:val="Hyperlink"/>
                 <w:noProof/>
               </w:rPr>
-              <w:t>7. Intel flags (read before acting)</w:t>
+              <w:t>6. New-sector / “outside the box” ideas to chase</w:t>
             </w:r>
             <w:r>
               <w:rPr>
@@ -555,7 +555,7 @@
                 <w:noProof/>
                 <w:webHidden/>
               </w:rPr>
-              <w:instrText xml:space="preserve"> PAGEREF _Toc232957131 \h </w:instrText>
+              <w:instrText xml:space="preserve"> PAGEREF _Toc232957777 \h </w:instrText>
             </w:r>
             <w:r>
               <w:rPr>
@@ -575,7 +575,7 @@
                 <w:noProof/>
                 <w:webHidden/>
               </w:rPr>
-              <w:t>9</w:t>
+              <w:t>10</w:t>
             </w:r>
             <w:r>
               <w:rPr>
@@ -596,13 +596,13 @@
               <w:noProof/>
             </w:rPr>
           </w:pPr>
-          <w:hyperlink w:anchor="_Toc232957132" w:history="1">
+          <w:hyperlink w:anchor="_Toc232957778" w:history="1">
             <w:r>
               <w:rPr>
                 <w:rStyle w:val="Hyperlink"/>
                 <w:noProof/>
               </w:rPr>
-              <w:t>8. Confirmed people directory</w:t>
+              <w:t>7. Intel flags (read before acting)</w:t>
             </w:r>
             <w:r>
               <w:rPr>
@@ -623,7 +623,7 @@
                 <w:noProof/>
                 <w:webHidden/>
               </w:rPr>
-              <w:instrText xml:space="preserve"> PAGEREF _Toc232957132 \h </w:instrText>
+              <w:instrText xml:space="preserve"> PAGEREF _Toc232957778 \h </w:instrText>
             </w:r>
             <w:r>
               <w:rPr>
@@ -643,7 +643,7 @@
                 <w:noProof/>
                 <w:webHidden/>
               </w:rPr>
-              <w:t>10</w:t>
+              <w:t>11</w:t>
             </w:r>
             <w:r>
               <w:rPr>
@@ -664,13 +664,13 @@
               <w:noProof/>
             </w:rPr>
           </w:pPr>
-          <w:hyperlink w:anchor="_Toc232957133" w:history="1">
+          <w:hyperlink w:anchor="_Toc232957779" w:history="1">
             <w:r>
               <w:rPr>
                 <w:rStyle w:val="Hyperlink"/>
                 <w:noProof/>
               </w:rPr>
-              <w:t>9. Verify directly (don’t guess further)</w:t>
+              <w:t>8. Confirmed people directory</w:t>
             </w:r>
             <w:r>
               <w:rPr>
@@ -691,7 +691,7 @@
                 <w:noProof/>
                 <w:webHidden/>
               </w:rPr>
-              <w:instrText xml:space="preserve"> PAGEREF _Toc232957133 \h </w:instrText>
+              <w:instrText xml:space="preserve"> PAGEREF _Toc232957779 \h </w:instrText>
             </w:r>
             <w:r>
               <w:rPr>
@@ -732,13 +732,13 @@
               <w:noProof/>
             </w:rPr>
           </w:pPr>
-          <w:hyperlink w:anchor="_Toc232957134" w:history="1">
+          <w:hyperlink w:anchor="_Toc232957780" w:history="1">
             <w:r>
               <w:rPr>
                 <w:rStyle w:val="Hyperlink"/>
                 <w:noProof/>
               </w:rPr>
-              <w:t>10. Biz Brain ingest (applied &amp; verified 2026-06-19)</w:t>
+              <w:t>9. Verify directly (don’t guess further)</w:t>
             </w:r>
             <w:r>
               <w:rPr>
@@ -759,7 +759,7 @@
                 <w:noProof/>
                 <w:webHidden/>
               </w:rPr>
-              <w:instrText xml:space="preserve"> PAGEREF _Toc232957134 \h </w:instrText>
+              <w:instrText xml:space="preserve"> PAGEREF _Toc232957780 \h </w:instrText>
             </w:r>
             <w:r>
               <w:rPr>
@@ -779,7 +779,7 @@
                 <w:noProof/>
                 <w:webHidden/>
               </w:rPr>
-              <w:t>11</w:t>
+              <w:t>13</w:t>
             </w:r>
             <w:r>
               <w:rPr>
@@ -800,13 +800,13 @@
               <w:noProof/>
             </w:rPr>
           </w:pPr>
-          <w:hyperlink w:anchor="_Toc232957135" w:history="1">
+          <w:hyperlink w:anchor="_Toc232957781" w:history="1">
             <w:r>
               <w:rPr>
                 <w:rStyle w:val="Hyperlink"/>
                 <w:noProof/>
               </w:rPr>
-              <w:t>11. CRM — pursuits loaded this session (applied &amp; verified 2026-06-19)</w:t>
+              <w:t>10. Biz Brain ingest (applied &amp; verified 2026-06-19)</w:t>
             </w:r>
             <w:r>
               <w:rPr>
@@ -827,7 +827,7 @@
                 <w:noProof/>
                 <w:webHidden/>
               </w:rPr>
-              <w:instrText xml:space="preserve"> PAGEREF _Toc232957135 \h </w:instrText>
+              <w:instrText xml:space="preserve"> PAGEREF _Toc232957781 \h </w:instrText>
             </w:r>
             <w:r>
               <w:rPr>
@@ -847,7 +847,75 @@
                 <w:noProof/>
                 <w:webHidden/>
               </w:rPr>
-              <w:t>12</w:t>
+              <w:t>13</w:t>
+            </w:r>
+            <w:r>
+              <w:rPr>
+                <w:noProof/>
+                <w:webHidden/>
+              </w:rPr>
+              <w:fldChar w:fldCharType="end"/>
+            </w:r>
+          </w:hyperlink>
+        </w:p>
+        <w:p>
+          <w:pPr>
+            <w:pStyle w:val="TOC2"/>
+            <w:tabs>
+              <w:tab w:val="right" w:leader="dot" w:pos="9350"/>
+            </w:tabs>
+            <w:rPr>
+              <w:noProof/>
+            </w:rPr>
+          </w:pPr>
+          <w:hyperlink w:anchor="_Toc232957782" w:history="1">
+            <w:r>
+              <w:rPr>
+                <w:rStyle w:val="Hyperlink"/>
+                <w:noProof/>
+              </w:rPr>
+              <w:t>11. CRM — pursuits loaded this session (applied &amp; verified 2026-06-19)</w:t>
+            </w:r>
+            <w:r>
+              <w:rPr>
+                <w:noProof/>
+                <w:webHidden/>
+              </w:rPr>
+              <w:tab/>
+            </w:r>
+            <w:r>
+              <w:rPr>
+                <w:noProof/>
+                <w:webHidden/>
+              </w:rPr>
+              <w:fldChar w:fldCharType="begin"/>
+            </w:r>
+            <w:r>
+              <w:rPr>
+                <w:noProof/>
+                <w:webHidden/>
+              </w:rPr>
+              <w:instrText xml:space="preserve"> PAGEREF _Toc232957782 \h </w:instrText>
+            </w:r>
+            <w:r>
+              <w:rPr>
+                <w:noProof/>
+                <w:webHidden/>
+              </w:rPr>
+            </w:r>
+            <w:r>
+              <w:rPr>
+                <w:noProof/>
+                <w:webHidden/>
+              </w:rPr>
+              <w:fldChar w:fldCharType="separate"/>
+            </w:r>
+            <w:r>
+              <w:rPr>
+                <w:noProof/>
+                <w:webHidden/>
+              </w:rPr>
+              <w:t>14</w:t>
             </w:r>
             <w:r>
               <w:rPr>
@@ -870,7 +938,7 @@
         <w:pStyle w:val="Heading1"/>
       </w:pPr>
       <w:bookmarkStart w:id="0" w:name="Xf82bafeb53a3c87ba169f235266c143b22ca82c"/>
-      <w:bookmarkStart w:id="1" w:name="_Toc232957124"/>
+      <w:bookmarkStart w:id="1" w:name="_Toc232957770"/>
       <w:r>
         <w:t>BD Meeting — Vancouver Lower Mainland — Actionables &amp; Verified Targets</w:t>
       </w:r>
@@ -1330,7 +1398,7 @@
     </w:p>
     <w:p>
       <w:r>
-        <w:pict w14:anchorId="6B4B8226">
+        <w:pict w14:anchorId="765778D4">
           <v:rect id="_x0000_i1025" style="width:0;height:1.5pt" o:hralign="center" o:hrstd="t" o:hr="t"/>
         </w:pict>
       </w:r>
@@ -1340,12 +1408,1324 @@
         <w:pStyle w:val="Heading2"/>
         <w:pageBreakBefore/>
       </w:pPr>
-      <w:bookmarkStart w:id="2" w:name="Xdfed9eb99d51080e80e136cd86e447e240bf84f"/>
-      <w:bookmarkStart w:id="3" w:name="_Toc232957125"/>
+      <w:bookmarkStart w:id="2" w:name="X41b0927f7dbe2ef81759d3e6a32475b9cceaa65"/>
+      <w:bookmarkStart w:id="3" w:name="_Toc232957771"/>
+      <w:r>
+        <w:t>0. Ian’s tasks — status tracker (added 2026-06-21)</w:t>
+      </w:r>
+      <w:bookmarkEnd w:id="3"/>
+    </w:p>
+    <w:p>
+      <w:pPr>
+        <w:pStyle w:val="FirstParagraph"/>
+      </w:pPr>
+      <w:r>
+        <w:rPr>
+          <w:i/>
+          <w:iCs/>
+        </w:rPr>
+        <w:t>Your action items pulled out of §1/§2/§4/§5 with current status.</w:t>
+      </w:r>
+    </w:p>
+    <w:tbl>
+      <w:tblPr>
+        <w:tblStyle w:val="GridTable5Dark-Accent1"/>
+        <w:tblW w:w="5000" w:type="pct"/>
+        <w:tblCellMar>
+          <w:top w:w="40" w:type="dxa"/>
+          <w:left w:w="100" w:type="dxa"/>
+          <w:bottom w:w="40" w:type="dxa"/>
+          <w:right w:w="100" w:type="dxa"/>
+        </w:tblCellMar>
+        <w:tblLook w:val="0420" w:firstRow="1" w:lastRow="0" w:firstColumn="0" w:lastColumn="0" w:noHBand="0" w:noVBand="1"/>
+      </w:tblPr>
+      <w:tblGrid>
+        <w:gridCol w:w="2390"/>
+        <w:gridCol w:w="2390"/>
+        <w:gridCol w:w="2390"/>
+        <w:gridCol w:w="2390"/>
+      </w:tblGrid>
+      <w:tr>
+        <w:trPr>
+          <w:cnfStyle w:val="100000000000" w:firstRow="1" w:lastRow="0" w:firstColumn="0" w:lastColumn="0" w:oddVBand="0" w:evenVBand="0" w:oddHBand="0" w:evenHBand="0" w:firstRowFirstColumn="0" w:firstRowLastColumn="0" w:lastRowFirstColumn="0" w:lastRowLastColumn="0"/>
+          <w:cantSplit/>
+          <w:tblHeader/>
+        </w:trPr>
+        <w:tc>
+          <w:tcPr>
+            <w:tcW w:w="1250" w:type="pct"/>
+          </w:tcPr>
+          <w:p>
+            <w:pPr>
+              <w:pStyle w:val="Compact"/>
+              <w:rPr>
+                <w:b w:val="0"/>
+                <w:sz w:val="19"/>
+              </w:rPr>
+            </w:pPr>
+            <w:r>
+              <w:rPr>
+                <w:b w:val="0"/>
+                <w:sz w:val="19"/>
+              </w:rPr>
+              <w:t>#</w:t>
+            </w:r>
+          </w:p>
+        </w:tc>
+        <w:tc>
+          <w:tcPr>
+            <w:tcW w:w="1250" w:type="pct"/>
+          </w:tcPr>
+          <w:p>
+            <w:pPr>
+              <w:pStyle w:val="Compact"/>
+              <w:rPr>
+                <w:b w:val="0"/>
+                <w:sz w:val="19"/>
+              </w:rPr>
+            </w:pPr>
+            <w:r>
+              <w:rPr>
+                <w:b w:val="0"/>
+                <w:sz w:val="19"/>
+              </w:rPr>
+              <w:t>Your task (source §)</w:t>
+            </w:r>
+          </w:p>
+        </w:tc>
+        <w:tc>
+          <w:tcPr>
+            <w:tcW w:w="1250" w:type="pct"/>
+          </w:tcPr>
+          <w:p>
+            <w:pPr>
+              <w:pStyle w:val="Compact"/>
+              <w:rPr>
+                <w:b w:val="0"/>
+                <w:sz w:val="19"/>
+              </w:rPr>
+            </w:pPr>
+            <w:r>
+              <w:rPr>
+                <w:b w:val="0"/>
+                <w:sz w:val="19"/>
+              </w:rPr>
+              <w:t>Status</w:t>
+            </w:r>
+          </w:p>
+        </w:tc>
+        <w:tc>
+          <w:tcPr>
+            <w:tcW w:w="1250" w:type="pct"/>
+          </w:tcPr>
+          <w:p>
+            <w:pPr>
+              <w:pStyle w:val="Compact"/>
+              <w:rPr>
+                <w:b w:val="0"/>
+                <w:sz w:val="19"/>
+              </w:rPr>
+            </w:pPr>
+            <w:r>
+              <w:rPr>
+                <w:b w:val="0"/>
+                <w:sz w:val="19"/>
+              </w:rPr>
+              <w:t>Note</w:t>
+            </w:r>
+          </w:p>
+        </w:tc>
+      </w:tr>
+      <w:tr>
+        <w:trPr>
+          <w:cnfStyle w:val="000000100000" w:firstRow="0" w:lastRow="0" w:firstColumn="0" w:lastColumn="0" w:oddVBand="0" w:evenVBand="0" w:oddHBand="1" w:evenHBand="0" w:firstRowFirstColumn="0" w:firstRowLastColumn="0" w:lastRowFirstColumn="0" w:lastRowLastColumn="0"/>
+          <w:cantSplit/>
+        </w:trPr>
+        <w:tc>
+          <w:tcPr>
+            <w:tcW w:w="1250" w:type="pct"/>
+          </w:tcPr>
+          <w:p>
+            <w:pPr>
+              <w:pStyle w:val="Compact"/>
+              <w:rPr>
+                <w:sz w:val="19"/>
+              </w:rPr>
+            </w:pPr>
+            <w:r>
+              <w:rPr>
+                <w:sz w:val="19"/>
+              </w:rPr>
+              <w:t>A</w:t>
+            </w:r>
+          </w:p>
+        </w:tc>
+        <w:tc>
+          <w:tcPr>
+            <w:tcW w:w="1250" w:type="pct"/>
+          </w:tcPr>
+          <w:p>
+            <w:pPr>
+              <w:pStyle w:val="Compact"/>
+              <w:rPr>
+                <w:sz w:val="19"/>
+              </w:rPr>
+            </w:pPr>
+            <w:r>
+              <w:rPr>
+                <w:b/>
+                <w:bCs/>
+                <w:sz w:val="19"/>
+              </w:rPr>
+              <w:t>Awards</w:t>
+            </w:r>
+            <w:r>
+              <w:rPr>
+                <w:sz w:val="19"/>
+              </w:rPr>
+              <w:t xml:space="preserve"> — brain finds AEC awards to apply for (§4)</w:t>
+            </w:r>
+          </w:p>
+        </w:tc>
+        <w:tc>
+          <w:tcPr>
+            <w:tcW w:w="1250" w:type="pct"/>
+          </w:tcPr>
+          <w:p>
+            <w:pPr>
+              <w:pStyle w:val="Compact"/>
+              <w:rPr>
+                <w:sz w:val="19"/>
+              </w:rPr>
+            </w:pPr>
+            <w:r>
+              <w:rPr>
+                <w:rFonts w:ascii="Segoe UI Emoji" w:hAnsi="Segoe UI Emoji" w:cs="Segoe UI Emoji"/>
+                <w:sz w:val="19"/>
+              </w:rPr>
+              <w:t>✅</w:t>
+            </w:r>
+            <w:r>
+              <w:rPr>
+                <w:sz w:val="19"/>
+              </w:rPr>
+              <w:t xml:space="preserve"> </w:t>
+            </w:r>
+            <w:r>
+              <w:rPr>
+                <w:b/>
+                <w:bCs/>
+                <w:sz w:val="19"/>
+              </w:rPr>
+              <w:t>DONE</w:t>
+            </w:r>
+          </w:p>
+        </w:tc>
+        <w:tc>
+          <w:tcPr>
+            <w:tcW w:w="1250" w:type="pct"/>
+          </w:tcPr>
+          <w:p>
+            <w:pPr>
+              <w:pStyle w:val="Compact"/>
+              <w:rPr>
+                <w:sz w:val="19"/>
+              </w:rPr>
+            </w:pPr>
+            <w:r>
+              <w:rPr>
+                <w:sz w:val="19"/>
+              </w:rPr>
+              <w:t>Industry Awards Finder built + deployed; auto-discovers KOR-enterable award programs; surfaces in the app. Auto-</w:t>
+            </w:r>
+            <w:r>
+              <w:rPr>
+                <w:i/>
+                <w:iCs/>
+                <w:sz w:val="19"/>
+              </w:rPr>
+              <w:t>apply</w:t>
+            </w:r>
+            <w:r>
+              <w:rPr>
+                <w:sz w:val="19"/>
+              </w:rPr>
+              <w:t xml:space="preserve"> still human-review by design.</w:t>
+            </w:r>
+          </w:p>
+        </w:tc>
+      </w:tr>
+      <w:tr>
+        <w:trPr>
+          <w:cantSplit/>
+        </w:trPr>
+        <w:tc>
+          <w:tcPr>
+            <w:tcW w:w="1250" w:type="pct"/>
+          </w:tcPr>
+          <w:p>
+            <w:pPr>
+              <w:pStyle w:val="Compact"/>
+              <w:rPr>
+                <w:sz w:val="19"/>
+              </w:rPr>
+            </w:pPr>
+            <w:r>
+              <w:rPr>
+                <w:sz w:val="19"/>
+              </w:rPr>
+              <w:t>B</w:t>
+            </w:r>
+          </w:p>
+        </w:tc>
+        <w:tc>
+          <w:tcPr>
+            <w:tcW w:w="1250" w:type="pct"/>
+          </w:tcPr>
+          <w:p>
+            <w:pPr>
+              <w:pStyle w:val="Compact"/>
+              <w:rPr>
+                <w:sz w:val="19"/>
+              </w:rPr>
+            </w:pPr>
+            <w:r>
+              <w:rPr>
+                <w:b/>
+                <w:bCs/>
+                <w:sz w:val="19"/>
+              </w:rPr>
+              <w:t>Scout John’s 5 California developer cos</w:t>
+            </w:r>
+            <w:r>
+              <w:rPr>
+                <w:sz w:val="19"/>
+              </w:rPr>
+              <w:t xml:space="preserve"> (§5 USA)</w:t>
+            </w:r>
+          </w:p>
+        </w:tc>
+        <w:tc>
+          <w:tcPr>
+            <w:tcW w:w="1250" w:type="pct"/>
+          </w:tcPr>
+          <w:p>
+            <w:pPr>
+              <w:pStyle w:val="Compact"/>
+              <w:rPr>
+                <w:sz w:val="19"/>
+              </w:rPr>
+            </w:pPr>
+            <w:r>
+              <w:rPr>
+                <w:rFonts w:ascii="Segoe UI Emoji" w:hAnsi="Segoe UI Emoji" w:cs="Segoe UI Emoji"/>
+                <w:sz w:val="19"/>
+              </w:rPr>
+              <w:t>✅</w:t>
+            </w:r>
+            <w:r>
+              <w:rPr>
+                <w:sz w:val="19"/>
+              </w:rPr>
+              <w:t xml:space="preserve"> </w:t>
+            </w:r>
+            <w:r>
+              <w:rPr>
+                <w:b/>
+                <w:bCs/>
+                <w:sz w:val="19"/>
+              </w:rPr>
+              <w:t>DONE (Greystar)</w:t>
+            </w:r>
+          </w:p>
+        </w:tc>
+        <w:tc>
+          <w:tcPr>
+            <w:tcW w:w="1250" w:type="pct"/>
+          </w:tcPr>
+          <w:p>
+            <w:pPr>
+              <w:pStyle w:val="Compact"/>
+              <w:rPr>
+                <w:sz w:val="19"/>
+              </w:rPr>
+            </w:pPr>
+            <w:r>
+              <w:rPr>
+                <w:sz w:val="19"/>
+              </w:rPr>
+              <w:t>KOR-Greystar-Scout + California dossier/field-guide/call-sheet delivered. Other 4 await John naming them.</w:t>
+            </w:r>
+          </w:p>
+        </w:tc>
+      </w:tr>
+      <w:tr>
+        <w:trPr>
+          <w:cnfStyle w:val="000000100000" w:firstRow="0" w:lastRow="0" w:firstColumn="0" w:lastColumn="0" w:oddVBand="0" w:evenVBand="0" w:oddHBand="1" w:evenHBand="0" w:firstRowFirstColumn="0" w:firstRowLastColumn="0" w:lastRowFirstColumn="0" w:lastRowLastColumn="0"/>
+          <w:cantSplit/>
+        </w:trPr>
+        <w:tc>
+          <w:tcPr>
+            <w:tcW w:w="1250" w:type="pct"/>
+          </w:tcPr>
+          <w:p>
+            <w:pPr>
+              <w:pStyle w:val="Compact"/>
+              <w:rPr>
+                <w:sz w:val="19"/>
+              </w:rPr>
+            </w:pPr>
+            <w:r>
+              <w:rPr>
+                <w:sz w:val="19"/>
+              </w:rPr>
+              <w:t>C</w:t>
+            </w:r>
+          </w:p>
+        </w:tc>
+        <w:tc>
+          <w:tcPr>
+            <w:tcW w:w="1250" w:type="pct"/>
+          </w:tcPr>
+          <w:p>
+            <w:pPr>
+              <w:pStyle w:val="Compact"/>
+              <w:rPr>
+                <w:sz w:val="19"/>
+              </w:rPr>
+            </w:pPr>
+            <w:r>
+              <w:rPr>
+                <w:b/>
+                <w:bCs/>
+                <w:sz w:val="19"/>
+              </w:rPr>
+              <w:t>Design-build / “big-fee” qualification research</w:t>
+            </w:r>
+            <w:r>
+              <w:rPr>
+                <w:sz w:val="19"/>
+              </w:rPr>
+              <w:t xml:space="preserve"> (§1#5, §5)</w:t>
+            </w:r>
+          </w:p>
+        </w:tc>
+        <w:tc>
+          <w:tcPr>
+            <w:tcW w:w="1250" w:type="pct"/>
+          </w:tcPr>
+          <w:p>
+            <w:pPr>
+              <w:pStyle w:val="Compact"/>
+              <w:rPr>
+                <w:sz w:val="19"/>
+              </w:rPr>
+            </w:pPr>
+            <w:r>
+              <w:rPr>
+                <w:rFonts w:ascii="Segoe UI Emoji" w:hAnsi="Segoe UI Emoji" w:cs="Segoe UI Emoji"/>
+                <w:sz w:val="19"/>
+              </w:rPr>
+              <w:t>✅</w:t>
+            </w:r>
+            <w:r>
+              <w:rPr>
+                <w:sz w:val="19"/>
+              </w:rPr>
+              <w:t xml:space="preserve"> </w:t>
+            </w:r>
+            <w:r>
+              <w:rPr>
+                <w:b/>
+                <w:bCs/>
+                <w:sz w:val="19"/>
+              </w:rPr>
+              <w:t>DONE</w:t>
+            </w:r>
+          </w:p>
+        </w:tc>
+        <w:tc>
+          <w:tcPr>
+            <w:tcW w:w="1250" w:type="pct"/>
+          </w:tcPr>
+          <w:p>
+            <w:pPr>
+              <w:pStyle w:val="Compact"/>
+              <w:rPr>
+                <w:sz w:val="19"/>
+              </w:rPr>
+            </w:pPr>
+            <w:r>
+              <w:rPr>
+                <w:sz w:val="19"/>
+              </w:rPr>
+              <w:t xml:space="preserve">Prime-Consultant channel mapped: KOR wins public/design-build work as the </w:t>
+            </w:r>
+            <w:r>
+              <w:rPr>
+                <w:b/>
+                <w:bCs/>
+                <w:sz w:val="19"/>
+              </w:rPr>
+              <w:t>architect’s structural sub</w:t>
+            </w:r>
+            <w:r>
+              <w:rPr>
+                <w:sz w:val="19"/>
+              </w:rPr>
+              <w:t xml:space="preserve"> on the prime team — target architects </w:t>
+            </w:r>
+            <w:r>
+              <w:rPr>
+                <w:i/>
+                <w:iCs/>
+                <w:sz w:val="19"/>
+              </w:rPr>
+              <w:t>before</w:t>
+            </w:r>
+            <w:r>
+              <w:rPr>
+                <w:sz w:val="19"/>
+              </w:rPr>
+              <w:t xml:space="preserve"> the RFP. + CA field guide.</w:t>
+            </w:r>
+          </w:p>
+        </w:tc>
+      </w:tr>
+      <w:tr>
+        <w:trPr>
+          <w:cantSplit/>
+        </w:trPr>
+        <w:tc>
+          <w:tcPr>
+            <w:tcW w:w="1250" w:type="pct"/>
+          </w:tcPr>
+          <w:p>
+            <w:pPr>
+              <w:pStyle w:val="Compact"/>
+              <w:rPr>
+                <w:sz w:val="19"/>
+              </w:rPr>
+            </w:pPr>
+            <w:r>
+              <w:rPr>
+                <w:sz w:val="19"/>
+              </w:rPr>
+              <w:t>D</w:t>
+            </w:r>
+          </w:p>
+        </w:tc>
+        <w:tc>
+          <w:tcPr>
+            <w:tcW w:w="1250" w:type="pct"/>
+          </w:tcPr>
+          <w:p>
+            <w:pPr>
+              <w:pStyle w:val="Compact"/>
+              <w:rPr>
+                <w:sz w:val="19"/>
+              </w:rPr>
+            </w:pPr>
+            <w:r>
+              <w:rPr>
+                <w:b/>
+                <w:bCs/>
+                <w:sz w:val="19"/>
+              </w:rPr>
+              <w:t>Biz Brain build-out</w:t>
+            </w:r>
+            <w:r>
+              <w:rPr>
+                <w:sz w:val="19"/>
+              </w:rPr>
+              <w:t xml:space="preserve"> — clean data, dedup, CRM (§2)</w:t>
+            </w:r>
+          </w:p>
+        </w:tc>
+        <w:tc>
+          <w:tcPr>
+            <w:tcW w:w="1250" w:type="pct"/>
+          </w:tcPr>
+          <w:p>
+            <w:pPr>
+              <w:pStyle w:val="Compact"/>
+              <w:rPr>
+                <w:sz w:val="19"/>
+              </w:rPr>
+            </w:pPr>
+            <w:r>
+              <w:rPr>
+                <w:rFonts w:ascii="Segoe UI Emoji" w:hAnsi="Segoe UI Emoji" w:cs="Segoe UI Emoji"/>
+                <w:sz w:val="19"/>
+              </w:rPr>
+              <w:t>✅</w:t>
+            </w:r>
+            <w:r>
+              <w:rPr>
+                <w:sz w:val="19"/>
+              </w:rPr>
+              <w:t xml:space="preserve"> </w:t>
+            </w:r>
+            <w:r>
+              <w:rPr>
+                <w:b/>
+                <w:bCs/>
+                <w:sz w:val="19"/>
+              </w:rPr>
+              <w:t>DONE + ongoing</w:t>
+            </w:r>
+          </w:p>
+        </w:tc>
+        <w:tc>
+          <w:tcPr>
+            <w:tcW w:w="1250" w:type="pct"/>
+          </w:tcPr>
+          <w:p>
+            <w:pPr>
+              <w:pStyle w:val="Compact"/>
+              <w:rPr>
+                <w:sz w:val="19"/>
+              </w:rPr>
+            </w:pPr>
+            <w:r>
+              <w:rPr>
+                <w:sz w:val="19"/>
+              </w:rPr>
+              <w:t xml:space="preserve">50k→17.8k cull, 100+ dup merges (incl. HA cluster), 81 Kind fixes, MPI FKs, dup-creation cycle closed; CRM pursuits loaded (§11). </w:t>
+            </w:r>
+            <w:r>
+              <w:rPr>
+                <w:b/>
+                <w:bCs/>
+                <w:sz w:val="19"/>
+              </w:rPr>
+              <w:t>Full deep re-enrichment now running.</w:t>
+            </w:r>
+          </w:p>
+        </w:tc>
+      </w:tr>
+      <w:tr>
+        <w:trPr>
+          <w:cnfStyle w:val="000000100000" w:firstRow="0" w:lastRow="0" w:firstColumn="0" w:lastColumn="0" w:oddVBand="0" w:evenVBand="0" w:oddHBand="1" w:evenHBand="0" w:firstRowFirstColumn="0" w:firstRowLastColumn="0" w:lastRowFirstColumn="0" w:lastRowLastColumn="0"/>
+          <w:cantSplit/>
+        </w:trPr>
+        <w:tc>
+          <w:tcPr>
+            <w:tcW w:w="1250" w:type="pct"/>
+          </w:tcPr>
+          <w:p>
+            <w:pPr>
+              <w:pStyle w:val="Compact"/>
+              <w:rPr>
+                <w:sz w:val="19"/>
+              </w:rPr>
+            </w:pPr>
+            <w:r>
+              <w:rPr>
+                <w:sz w:val="19"/>
+              </w:rPr>
+              <w:t>E</w:t>
+            </w:r>
+          </w:p>
+        </w:tc>
+        <w:tc>
+          <w:tcPr>
+            <w:tcW w:w="1250" w:type="pct"/>
+          </w:tcPr>
+          <w:p>
+            <w:pPr>
+              <w:pStyle w:val="Compact"/>
+              <w:rPr>
+                <w:sz w:val="19"/>
+              </w:rPr>
+            </w:pPr>
+            <w:r>
+              <w:rPr>
+                <w:b/>
+                <w:bCs/>
+                <w:sz w:val="19"/>
+              </w:rPr>
+              <w:t>Social-media automation</w:t>
+            </w:r>
+            <w:r>
+              <w:rPr>
+                <w:sz w:val="19"/>
+              </w:rPr>
+              <w:t xml:space="preserve"> — LinkedIn auto-post + Instagram (§4)</w:t>
+            </w:r>
+          </w:p>
+        </w:tc>
+        <w:tc>
+          <w:tcPr>
+            <w:tcW w:w="1250" w:type="pct"/>
+          </w:tcPr>
+          <w:p>
+            <w:pPr>
+              <w:pStyle w:val="Compact"/>
+              <w:rPr>
+                <w:sz w:val="19"/>
+              </w:rPr>
+            </w:pPr>
+            <w:r>
+              <w:rPr>
+                <w:rFonts w:ascii="Segoe UI Emoji" w:hAnsi="Segoe UI Emoji" w:cs="Segoe UI Emoji"/>
+                <w:sz w:val="19"/>
+              </w:rPr>
+              <w:t>🔄</w:t>
+            </w:r>
+            <w:r>
+              <w:rPr>
+                <w:sz w:val="19"/>
+              </w:rPr>
+              <w:t xml:space="preserve"> </w:t>
+            </w:r>
+            <w:r>
+              <w:rPr>
+                <w:b/>
+                <w:bCs/>
+                <w:sz w:val="19"/>
+              </w:rPr>
+              <w:t>In progress</w:t>
+            </w:r>
+          </w:p>
+        </w:tc>
+        <w:tc>
+          <w:tcPr>
+            <w:tcW w:w="1250" w:type="pct"/>
+          </w:tcPr>
+          <w:p>
+            <w:pPr>
+              <w:pStyle w:val="Compact"/>
+              <w:rPr>
+                <w:sz w:val="19"/>
+              </w:rPr>
+            </w:pPr>
+            <w:r>
+              <w:rPr>
+                <w:sz w:val="19"/>
+              </w:rPr>
+              <w:t>LinkedIn app-setup checklist done 2026-06-20; Instagram + the every-2-days auto-post still to wire.</w:t>
+            </w:r>
+          </w:p>
+        </w:tc>
+      </w:tr>
+      <w:tr>
+        <w:trPr>
+          <w:cantSplit/>
+        </w:trPr>
+        <w:tc>
+          <w:tcPr>
+            <w:tcW w:w="1250" w:type="pct"/>
+          </w:tcPr>
+          <w:p>
+            <w:pPr>
+              <w:pStyle w:val="Compact"/>
+              <w:rPr>
+                <w:sz w:val="19"/>
+              </w:rPr>
+            </w:pPr>
+            <w:r>
+              <w:rPr>
+                <w:sz w:val="19"/>
+              </w:rPr>
+              <w:t>F</w:t>
+            </w:r>
+          </w:p>
+        </w:tc>
+        <w:tc>
+          <w:tcPr>
+            <w:tcW w:w="1250" w:type="pct"/>
+          </w:tcPr>
+          <w:p>
+            <w:pPr>
+              <w:pStyle w:val="Compact"/>
+              <w:rPr>
+                <w:sz w:val="19"/>
+              </w:rPr>
+            </w:pPr>
+            <w:r>
+              <w:rPr>
+                <w:b/>
+                <w:bCs/>
+                <w:sz w:val="19"/>
+              </w:rPr>
+              <w:t>Meeting synopsis + action sheet</w:t>
+            </w:r>
+            <w:r>
+              <w:rPr>
+                <w:sz w:val="19"/>
+              </w:rPr>
+              <w:t xml:space="preserve"> (3–4 packages, 2–3 people each) (§2)</w:t>
+            </w:r>
+          </w:p>
+        </w:tc>
+        <w:tc>
+          <w:tcPr>
+            <w:tcW w:w="1250" w:type="pct"/>
+          </w:tcPr>
+          <w:p>
+            <w:pPr>
+              <w:pStyle w:val="Compact"/>
+              <w:rPr>
+                <w:sz w:val="19"/>
+              </w:rPr>
+            </w:pPr>
+            <w:r>
+              <w:rPr>
+                <w:rFonts w:ascii="Segoe UI Emoji" w:hAnsi="Segoe UI Emoji" w:cs="Segoe UI Emoji"/>
+                <w:sz w:val="19"/>
+              </w:rPr>
+              <w:t>🔄</w:t>
+            </w:r>
+            <w:r>
+              <w:rPr>
+                <w:sz w:val="19"/>
+              </w:rPr>
+              <w:t xml:space="preserve"> </w:t>
+            </w:r>
+            <w:r>
+              <w:rPr>
+                <w:b/>
+                <w:bCs/>
+                <w:sz w:val="19"/>
+              </w:rPr>
+              <w:t>Pending</w:t>
+            </w:r>
+          </w:p>
+        </w:tc>
+        <w:tc>
+          <w:tcPr>
+            <w:tcW w:w="1250" w:type="pct"/>
+          </w:tcPr>
+          <w:p>
+            <w:pPr>
+              <w:pStyle w:val="Compact"/>
+              <w:rPr>
+                <w:sz w:val="19"/>
+              </w:rPr>
+            </w:pPr>
+            <w:r>
+              <w:rPr>
+                <w:sz w:val="19"/>
+              </w:rPr>
+              <w:t>The “intel by Tuesday” deliverable.</w:t>
+            </w:r>
+          </w:p>
+        </w:tc>
+      </w:tr>
+      <w:tr>
+        <w:trPr>
+          <w:cnfStyle w:val="000000100000" w:firstRow="0" w:lastRow="0" w:firstColumn="0" w:lastColumn="0" w:oddVBand="0" w:evenVBand="0" w:oddHBand="1" w:evenHBand="0" w:firstRowFirstColumn="0" w:firstRowLastColumn="0" w:lastRowFirstColumn="0" w:lastRowLastColumn="0"/>
+          <w:cantSplit/>
+        </w:trPr>
+        <w:tc>
+          <w:tcPr>
+            <w:tcW w:w="1250" w:type="pct"/>
+          </w:tcPr>
+          <w:p>
+            <w:pPr>
+              <w:pStyle w:val="Compact"/>
+              <w:rPr>
+                <w:sz w:val="19"/>
+              </w:rPr>
+            </w:pPr>
+            <w:r>
+              <w:rPr>
+                <w:sz w:val="19"/>
+              </w:rPr>
+              <w:t>G</w:t>
+            </w:r>
+          </w:p>
+        </w:tc>
+        <w:tc>
+          <w:tcPr>
+            <w:tcW w:w="1250" w:type="pct"/>
+          </w:tcPr>
+          <w:p>
+            <w:pPr>
+              <w:pStyle w:val="Compact"/>
+              <w:rPr>
+                <w:sz w:val="19"/>
+              </w:rPr>
+            </w:pPr>
+            <w:r>
+              <w:rPr>
+                <w:b/>
+                <w:bCs/>
+                <w:sz w:val="19"/>
+              </w:rPr>
+              <w:t>Ad-hoc enrichment in the app</w:t>
+            </w:r>
+          </w:p>
+        </w:tc>
+        <w:tc>
+          <w:tcPr>
+            <w:tcW w:w="1250" w:type="pct"/>
+          </w:tcPr>
+          <w:p>
+            <w:pPr>
+              <w:pStyle w:val="Compact"/>
+              <w:rPr>
+                <w:sz w:val="19"/>
+              </w:rPr>
+            </w:pPr>
+            <w:r>
+              <w:rPr>
+                <w:rFonts w:ascii="Segoe UI Emoji" w:hAnsi="Segoe UI Emoji" w:cs="Segoe UI Emoji"/>
+                <w:sz w:val="19"/>
+              </w:rPr>
+              <w:t>✅</w:t>
+            </w:r>
+            <w:r>
+              <w:rPr>
+                <w:sz w:val="19"/>
+              </w:rPr>
+              <w:t xml:space="preserve"> </w:t>
+            </w:r>
+            <w:r>
+              <w:rPr>
+                <w:b/>
+                <w:bCs/>
+                <w:sz w:val="19"/>
+              </w:rPr>
+              <w:t>EXISTS (orgs)</w:t>
+            </w:r>
+          </w:p>
+        </w:tc>
+        <w:tc>
+          <w:tcPr>
+            <w:tcW w:w="1250" w:type="pct"/>
+          </w:tcPr>
+          <w:p>
+            <w:pPr>
+              <w:pStyle w:val="Compact"/>
+              <w:rPr>
+                <w:sz w:val="19"/>
+              </w:rPr>
+            </w:pPr>
+            <w:r>
+              <w:rPr>
+                <w:sz w:val="19"/>
+              </w:rPr>
+              <w:t xml:space="preserve">Org Dossier has a “Refresh Intel” button (→ queues a FirmNarrative research trigger the Worker drains). </w:t>
+            </w:r>
+            <w:r>
+              <w:rPr>
+                <w:b/>
+                <w:bCs/>
+                <w:sz w:val="19"/>
+              </w:rPr>
+              <w:t>People don’t have it yet</w:t>
+            </w:r>
+            <w:r>
+              <w:rPr>
+                <w:sz w:val="19"/>
+              </w:rPr>
+              <w:t xml:space="preserve"> — gap to close.</w:t>
+            </w:r>
+          </w:p>
+        </w:tc>
+      </w:tr>
+      <w:tr>
+        <w:trPr>
+          <w:cantSplit/>
+        </w:trPr>
+        <w:tc>
+          <w:tcPr>
+            <w:tcW w:w="1250" w:type="pct"/>
+          </w:tcPr>
+          <w:p>
+            <w:pPr>
+              <w:pStyle w:val="Compact"/>
+              <w:rPr>
+                <w:sz w:val="19"/>
+              </w:rPr>
+            </w:pPr>
+            <w:r>
+              <w:rPr>
+                <w:sz w:val="19"/>
+              </w:rPr>
+              <w:t>H</w:t>
+            </w:r>
+          </w:p>
+        </w:tc>
+        <w:tc>
+          <w:tcPr>
+            <w:tcW w:w="1250" w:type="pct"/>
+          </w:tcPr>
+          <w:p>
+            <w:pPr>
+              <w:pStyle w:val="Compact"/>
+              <w:rPr>
+                <w:sz w:val="19"/>
+              </w:rPr>
+            </w:pPr>
+            <w:r>
+              <w:rPr>
+                <w:b/>
+                <w:bCs/>
+                <w:sz w:val="19"/>
+              </w:rPr>
+              <w:t>Name the tool</w:t>
+            </w:r>
+            <w:r>
+              <w:rPr>
+                <w:sz w:val="19"/>
+              </w:rPr>
+              <w:t xml:space="preserve"> (§2)</w:t>
+            </w:r>
+          </w:p>
+        </w:tc>
+        <w:tc>
+          <w:tcPr>
+            <w:tcW w:w="1250" w:type="pct"/>
+          </w:tcPr>
+          <w:p>
+            <w:pPr>
+              <w:pStyle w:val="Compact"/>
+              <w:rPr>
+                <w:sz w:val="19"/>
+              </w:rPr>
+            </w:pPr>
+            <w:r>
+              <w:rPr>
+                <w:rFonts w:ascii="Segoe UI Emoji" w:hAnsi="Segoe UI Emoji" w:cs="Segoe UI Emoji"/>
+                <w:sz w:val="19"/>
+              </w:rPr>
+              <w:t>⬜</w:t>
+            </w:r>
+            <w:r>
+              <w:rPr>
+                <w:sz w:val="19"/>
+              </w:rPr>
+              <w:t xml:space="preserve"> Open</w:t>
+            </w:r>
+          </w:p>
+        </w:tc>
+        <w:tc>
+          <w:tcPr>
+            <w:tcW w:w="1250" w:type="pct"/>
+          </w:tcPr>
+          <w:p>
+            <w:pPr>
+              <w:pStyle w:val="Compact"/>
+              <w:rPr>
+                <w:sz w:val="19"/>
+              </w:rPr>
+            </w:pPr>
+            <w:r>
+              <w:rPr>
+                <w:sz w:val="19"/>
+              </w:rPr>
+              <w:t>Biz Brain / KIA / KSA / ICE / Frank.</w:t>
+            </w:r>
+          </w:p>
+        </w:tc>
+      </w:tr>
+      <w:tr>
+        <w:trPr>
+          <w:cnfStyle w:val="000000100000" w:firstRow="0" w:lastRow="0" w:firstColumn="0" w:lastColumn="0" w:oddVBand="0" w:evenVBand="0" w:oddHBand="1" w:evenHBand="0" w:firstRowFirstColumn="0" w:firstRowLastColumn="0" w:lastRowFirstColumn="0" w:lastRowLastColumn="0"/>
+          <w:cantSplit/>
+        </w:trPr>
+        <w:tc>
+          <w:tcPr>
+            <w:tcW w:w="1250" w:type="pct"/>
+          </w:tcPr>
+          <w:p>
+            <w:pPr>
+              <w:pStyle w:val="Compact"/>
+              <w:rPr>
+                <w:sz w:val="19"/>
+              </w:rPr>
+            </w:pPr>
+            <w:r>
+              <w:rPr>
+                <w:sz w:val="19"/>
+              </w:rPr>
+              <w:t>I</w:t>
+            </w:r>
+          </w:p>
+        </w:tc>
+        <w:tc>
+          <w:tcPr>
+            <w:tcW w:w="1250" w:type="pct"/>
+          </w:tcPr>
+          <w:p>
+            <w:pPr>
+              <w:pStyle w:val="Compact"/>
+              <w:rPr>
+                <w:sz w:val="19"/>
+              </w:rPr>
+            </w:pPr>
+            <w:r>
+              <w:rPr>
+                <w:b/>
+                <w:bCs/>
+                <w:sz w:val="19"/>
+              </w:rPr>
+              <w:t>Plug GIS contact + Broadway/SkyTrain rezoning list into brain</w:t>
+            </w:r>
+            <w:r>
+              <w:rPr>
+                <w:sz w:val="19"/>
+              </w:rPr>
+              <w:t xml:space="preserve"> (§2)</w:t>
+            </w:r>
+          </w:p>
+        </w:tc>
+        <w:tc>
+          <w:tcPr>
+            <w:tcW w:w="1250" w:type="pct"/>
+          </w:tcPr>
+          <w:p>
+            <w:pPr>
+              <w:pStyle w:val="Compact"/>
+              <w:rPr>
+                <w:sz w:val="19"/>
+              </w:rPr>
+            </w:pPr>
+            <w:r>
+              <w:rPr>
+                <w:rFonts w:ascii="Segoe UI Emoji" w:hAnsi="Segoe UI Emoji" w:cs="Segoe UI Emoji"/>
+                <w:sz w:val="19"/>
+              </w:rPr>
+              <w:t>⬜</w:t>
+            </w:r>
+            <w:r>
+              <w:rPr>
+                <w:sz w:val="19"/>
+              </w:rPr>
+              <w:t xml:space="preserve"> Blocked</w:t>
+            </w:r>
+          </w:p>
+        </w:tc>
+        <w:tc>
+          <w:tcPr>
+            <w:tcW w:w="1250" w:type="pct"/>
+          </w:tcPr>
+          <w:p>
+            <w:pPr>
+              <w:pStyle w:val="Compact"/>
+              <w:rPr>
+                <w:sz w:val="19"/>
+              </w:rPr>
+            </w:pPr>
+            <w:r>
+              <w:rPr>
+                <w:sz w:val="19"/>
+              </w:rPr>
+              <w:t>Awaiting Omar’s contact + list.</w:t>
+            </w:r>
+          </w:p>
+        </w:tc>
+      </w:tr>
+      <w:tr>
+        <w:trPr>
+          <w:cantSplit/>
+        </w:trPr>
+        <w:tc>
+          <w:tcPr>
+            <w:tcW w:w="1250" w:type="pct"/>
+          </w:tcPr>
+          <w:p>
+            <w:pPr>
+              <w:pStyle w:val="Compact"/>
+              <w:rPr>
+                <w:sz w:val="19"/>
+              </w:rPr>
+            </w:pPr>
+            <w:r>
+              <w:rPr>
+                <w:sz w:val="19"/>
+              </w:rPr>
+              <w:t>J</w:t>
+            </w:r>
+          </w:p>
+        </w:tc>
+        <w:tc>
+          <w:tcPr>
+            <w:tcW w:w="1250" w:type="pct"/>
+          </w:tcPr>
+          <w:p>
+            <w:pPr>
+              <w:pStyle w:val="Compact"/>
+              <w:rPr>
+                <w:sz w:val="19"/>
+              </w:rPr>
+            </w:pPr>
+            <w:r>
+              <w:rPr>
+                <w:b/>
+                <w:bCs/>
+                <w:sz w:val="19"/>
+              </w:rPr>
+              <w:t>Confirm EGBC SRG course details</w:t>
+            </w:r>
+            <w:r>
+              <w:rPr>
+                <w:sz w:val="19"/>
+              </w:rPr>
+              <w:t xml:space="preserve"> (JM takes the course) (§1#1)</w:t>
+            </w:r>
+          </w:p>
+        </w:tc>
+        <w:tc>
+          <w:tcPr>
+            <w:tcW w:w="1250" w:type="pct"/>
+          </w:tcPr>
+          <w:p>
+            <w:pPr>
+              <w:pStyle w:val="Compact"/>
+              <w:rPr>
+                <w:sz w:val="19"/>
+              </w:rPr>
+            </w:pPr>
+            <w:r>
+              <w:rPr>
+                <w:rFonts w:ascii="Segoe UI Emoji" w:hAnsi="Segoe UI Emoji" w:cs="Segoe UI Emoji"/>
+                <w:sz w:val="19"/>
+              </w:rPr>
+              <w:t>⬜</w:t>
+            </w:r>
+            <w:r>
+              <w:rPr>
+                <w:sz w:val="19"/>
+              </w:rPr>
+              <w:t xml:space="preserve"> Open</w:t>
+            </w:r>
+          </w:p>
+        </w:tc>
+        <w:tc>
+          <w:tcPr>
+            <w:tcW w:w="1250" w:type="pct"/>
+          </w:tcPr>
+          <w:p>
+            <w:pPr>
+              <w:pStyle w:val="Compact"/>
+              <w:rPr>
+                <w:sz w:val="19"/>
+              </w:rPr>
+            </w:pPr>
+          </w:p>
+        </w:tc>
+      </w:tr>
+      <w:tr>
+        <w:trPr>
+          <w:cnfStyle w:val="000000100000" w:firstRow="0" w:lastRow="0" w:firstColumn="0" w:lastColumn="0" w:oddVBand="0" w:evenVBand="0" w:oddHBand="1" w:evenHBand="0" w:firstRowFirstColumn="0" w:firstRowLastColumn="0" w:lastRowFirstColumn="0" w:lastRowLastColumn="0"/>
+          <w:cantSplit/>
+        </w:trPr>
+        <w:tc>
+          <w:tcPr>
+            <w:tcW w:w="1250" w:type="pct"/>
+          </w:tcPr>
+          <w:p>
+            <w:pPr>
+              <w:pStyle w:val="Compact"/>
+              <w:rPr>
+                <w:sz w:val="19"/>
+              </w:rPr>
+            </w:pPr>
+            <w:r>
+              <w:rPr>
+                <w:sz w:val="19"/>
+              </w:rPr>
+              <w:t>K</w:t>
+            </w:r>
+          </w:p>
+        </w:tc>
+        <w:tc>
+          <w:tcPr>
+            <w:tcW w:w="1250" w:type="pct"/>
+          </w:tcPr>
+          <w:p>
+            <w:pPr>
+              <w:pStyle w:val="Compact"/>
+              <w:rPr>
+                <w:sz w:val="19"/>
+              </w:rPr>
+            </w:pPr>
+            <w:r>
+              <w:rPr>
+                <w:b/>
+                <w:bCs/>
+                <w:sz w:val="19"/>
+              </w:rPr>
+              <w:t>Stage the broader §5 reach-out list as CRM engagements</w:t>
+            </w:r>
+            <w:r>
+              <w:rPr>
+                <w:sz w:val="19"/>
+              </w:rPr>
+              <w:t xml:space="preserve"> (§11)</w:t>
+            </w:r>
+          </w:p>
+        </w:tc>
+        <w:tc>
+          <w:tcPr>
+            <w:tcW w:w="1250" w:type="pct"/>
+          </w:tcPr>
+          <w:p>
+            <w:pPr>
+              <w:pStyle w:val="Compact"/>
+              <w:rPr>
+                <w:sz w:val="19"/>
+              </w:rPr>
+            </w:pPr>
+            <w:r>
+              <w:rPr>
+                <w:rFonts w:ascii="Segoe UI Emoji" w:hAnsi="Segoe UI Emoji" w:cs="Segoe UI Emoji"/>
+                <w:sz w:val="19"/>
+              </w:rPr>
+              <w:t>⬜</w:t>
+            </w:r>
+            <w:r>
+              <w:rPr>
+                <w:sz w:val="19"/>
+              </w:rPr>
+              <w:t xml:space="preserve"> Your call</w:t>
+            </w:r>
+          </w:p>
+        </w:tc>
+        <w:tc>
+          <w:tcPr>
+            <w:tcW w:w="1250" w:type="pct"/>
+          </w:tcPr>
+          <w:p>
+            <w:pPr>
+              <w:pStyle w:val="Compact"/>
+              <w:rPr>
+                <w:sz w:val="19"/>
+              </w:rPr>
+            </w:pPr>
+            <w:r>
+              <w:rPr>
+                <w:sz w:val="19"/>
+              </w:rPr>
+              <w:t>Say the word.</w:t>
+            </w:r>
+          </w:p>
+        </w:tc>
+      </w:tr>
+    </w:tbl>
+    <w:p>
+      <w:r>
+        <w:pict w14:anchorId="14C36144">
+          <v:rect id="_x0000_i1026" style="width:0;height:1.5pt" o:hralign="center" o:hrstd="t" o:hr="t"/>
+        </w:pict>
+      </w:r>
+    </w:p>
+    <w:p>
+      <w:pPr>
+        <w:pStyle w:val="Heading2"/>
+        <w:pageBreakBefore/>
+      </w:pPr>
+      <w:bookmarkStart w:id="4" w:name="Xdfed9eb99d51080e80e136cd86e447e240bf84f"/>
+      <w:bookmarkStart w:id="5" w:name="_Toc232957772"/>
+      <w:bookmarkEnd w:id="2"/>
       <w:r>
         <w:t>1. Firm-level actionables (lists, qualifications, proposals)</w:t>
       </w:r>
-      <w:bookmarkEnd w:id="3"/>
+      <w:bookmarkEnd w:id="5"/>
     </w:p>
     <w:tbl>
       <w:tblPr>
@@ -2033,13 +3413,13 @@
         <w:pStyle w:val="Heading2"/>
         <w:pageBreakBefore/>
       </w:pPr>
-      <w:bookmarkStart w:id="4" w:name="the-biz-brain-crm-process"/>
-      <w:bookmarkStart w:id="5" w:name="_Toc232957126"/>
-      <w:bookmarkEnd w:id="2"/>
+      <w:bookmarkStart w:id="6" w:name="the-biz-brain-crm-process"/>
+      <w:bookmarkStart w:id="7" w:name="_Toc232957773"/>
+      <w:bookmarkEnd w:id="4"/>
       <w:r>
         <w:t>2. The “Biz Brain” + CRM + process</w:t>
       </w:r>
-      <w:bookmarkEnd w:id="5"/>
+      <w:bookmarkEnd w:id="7"/>
     </w:p>
     <w:p>
       <w:pPr>
@@ -2172,13 +3552,13 @@
         <w:pStyle w:val="Heading2"/>
         <w:pageBreakBefore/>
       </w:pPr>
-      <w:bookmarkStart w:id="6" w:name="X52b6e6d8cdd72e96d6a0e8c581c9930cbc3f0f7"/>
-      <w:bookmarkStart w:id="7" w:name="_Toc232957127"/>
-      <w:bookmarkEnd w:id="4"/>
+      <w:bookmarkStart w:id="8" w:name="X52b6e6d8cdd72e96d6a0e8c581c9930cbc3f0f7"/>
+      <w:bookmarkStart w:id="9" w:name="_Toc232957774"/>
+      <w:bookmarkEnd w:id="6"/>
       <w:r>
         <w:t>3. Website overhaul — decision at Monday partnership meeting</w:t>
       </w:r>
-      <w:bookmarkEnd w:id="7"/>
+      <w:bookmarkEnd w:id="9"/>
     </w:p>
     <w:p>
       <w:pPr>
@@ -2296,13 +3676,13 @@
         <w:pStyle w:val="Heading2"/>
         <w:pageBreakBefore/>
       </w:pPr>
-      <w:bookmarkStart w:id="8" w:name="marketing-promotion"/>
-      <w:bookmarkStart w:id="9" w:name="_Toc232957128"/>
-      <w:bookmarkEnd w:id="6"/>
+      <w:bookmarkStart w:id="10" w:name="marketing-promotion"/>
+      <w:bookmarkStart w:id="11" w:name="_Toc232957775"/>
+      <w:bookmarkEnd w:id="8"/>
       <w:r>
         <w:t>4. Marketing / promotion</w:t>
       </w:r>
-      <w:bookmarkEnd w:id="9"/>
+      <w:bookmarkEnd w:id="11"/>
     </w:p>
     <w:p>
       <w:pPr>
@@ -2470,8 +3850,8 @@
     </w:p>
     <w:p>
       <w:r>
-        <w:pict w14:anchorId="4ACCD72D">
-          <v:rect id="_x0000_i1026" style="width:0;height:1.5pt" o:hralign="center" o:hrstd="t" o:hr="t"/>
+        <w:pict w14:anchorId="2677381C">
+          <v:rect id="_x0000_i1027" style="width:0;height:1.5pt" o:hralign="center" o:hrstd="t" o:hr="t"/>
         </w:pict>
       </w:r>
     </w:p>
@@ -2480,19 +3860,19 @@
         <w:pStyle w:val="Heading2"/>
         <w:pageBreakBefore/>
       </w:pPr>
-      <w:bookmarkStart w:id="10" w:name="Xdcf932e8b8a22fec95416f7e96ea13fd4d70a8b"/>
-      <w:bookmarkStart w:id="11" w:name="_Toc232957129"/>
-      <w:bookmarkEnd w:id="8"/>
+      <w:bookmarkStart w:id="12" w:name="Xdcf932e8b8a22fec95416f7e96ea13fd4d70a8b"/>
+      <w:bookmarkStart w:id="13" w:name="_Toc232957776"/>
+      <w:bookmarkEnd w:id="10"/>
       <w:r>
         <w:t>5. Target lists by region (corrected names → owner → action)</w:t>
       </w:r>
-      <w:bookmarkEnd w:id="11"/>
+      <w:bookmarkEnd w:id="13"/>
     </w:p>
     <w:p>
       <w:pPr>
         <w:pStyle w:val="Heading3"/>
       </w:pPr>
-      <w:bookmarkStart w:id="12" w:name="X713c3d34fc0a884761379e6e95a2ab0278eec25"/>
+      <w:bookmarkStart w:id="14" w:name="X713c3d34fc0a884761379e6e95a2ab0278eec25"/>
       <w:r>
         <w:t>Vancouver Lower Mainland — Omar (lead), John, Jim</w:t>
       </w:r>
@@ -2675,10 +4055,7 @@
         <w:t>Ledcor</w:t>
       </w:r>
       <w:r>
-        <w:t xml:space="preserve"> </w:t>
-      </w:r>
-      <w:r>
-        <w:t xml:space="preserve">[High] — kp=10. Soft intro via existing </w:t>
+        <w:t xml:space="preserve"> [High] — kp=10. Soft intro via existing </w:t>
       </w:r>
       <w:r>
         <w:rPr>
@@ -2999,7 +4376,10 @@
         <w:t>Rory Allen</w:t>
       </w:r>
       <w:r>
-        <w:t xml:space="preserve"> there (ex-“CDA” → Tim Properties [folded] → Mundi). KOR did a hotel for them; hotels across the interior, expanding to Vancouver/Burnaby, lots in Alberta; </w:t>
+        <w:t xml:space="preserve"> there (ex-“CDA” </w:t>
+      </w:r>
+      <w:r>
+        <w:t xml:space="preserve">→ Tim Properties [folded] → Mundi). KOR did a hotel for them; hotels across the interior, expanding to Vancouver/Burnaby, lots in Alberta; </w:t>
       </w:r>
       <w:r>
         <w:rPr>
@@ -3238,10 +4618,7 @@
         <w:t>Jason</w:t>
       </w:r>
       <w:r>
-        <w:t xml:space="preserve"> </w:t>
-      </w:r>
-      <w:r>
-        <w:t xml:space="preserve">setting up a meeting; reconnect with </w:t>
+        <w:t xml:space="preserve"> setting up a meeting; reconnect with </w:t>
       </w:r>
       <w:r>
         <w:rPr>
@@ -3473,10 +4850,7 @@
         <w:t>Beto</w:t>
       </w:r>
       <w:r>
-        <w:t xml:space="preserve"> </w:t>
-      </w:r>
-      <w:r>
-        <w:t xml:space="preserve">— go meet (Resident is their biggest tower). </w:t>
+        <w:t xml:space="preserve"> — go meet (Resident is their biggest tower). </w:t>
       </w:r>
       <w:r>
         <w:rPr>
@@ -3541,8 +4915,8 @@
       <w:pPr>
         <w:pStyle w:val="Heading3"/>
       </w:pPr>
-      <w:bookmarkStart w:id="13" w:name="vancouver-island-rory-lead"/>
-      <w:bookmarkEnd w:id="12"/>
+      <w:bookmarkStart w:id="15" w:name="vancouver-island-rory-lead"/>
+      <w:bookmarkEnd w:id="14"/>
       <w:r>
         <w:t>Vancouver Island — Rory (lead)</w:t>
       </w:r>
@@ -3563,7 +4937,10 @@
         <w:t>Merrick Architecture</w:t>
       </w:r>
       <w:r>
-        <w:t xml:space="preserve"> [High] — ✅Deltek; has an Island office. John knows someone; get warm intro to Victoria; Rory + John go.</w:t>
+        <w:t xml:space="preserve"> </w:t>
+      </w:r>
+      <w:r>
+        <w:t>[High] — ✅Deltek; has an Island office. John knows someone; get warm intro to Victoria; Rory + John go.</w:t>
       </w:r>
     </w:p>
     <w:p>
@@ -3696,7 +5073,10 @@
         <w:t>In the brain but duplicated</w:t>
       </w:r>
       <w:r>
-        <w:t xml:space="preserve"> — #53694 “The Lark Group” (Developer), #72260 “Lark Projects Ltd.” (GC, BC Housing-confirmed), plus #55097/#27243 (“Unknown”). Needs </w:t>
+        <w:t xml:space="preserve"> — #53694 “The Lark Group” </w:t>
+      </w:r>
+      <w:r>
+        <w:t xml:space="preserve">(Developer), #72260 “Lark Projects Ltd.” (GC, BC Housing-confirmed), plus #55097/#27243 (“Unknown”). Needs </w:t>
       </w:r>
       <w:r>
         <w:rPr>
@@ -4110,7 +5490,10 @@
         <w:t>(vs. “Wilson Shen”)</w:t>
       </w:r>
       <w:r>
-        <w:t xml:space="preserve"> [Low] — Island modular operator. ⚠</w:t>
+        <w:t xml:space="preserve"> </w:t>
+      </w:r>
+      <w:r>
+        <w:t>[Low] — Island modular operator. ⚠</w:t>
       </w:r>
       <w:r>
         <w:t>️</w:t>
@@ -4207,8 +5590,8 @@
       <w:pPr>
         <w:pStyle w:val="Heading3"/>
       </w:pPr>
-      <w:bookmarkStart w:id="14" w:name="okanagan-interior-conor-lead"/>
-      <w:bookmarkEnd w:id="13"/>
+      <w:bookmarkStart w:id="16" w:name="okanagan-interior-conor-lead"/>
+      <w:bookmarkEnd w:id="15"/>
       <w:r>
         <w:t>Okanagan &amp; Interior — Conor (lead)</w:t>
       </w:r>
@@ -4309,8 +5692,8 @@
       <w:pPr>
         <w:pStyle w:val="Heading3"/>
       </w:pPr>
-      <w:bookmarkStart w:id="15" w:name="X16998a4ad53ccd011fa9b1229f129f22170b18b"/>
-      <w:bookmarkEnd w:id="14"/>
+      <w:bookmarkStart w:id="17" w:name="X16998a4ad53ccd011fa9b1229f129f22170b18b"/>
+      <w:bookmarkEnd w:id="16"/>
       <w:r>
         <w:t>Andrea — get more front-facing (explicit ask)</w:t>
       </w:r>
@@ -4488,8 +5871,8 @@
       <w:pPr>
         <w:pStyle w:val="Heading3"/>
       </w:pPr>
-      <w:bookmarkStart w:id="16" w:name="usa-california-john-lead-jim"/>
-      <w:bookmarkEnd w:id="15"/>
+      <w:bookmarkStart w:id="18" w:name="usa-california-john-lead-jim"/>
+      <w:bookmarkEnd w:id="17"/>
       <w:r>
         <w:t>USA / California — John (lead), Jim</w:t>
       </w:r>
@@ -4570,8 +5953,8 @@
     </w:p>
     <w:p>
       <w:r>
-        <w:pict w14:anchorId="2F67BE6D">
-          <v:rect id="_x0000_i1027" style="width:0;height:1.5pt" o:hralign="center" o:hrstd="t" o:hr="t"/>
+        <w:pict w14:anchorId="46B04BCF">
+          <v:rect id="_x0000_i1028" style="width:0;height:1.5pt" o:hralign="center" o:hrstd="t" o:hr="t"/>
         </w:pict>
       </w:r>
     </w:p>
@@ -4580,14 +5963,17 @@
         <w:pStyle w:val="Heading2"/>
         <w:pageBreakBefore/>
       </w:pPr>
-      <w:bookmarkStart w:id="17" w:name="Xfa51d67e5cdb29dc08ec51ef38a1ba2bcac1254"/>
-      <w:bookmarkStart w:id="18" w:name="_Toc232957130"/>
-      <w:bookmarkEnd w:id="10"/>
-      <w:bookmarkEnd w:id="16"/>
-      <w:r>
-        <w:t>6. New-sector / “outside the box” ideas to chase</w:t>
-      </w:r>
+      <w:bookmarkStart w:id="19" w:name="Xfa51d67e5cdb29dc08ec51ef38a1ba2bcac1254"/>
+      <w:bookmarkStart w:id="20" w:name="_Toc232957777"/>
+      <w:bookmarkEnd w:id="12"/>
       <w:bookmarkEnd w:id="18"/>
+      <w:r>
+        <w:t xml:space="preserve">6. New-sector / “outside the box” </w:t>
+      </w:r>
+      <w:r>
+        <w:t>ideas to chase</w:t>
+      </w:r>
+      <w:bookmarkEnd w:id="20"/>
     </w:p>
     <w:p>
       <w:pPr>
@@ -4624,7 +6010,10 @@
         <w:t>Steel-stud / suspended-ceiling / TI add-on engineering</w:t>
       </w:r>
       <w:r>
-        <w:t xml:space="preserve"> — high margin, “rinse &amp; repeat”; offer as a proposal tick-box. JB, Kevin, Rory already do some. Garth at </w:t>
+        <w:t xml:space="preserve"> — high margin, “rinse &amp; repeat”</w:t>
+      </w:r>
+      <w:r>
+        <w:t xml:space="preserve">; offer as a proposal tick-box. JB, Kevin, Rory already do some. Garth at </w:t>
       </w:r>
       <w:r>
         <w:rPr>
@@ -4752,8 +6141,8 @@
     </w:p>
     <w:p>
       <w:r>
-        <w:pict w14:anchorId="3A0136B6">
-          <v:rect id="_x0000_i1028" style="width:0;height:1.5pt" o:hralign="center" o:hrstd="t" o:hr="t"/>
+        <w:pict w14:anchorId="74592288">
+          <v:rect id="_x0000_i1029" style="width:0;height:1.5pt" o:hralign="center" o:hrstd="t" o:hr="t"/>
         </w:pict>
       </w:r>
     </w:p>
@@ -4762,13 +6151,13 @@
         <w:pStyle w:val="Heading2"/>
         <w:pageBreakBefore/>
       </w:pPr>
-      <w:bookmarkStart w:id="19" w:name="intel-flags-read-before-acting"/>
-      <w:bookmarkStart w:id="20" w:name="_Toc232957131"/>
-      <w:bookmarkEnd w:id="17"/>
+      <w:bookmarkStart w:id="21" w:name="intel-flags-read-before-acting"/>
+      <w:bookmarkStart w:id="22" w:name="_Toc232957778"/>
+      <w:bookmarkEnd w:id="19"/>
       <w:r>
         <w:t>7. Intel flags (read before acting)</w:t>
       </w:r>
-      <w:bookmarkEnd w:id="20"/>
+      <w:bookmarkEnd w:id="22"/>
     </w:p>
     <w:p>
       <w:pPr>
@@ -4852,14 +6241,7 @@
           <w:i/>
           <w:iCs/>
         </w:rPr>
-        <w:t xml:space="preserve">(Also the BC-licence “Person Responsible” </w:t>
-      </w:r>
-      <w:r>
-        <w:rPr>
-          <w:i/>
-          <w:iCs/>
-        </w:rPr>
-        <w:t>at Mondiale Development #20962.)</w:t>
+        <w:t>(Also the BC-licence “Person Responsible” at Mondiale Development #20962.)</w:t>
       </w:r>
     </w:p>
     <w:p>
@@ -5167,7 +6549,10 @@
         <w:t>merge/reclassify</w:t>
       </w:r>
       <w:r>
-        <w:t xml:space="preserve"> job, not an add. (Earlier draft wrongly called it net-new.)</w:t>
+        <w:t xml:space="preserve"> </w:t>
+      </w:r>
+      <w:r>
+        <w:t>job, not an add. (Earlier draft wrongly called it net-new.)</w:t>
       </w:r>
     </w:p>
     <w:p>
@@ -5210,8 +6595,8 @@
     </w:p>
     <w:p>
       <w:r>
-        <w:pict w14:anchorId="5B9CB929">
-          <v:rect id="_x0000_i1029" style="width:0;height:1.5pt" o:hralign="center" o:hrstd="t" o:hr="t"/>
+        <w:pict w14:anchorId="1A8EAF8C">
+          <v:rect id="_x0000_i1030" style="width:0;height:1.5pt" o:hralign="center" o:hrstd="t" o:hr="t"/>
         </w:pict>
       </w:r>
     </w:p>
@@ -5220,13 +6605,13 @@
         <w:pStyle w:val="Heading2"/>
         <w:pageBreakBefore/>
       </w:pPr>
-      <w:bookmarkStart w:id="21" w:name="confirmed-people-directory"/>
-      <w:bookmarkStart w:id="22" w:name="_Toc232957132"/>
-      <w:bookmarkEnd w:id="19"/>
+      <w:bookmarkStart w:id="23" w:name="confirmed-people-directory"/>
+      <w:bookmarkStart w:id="24" w:name="_Toc232957779"/>
+      <w:bookmarkEnd w:id="21"/>
       <w:r>
         <w:t>8. Confirmed people directory</w:t>
       </w:r>
-      <w:bookmarkEnd w:id="22"/>
+      <w:bookmarkEnd w:id="24"/>
     </w:p>
     <w:tbl>
       <w:tblPr>
@@ -5895,7 +7280,13 @@
               <w:rPr>
                 <w:sz w:val="19"/>
               </w:rPr>
-              <w:t xml:space="preserve"> (founder Carla Guerrera)</w:t>
+              <w:t xml:space="preserve"> </w:t>
+            </w:r>
+            <w:r>
+              <w:rPr>
+                <w:sz w:val="19"/>
+              </w:rPr>
+              <w:t>(founder Carla Guerrera)</w:t>
             </w:r>
           </w:p>
         </w:tc>
@@ -6135,7 +7526,13 @@
               <w:rPr>
                 <w:sz w:val="19"/>
               </w:rPr>
-              <w:t xml:space="preserve"> / Lower Mainland Forming (formwork/rebar)</w:t>
+              <w:t xml:space="preserve"> </w:t>
+            </w:r>
+            <w:r>
+              <w:rPr>
+                <w:sz w:val="19"/>
+              </w:rPr>
+              <w:t>/ Lower Mainland Forming (formwork/rebar)</w:t>
             </w:r>
           </w:p>
         </w:tc>
@@ -6561,13 +7958,13 @@
         <w:pStyle w:val="Heading2"/>
         <w:pageBreakBefore/>
       </w:pPr>
-      <w:bookmarkStart w:id="23" w:name="verify-directly-dont-guess-further"/>
-      <w:bookmarkStart w:id="24" w:name="_Toc232957133"/>
-      <w:bookmarkEnd w:id="21"/>
+      <w:bookmarkStart w:id="25" w:name="verify-directly-dont-guess-further"/>
+      <w:bookmarkStart w:id="26" w:name="_Toc232957780"/>
+      <w:bookmarkEnd w:id="23"/>
       <w:r>
         <w:t>9. Verify directly (don’t guess further)</w:t>
       </w:r>
-      <w:bookmarkEnd w:id="24"/>
+      <w:bookmarkEnd w:id="26"/>
     </w:p>
     <w:p>
       <w:pPr>
@@ -6585,10 +7982,7 @@
         <w:t>Chris Hall</w:t>
       </w:r>
       <w:r>
-        <w:t xml:space="preserve"> </w:t>
-      </w:r>
-      <w:r>
-        <w:t>(Polygon) — Rory’s real retiring contact, but no public footprint (Polygon CEO is Neil Chrystal). Confirm with Rory.</w:t>
+        <w:t xml:space="preserve"> (Polygon) — Rory’s real retiring contact, but no public footprint (Polygon CEO is Neil Chrystal). Confirm with Rory.</w:t>
       </w:r>
     </w:p>
     <w:p>
@@ -6755,8 +8149,8 @@
     </w:p>
     <w:p>
       <w:r>
-        <w:pict w14:anchorId="267839F4">
-          <v:rect id="_x0000_i1030" style="width:0;height:1.5pt" o:hralign="center" o:hrstd="t" o:hr="t"/>
+        <w:pict w14:anchorId="6EF15650">
+          <v:rect id="_x0000_i1031" style="width:0;height:1.5pt" o:hralign="center" o:hrstd="t" o:hr="t"/>
         </w:pict>
       </w:r>
     </w:p>
@@ -6765,13 +8159,13 @@
         <w:pStyle w:val="Heading2"/>
         <w:pageBreakBefore/>
       </w:pPr>
-      <w:bookmarkStart w:id="25" w:name="Xcfdcc19d29137ee3732eb0fbcf1d1a3e7bba30e"/>
-      <w:bookmarkStart w:id="26" w:name="_Toc232957134"/>
-      <w:bookmarkEnd w:id="23"/>
+      <w:bookmarkStart w:id="27" w:name="Xcfdcc19d29137ee3732eb0fbcf1d1a3e7bba30e"/>
+      <w:bookmarkStart w:id="28" w:name="_Toc232957781"/>
+      <w:bookmarkEnd w:id="25"/>
       <w:r>
         <w:t>10. Biz Brain ingest (applied &amp; verified 2026-06-19)</w:t>
       </w:r>
-      <w:bookmarkEnd w:id="26"/>
+      <w:bookmarkEnd w:id="28"/>
     </w:p>
     <w:p>
       <w:pPr>
@@ -6822,7 +8216,10 @@
         <w:t>3 dedup merges</w:t>
       </w:r>
       <w:r>
-        <w:t xml:space="preserve"> — Lark ×2 (stray “Unknown” rows folded into Developer #53694 / GC #72260, arms kept separate), Nch’</w:t>
+        <w:t xml:space="preserve"> </w:t>
+      </w:r>
+      <w:r>
+        <w:t>— Lark ×2 (stray “Unknown” rows folded into Developer #53694 / GC #72260, arms kept separate), Nch’</w:t>
       </w:r>
       <w:r>
         <w:t>ḵ</w:t>
@@ -7001,8 +8398,8 @@
     </w:p>
     <w:p>
       <w:r>
-        <w:pict w14:anchorId="6D541A3B">
-          <v:rect id="_x0000_i1031" style="width:0;height:1.5pt" o:hralign="center" o:hrstd="t" o:hr="t"/>
+        <w:pict w14:anchorId="3B892DB4">
+          <v:rect id="_x0000_i1032" style="width:0;height:1.5pt" o:hralign="center" o:hrstd="t" o:hr="t"/>
         </w:pict>
       </w:r>
     </w:p>
@@ -7011,13 +8408,13 @@
         <w:pStyle w:val="Heading2"/>
         <w:pageBreakBefore/>
       </w:pPr>
-      <w:bookmarkStart w:id="27" w:name="Xcf0a1025e0a49976d280ecbba304c8d5df50af6"/>
-      <w:bookmarkStart w:id="28" w:name="_Toc232957135"/>
-      <w:bookmarkEnd w:id="25"/>
+      <w:bookmarkStart w:id="29" w:name="Xcf0a1025e0a49976d280ecbba304c8d5df50af6"/>
+      <w:bookmarkStart w:id="30" w:name="_Toc232957782"/>
+      <w:bookmarkEnd w:id="27"/>
       <w:r>
         <w:t>11. CRM — pursuits loaded this session (applied &amp; verified 2026-06-19)</w:t>
       </w:r>
-      <w:bookmarkEnd w:id="28"/>
+      <w:bookmarkEnd w:id="30"/>
     </w:p>
     <w:p>
       <w:pPr>
@@ -7920,13 +9317,7 @@
               <w:rPr>
                 <w:sz w:val="19"/>
               </w:rPr>
-              <w:t xml:space="preserve"> </w:t>
-            </w:r>
-            <w:r>
-              <w:rPr>
-                <w:sz w:val="19"/>
-              </w:rPr>
-              <w:t>(KOR client). Modular pipeline: White Rock, Vancouver fourplex, Duncan 4-storey (proposal owed), warehouse retrofit, plant upgrades. Simon on Advanced Steel shop drawings.</w:t>
+              <w:t xml:space="preserve"> (KOR client). Modular pipeline: White Rock, Vancouver fourplex, Duncan 4-storey (proposal owed), warehouse retrofit, plant upgrades. Simon on Advanced Steel shop drawings.</w:t>
             </w:r>
           </w:p>
         </w:tc>
@@ -8433,8 +9824,8 @@
     </w:p>
     <w:p>
       <w:r>
-        <w:pict w14:anchorId="4E7F4C68">
-          <v:rect id="_x0000_i1032" style="width:0;height:1.5pt" o:hralign="center" o:hrstd="t" o:hr="t"/>
+        <w:pict w14:anchorId="18AB28EF">
+          <v:rect id="_x0000_i1033" style="width:0;height:1.5pt" o:hralign="center" o:hrstd="t" o:hr="t"/>
         </w:pict>
       </w:r>
     </w:p>
@@ -8450,7 +9841,7 @@
         <w:t>Generated from the meeting recording; corrected names sourced from the BD brain (canonical orgs / Deltek) and web verification. Brain + CRM writes applied 2026-06-19 with post-audit; low-confidence names flagged for human confirmation rather than auto-ingested.</w:t>
       </w:r>
       <w:bookmarkEnd w:id="0"/>
-      <w:bookmarkEnd w:id="27"/>
+      <w:bookmarkEnd w:id="29"/>
     </w:p>
     <w:sectPr>
       <w:footnotePr>
@@ -8469,7 +9860,7 @@
   <w:abstractNum w:abstractNumId="0" w15:restartNumberingAfterBreak="0">
     <w:nsid w:val="0000A990"/>
     <w:multiLevelType w:val="multilevel"/>
-    <w:tmpl w:val="2B1E7BB8"/>
+    <w:tmpl w:val="A8ECF690"/>
     <w:lvl w:ilvl="0">
       <w:numFmt w:val="bullet"/>
       <w:lvlText w:val=" "/>
@@ -8546,7 +9937,7 @@
   <w:abstractNum w:abstractNumId="1" w15:restartNumberingAfterBreak="0">
     <w:nsid w:val="0000A991"/>
     <w:multiLevelType w:val="multilevel"/>
-    <w:tmpl w:val="9BA69CD8"/>
+    <w:tmpl w:val="6318E8FA"/>
     <w:lvl w:ilvl="0">
       <w:numFmt w:val="bullet"/>
       <w:lvlText w:val=""/>
@@ -8650,7 +10041,7 @@
   <w:abstractNum w:abstractNumId="2" w15:restartNumberingAfterBreak="0">
     <w:nsid w:val="00A99411"/>
     <w:multiLevelType w:val="multilevel"/>
-    <w:tmpl w:val="46CEDEFE"/>
+    <w:tmpl w:val="39F28922"/>
     <w:lvl w:ilvl="0">
       <w:start w:val="1"/>
       <w:numFmt w:val="decimal"/>
@@ -8733,49 +10124,49 @@
       </w:pPr>
     </w:lvl>
   </w:abstractNum>
-  <w:num w:numId="1" w16cid:durableId="1685278183">
+  <w:num w:numId="1" w16cid:durableId="417017368">
     <w:abstractNumId w:val="0"/>
   </w:num>
-  <w:num w:numId="2" w16cid:durableId="707996801">
+  <w:num w:numId="2" w16cid:durableId="529337099">
     <w:abstractNumId w:val="1"/>
   </w:num>
-  <w:num w:numId="3" w16cid:durableId="1460805868">
+  <w:num w:numId="3" w16cid:durableId="554317659">
     <w:abstractNumId w:val="1"/>
   </w:num>
-  <w:num w:numId="4" w16cid:durableId="1416393460">
+  <w:num w:numId="4" w16cid:durableId="108278819">
     <w:abstractNumId w:val="1"/>
   </w:num>
-  <w:num w:numId="5" w16cid:durableId="1528172907">
+  <w:num w:numId="5" w16cid:durableId="2045905175">
     <w:abstractNumId w:val="1"/>
   </w:num>
-  <w:num w:numId="6" w16cid:durableId="1455637771">
+  <w:num w:numId="6" w16cid:durableId="1569994597">
     <w:abstractNumId w:val="1"/>
   </w:num>
-  <w:num w:numId="7" w16cid:durableId="1481188024">
+  <w:num w:numId="7" w16cid:durableId="602957977">
     <w:abstractNumId w:val="1"/>
   </w:num>
-  <w:num w:numId="8" w16cid:durableId="228686125">
+  <w:num w:numId="8" w16cid:durableId="1345328718">
     <w:abstractNumId w:val="1"/>
   </w:num>
-  <w:num w:numId="9" w16cid:durableId="1009992034">
+  <w:num w:numId="9" w16cid:durableId="1626892110">
     <w:abstractNumId w:val="1"/>
   </w:num>
-  <w:num w:numId="10" w16cid:durableId="831409645">
+  <w:num w:numId="10" w16cid:durableId="2078895578">
     <w:abstractNumId w:val="1"/>
   </w:num>
-  <w:num w:numId="11" w16cid:durableId="674575602">
+  <w:num w:numId="11" w16cid:durableId="1141264508">
     <w:abstractNumId w:val="1"/>
   </w:num>
-  <w:num w:numId="12" w16cid:durableId="1510758699">
+  <w:num w:numId="12" w16cid:durableId="1560167589">
     <w:abstractNumId w:val="1"/>
   </w:num>
-  <w:num w:numId="13" w16cid:durableId="233468444">
+  <w:num w:numId="13" w16cid:durableId="601957166">
     <w:abstractNumId w:val="1"/>
   </w:num>
-  <w:num w:numId="14" w16cid:durableId="1357537250">
+  <w:num w:numId="14" w16cid:durableId="114061962">
     <w:abstractNumId w:val="1"/>
   </w:num>
-  <w:num w:numId="15" w16cid:durableId="59333379">
+  <w:num w:numId="15" w16cid:durableId="487209351">
     <w:abstractNumId w:val="2"/>
     <w:lvlOverride w:ilvl="0">
       <w:startOverride w:val="1"/>
@@ -8805,13 +10196,13 @@
       <w:startOverride w:val="1"/>
     </w:lvlOverride>
   </w:num>
-  <w:num w:numId="16" w16cid:durableId="384456285">
+  <w:num w:numId="16" w16cid:durableId="935478211">
     <w:abstractNumId w:val="1"/>
   </w:num>
-  <w:num w:numId="17" w16cid:durableId="1368987359">
+  <w:num w:numId="17" w16cid:durableId="1687562736">
     <w:abstractNumId w:val="1"/>
   </w:num>
-  <w:num w:numId="18" w16cid:durableId="1030447021">
+  <w:num w:numId="18" w16cid:durableId="1155949800">
     <w:abstractNumId w:val="1"/>
   </w:num>
 </w:numbering>
@@ -10052,7 +11443,7 @@
     <w:next w:val="Normal"/>
     <w:autoRedefine/>
     <w:uiPriority w:val="39"/>
-    <w:rsid w:val="00042316"/>
+    <w:rsid w:val="004E3789"/>
     <w:pPr>
       <w:spacing w:after="100"/>
     </w:pPr>
@@ -10063,7 +11454,7 @@
     <w:next w:val="Normal"/>
     <w:autoRedefine/>
     <w:uiPriority w:val="39"/>
-    <w:rsid w:val="00042316"/>
+    <w:rsid w:val="004E3789"/>
     <w:pPr>
       <w:spacing w:after="100"/>
       <w:ind w:left="240"/>
@@ -10073,7 +11464,7 @@
     <w:name w:val="Grid Table 5 Dark Accent 1"/>
     <w:basedOn w:val="TableNormal"/>
     <w:uiPriority w:val="50"/>
-    <w:rsid w:val="00042316"/>
+    <w:rsid w:val="004E3789"/>
     <w:pPr>
       <w:spacing w:after="0"/>
     </w:pPr>

</xml_diff>

<commit_message>
docs(bd): BD reports, dossiers, briefs, codex prompts + seismic/meeting docs
Archive the BD work-product accumulated over the June sessions: West Coast +
sector dossiers (md/docx/pdf), meeting actionables + exec summaries, spend/ROI
and Canada-vs-US analyses, seismic program docs, teaming briefs, and the
codex-prompt records. Consistent with the repo's tracked-dossier convention.

Co-Authored-By: Claude Opus 4.8 <noreply@anthropic.com>
</commit_message>
<xml_diff>
--- a/docs/BD-Meeting-Actionables-2026-06-19.docx
+++ b/docs/BD-Meeting-Actionables-2026-06-19.docx
@@ -2,947 +2,14 @@
 <file path=word/document.xml><?xml version="1.0" encoding="utf-8"?>
 <w:document xmlns:wpc="http://schemas.microsoft.com/office/word/2010/wordprocessingCanvas" xmlns:cx="http://schemas.microsoft.com/office/drawing/2014/chartex" xmlns:cx1="http://schemas.microsoft.com/office/drawing/2015/9/8/chartex" xmlns:cx2="http://schemas.microsoft.com/office/drawing/2015/10/21/chartex" xmlns:cx3="http://schemas.microsoft.com/office/drawing/2016/5/9/chartex" xmlns:cx4="http://schemas.microsoft.com/office/drawing/2016/5/10/chartex" xmlns:cx5="http://schemas.microsoft.com/office/drawing/2016/5/11/chartex" xmlns:cx6="http://schemas.microsoft.com/office/drawing/2016/5/12/chartex" xmlns:cx7="http://schemas.microsoft.com/office/drawing/2016/5/13/chartex" xmlns:cx8="http://schemas.microsoft.com/office/drawing/2016/5/14/chartex" xmlns:mc="http://schemas.openxmlformats.org/markup-compatibility/2006" xmlns:aink="http://schemas.microsoft.com/office/drawing/2016/ink" xmlns:am3d="http://schemas.microsoft.com/office/drawing/2017/model3d" xmlns:o="urn:schemas-microsoft-com:office:office" xmlns:oel="http://schemas.microsoft.com/office/2019/extlst" xmlns:r="http://schemas.openxmlformats.org/officeDocument/2006/relationships" xmlns:m="http://schemas.openxmlformats.org/officeDocument/2006/math" xmlns:v="urn:schemas-microsoft-com:vml" xmlns:wp14="http://schemas.microsoft.com/office/word/2010/wordprocessingDrawing" xmlns:wp="http://schemas.openxmlformats.org/drawingml/2006/wordprocessingDrawing" xmlns:w10="urn:schemas-microsoft-com:office:word" xmlns:w="http://schemas.openxmlformats.org/wordprocessingml/2006/main" xmlns:w14="http://schemas.microsoft.com/office/word/2010/wordml" xmlns:w15="http://schemas.microsoft.com/office/word/2012/wordml" xmlns:w16cex="http://schemas.microsoft.com/office/word/2018/wordml/cex" xmlns:w16cid="http://schemas.microsoft.com/office/word/2016/wordml/cid" xmlns:w16="http://schemas.microsoft.com/office/word/2018/wordml" xmlns:w16du="http://schemas.microsoft.com/office/word/2023/wordml/word16du" xmlns:w16sdtdh="http://schemas.microsoft.com/office/word/2020/wordml/sdtdatahash" xmlns:w16sdtfl="http://schemas.microsoft.com/office/word/2024/wordml/sdtformatlock" xmlns:w16se="http://schemas.microsoft.com/office/word/2015/wordml/symex" xmlns:wpg="http://schemas.microsoft.com/office/word/2010/wordprocessingGroup" xmlns:wpi="http://schemas.microsoft.com/office/word/2010/wordprocessingInk" xmlns:wne="http://schemas.microsoft.com/office/word/2006/wordml" xmlns:wps="http://schemas.microsoft.com/office/word/2010/wordprocessingShape" mc:Ignorable="w14 w15 w16se w16cid w16 w16cex w16sdtdh w16sdtfl w16du wp14">
   <w:body>
-    <w:sdt>
-      <w:sdtPr>
-        <w:rPr>
-          <w:rFonts w:asciiTheme="minorHAnsi" w:eastAsiaTheme="minorEastAsia" w:hAnsiTheme="minorHAnsi" w:cstheme="minorBidi"/>
-          <w:color w:val="auto"/>
-          <w:sz w:val="24"/>
-          <w:szCs w:val="24"/>
-        </w:rPr>
-        <w:id w:val="-63876104"/>
-        <w:docPartObj>
-          <w:docPartGallery w:val="Table of Contents"/>
-          <w:docPartUnique/>
-        </w:docPartObj>
-      </w:sdtPr>
-      <w:sdtEndPr>
-        <w:rPr>
-          <w:rFonts w:ascii="Calibri" w:hAnsi="Calibri" w:cs="Calibri"/>
-          <w:b w:val="0"/>
-          <w:sz w:val="21"/>
-        </w:rPr>
-      </w:sdtEndPr>
-      <w:sdtContent>
-        <w:p>
-          <w:pPr>
-            <w:pStyle w:val="TOCHeading"/>
-            <w:pageBreakBefore/>
-          </w:pPr>
-          <w:r>
-            <w:t>Table of Contents</w:t>
-          </w:r>
-        </w:p>
-        <w:p>
-          <w:pPr>
-            <w:pStyle w:val="TOC1"/>
-            <w:tabs>
-              <w:tab w:val="right" w:leader="dot" w:pos="9350"/>
-            </w:tabs>
-            <w:rPr>
-              <w:noProof/>
-            </w:rPr>
-          </w:pPr>
-          <w:r>
-            <w:fldChar w:fldCharType="begin"/>
-          </w:r>
-          <w:r>
-            <w:instrText>TOC \o "1-2" \h \z \u</w:instrText>
-          </w:r>
-          <w:r>
-            <w:fldChar w:fldCharType="separate"/>
-          </w:r>
-          <w:hyperlink w:anchor="_Toc232957770" w:history="1">
-            <w:r>
-              <w:rPr>
-                <w:rStyle w:val="Hyperlink"/>
-                <w:noProof/>
-              </w:rPr>
-              <w:t>BD Meeting — Vancouver Lower Mainland — Actionables &amp; Verified Targets</w:t>
-            </w:r>
-            <w:r>
-              <w:rPr>
-                <w:noProof/>
-                <w:webHidden/>
-              </w:rPr>
-              <w:tab/>
-            </w:r>
-            <w:r>
-              <w:rPr>
-                <w:noProof/>
-                <w:webHidden/>
-              </w:rPr>
-              <w:fldChar w:fldCharType="begin"/>
-            </w:r>
-            <w:r>
-              <w:rPr>
-                <w:noProof/>
-                <w:webHidden/>
-              </w:rPr>
-              <w:instrText xml:space="preserve"> PAGEREF _Toc232957770 \h </w:instrText>
-            </w:r>
-            <w:r>
-              <w:rPr>
-                <w:noProof/>
-                <w:webHidden/>
-              </w:rPr>
-            </w:r>
-            <w:r>
-              <w:rPr>
-                <w:noProof/>
-                <w:webHidden/>
-              </w:rPr>
-              <w:fldChar w:fldCharType="separate"/>
-            </w:r>
-            <w:r>
-              <w:rPr>
-                <w:noProof/>
-                <w:webHidden/>
-              </w:rPr>
-              <w:t>1</w:t>
-            </w:r>
-            <w:r>
-              <w:rPr>
-                <w:noProof/>
-                <w:webHidden/>
-              </w:rPr>
-              <w:fldChar w:fldCharType="end"/>
-            </w:r>
-          </w:hyperlink>
-        </w:p>
-        <w:p>
-          <w:pPr>
-            <w:pStyle w:val="TOC2"/>
-            <w:tabs>
-              <w:tab w:val="right" w:leader="dot" w:pos="9350"/>
-            </w:tabs>
-            <w:rPr>
-              <w:noProof/>
-            </w:rPr>
-          </w:pPr>
-          <w:hyperlink w:anchor="_Toc232957771" w:history="1">
-            <w:r>
-              <w:rPr>
-                <w:rStyle w:val="Hyperlink"/>
-                <w:noProof/>
-              </w:rPr>
-              <w:t>0. Ian’s tasks — status tracker (added 2026-06-21)</w:t>
-            </w:r>
-            <w:r>
-              <w:rPr>
-                <w:noProof/>
-                <w:webHidden/>
-              </w:rPr>
-              <w:tab/>
-            </w:r>
-            <w:r>
-              <w:rPr>
-                <w:noProof/>
-                <w:webHidden/>
-              </w:rPr>
-              <w:fldChar w:fldCharType="begin"/>
-            </w:r>
-            <w:r>
-              <w:rPr>
-                <w:noProof/>
-                <w:webHidden/>
-              </w:rPr>
-              <w:instrText xml:space="preserve"> PAGEREF _Toc232957771 \h </w:instrText>
-            </w:r>
-            <w:r>
-              <w:rPr>
-                <w:noProof/>
-                <w:webHidden/>
-              </w:rPr>
-            </w:r>
-            <w:r>
-              <w:rPr>
-                <w:noProof/>
-                <w:webHidden/>
-              </w:rPr>
-              <w:fldChar w:fldCharType="separate"/>
-            </w:r>
-            <w:r>
-              <w:rPr>
-                <w:noProof/>
-                <w:webHidden/>
-              </w:rPr>
-              <w:t>2</w:t>
-            </w:r>
-            <w:r>
-              <w:rPr>
-                <w:noProof/>
-                <w:webHidden/>
-              </w:rPr>
-              <w:fldChar w:fldCharType="end"/>
-            </w:r>
-          </w:hyperlink>
-        </w:p>
-        <w:p>
-          <w:pPr>
-            <w:pStyle w:val="TOC2"/>
-            <w:tabs>
-              <w:tab w:val="right" w:leader="dot" w:pos="9350"/>
-            </w:tabs>
-            <w:rPr>
-              <w:noProof/>
-            </w:rPr>
-          </w:pPr>
-          <w:hyperlink w:anchor="_Toc232957772" w:history="1">
-            <w:r>
-              <w:rPr>
-                <w:rStyle w:val="Hyperlink"/>
-                <w:noProof/>
-              </w:rPr>
-              <w:t>1. Firm-level actionables (lists, qualifications, proposals)</w:t>
-            </w:r>
-            <w:r>
-              <w:rPr>
-                <w:noProof/>
-                <w:webHidden/>
-              </w:rPr>
-              <w:tab/>
-            </w:r>
-            <w:r>
-              <w:rPr>
-                <w:noProof/>
-                <w:webHidden/>
-              </w:rPr>
-              <w:fldChar w:fldCharType="begin"/>
-            </w:r>
-            <w:r>
-              <w:rPr>
-                <w:noProof/>
-                <w:webHidden/>
-              </w:rPr>
-              <w:instrText xml:space="preserve"> PAGEREF _Toc232957772 \h </w:instrText>
-            </w:r>
-            <w:r>
-              <w:rPr>
-                <w:noProof/>
-                <w:webHidden/>
-              </w:rPr>
-            </w:r>
-            <w:r>
-              <w:rPr>
-                <w:noProof/>
-                <w:webHidden/>
-              </w:rPr>
-              <w:fldChar w:fldCharType="separate"/>
-            </w:r>
-            <w:r>
-              <w:rPr>
-                <w:noProof/>
-                <w:webHidden/>
-              </w:rPr>
-              <w:t>4</w:t>
-            </w:r>
-            <w:r>
-              <w:rPr>
-                <w:noProof/>
-                <w:webHidden/>
-              </w:rPr>
-              <w:fldChar w:fldCharType="end"/>
-            </w:r>
-          </w:hyperlink>
-        </w:p>
-        <w:p>
-          <w:pPr>
-            <w:pStyle w:val="TOC2"/>
-            <w:tabs>
-              <w:tab w:val="right" w:leader="dot" w:pos="9350"/>
-            </w:tabs>
-            <w:rPr>
-              <w:noProof/>
-            </w:rPr>
-          </w:pPr>
-          <w:hyperlink w:anchor="_Toc232957773" w:history="1">
-            <w:r>
-              <w:rPr>
-                <w:rStyle w:val="Hyperlink"/>
-                <w:noProof/>
-              </w:rPr>
-              <w:t>2. The “Biz Brain” + CRM + process</w:t>
-            </w:r>
-            <w:r>
-              <w:rPr>
-                <w:noProof/>
-                <w:webHidden/>
-              </w:rPr>
-              <w:tab/>
-            </w:r>
-            <w:r>
-              <w:rPr>
-                <w:noProof/>
-                <w:webHidden/>
-              </w:rPr>
-              <w:fldChar w:fldCharType="begin"/>
-            </w:r>
-            <w:r>
-              <w:rPr>
-                <w:noProof/>
-                <w:webHidden/>
-              </w:rPr>
-              <w:instrText xml:space="preserve"> PAGEREF _Toc232957773 \h </w:instrText>
-            </w:r>
-            <w:r>
-              <w:rPr>
-                <w:noProof/>
-                <w:webHidden/>
-              </w:rPr>
-            </w:r>
-            <w:r>
-              <w:rPr>
-                <w:noProof/>
-                <w:webHidden/>
-              </w:rPr>
-              <w:fldChar w:fldCharType="separate"/>
-            </w:r>
-            <w:r>
-              <w:rPr>
-                <w:noProof/>
-                <w:webHidden/>
-              </w:rPr>
-              <w:t>5</w:t>
-            </w:r>
-            <w:r>
-              <w:rPr>
-                <w:noProof/>
-                <w:webHidden/>
-              </w:rPr>
-              <w:fldChar w:fldCharType="end"/>
-            </w:r>
-          </w:hyperlink>
-        </w:p>
-        <w:p>
-          <w:pPr>
-            <w:pStyle w:val="TOC2"/>
-            <w:tabs>
-              <w:tab w:val="right" w:leader="dot" w:pos="9350"/>
-            </w:tabs>
-            <w:rPr>
-              <w:noProof/>
-            </w:rPr>
-          </w:pPr>
-          <w:hyperlink w:anchor="_Toc232957774" w:history="1">
-            <w:r>
-              <w:rPr>
-                <w:rStyle w:val="Hyperlink"/>
-                <w:noProof/>
-              </w:rPr>
-              <w:t>3. Website overhaul — decision at Monday partnership meeting</w:t>
-            </w:r>
-            <w:r>
-              <w:rPr>
-                <w:noProof/>
-                <w:webHidden/>
-              </w:rPr>
-              <w:tab/>
-            </w:r>
-            <w:r>
-              <w:rPr>
-                <w:noProof/>
-                <w:webHidden/>
-              </w:rPr>
-              <w:fldChar w:fldCharType="begin"/>
-            </w:r>
-            <w:r>
-              <w:rPr>
-                <w:noProof/>
-                <w:webHidden/>
-              </w:rPr>
-              <w:instrText xml:space="preserve"> PAGEREF _Toc232957774 \h </w:instrText>
-            </w:r>
-            <w:r>
-              <w:rPr>
-                <w:noProof/>
-                <w:webHidden/>
-              </w:rPr>
-            </w:r>
-            <w:r>
-              <w:rPr>
-                <w:noProof/>
-                <w:webHidden/>
-              </w:rPr>
-              <w:fldChar w:fldCharType="separate"/>
-            </w:r>
-            <w:r>
-              <w:rPr>
-                <w:noProof/>
-                <w:webHidden/>
-              </w:rPr>
-              <w:t>6</w:t>
-            </w:r>
-            <w:r>
-              <w:rPr>
-                <w:noProof/>
-                <w:webHidden/>
-              </w:rPr>
-              <w:fldChar w:fldCharType="end"/>
-            </w:r>
-          </w:hyperlink>
-        </w:p>
-        <w:p>
-          <w:pPr>
-            <w:pStyle w:val="TOC2"/>
-            <w:tabs>
-              <w:tab w:val="right" w:leader="dot" w:pos="9350"/>
-            </w:tabs>
-            <w:rPr>
-              <w:noProof/>
-            </w:rPr>
-          </w:pPr>
-          <w:hyperlink w:anchor="_Toc232957775" w:history="1">
-            <w:r>
-              <w:rPr>
-                <w:rStyle w:val="Hyperlink"/>
-                <w:noProof/>
-              </w:rPr>
-              <w:t>4. Marketing / promotion</w:t>
-            </w:r>
-            <w:r>
-              <w:rPr>
-                <w:noProof/>
-                <w:webHidden/>
-              </w:rPr>
-              <w:tab/>
-            </w:r>
-            <w:r>
-              <w:rPr>
-                <w:noProof/>
-                <w:webHidden/>
-              </w:rPr>
-              <w:fldChar w:fldCharType="begin"/>
-            </w:r>
-            <w:r>
-              <w:rPr>
-                <w:noProof/>
-                <w:webHidden/>
-              </w:rPr>
-              <w:instrText xml:space="preserve"> PAGEREF _Toc232957775 \h </w:instrText>
-            </w:r>
-            <w:r>
-              <w:rPr>
-                <w:noProof/>
-                <w:webHidden/>
-              </w:rPr>
-            </w:r>
-            <w:r>
-              <w:rPr>
-                <w:noProof/>
-                <w:webHidden/>
-              </w:rPr>
-              <w:fldChar w:fldCharType="separate"/>
-            </w:r>
-            <w:r>
-              <w:rPr>
-                <w:noProof/>
-                <w:webHidden/>
-              </w:rPr>
-              <w:t>6</w:t>
-            </w:r>
-            <w:r>
-              <w:rPr>
-                <w:noProof/>
-                <w:webHidden/>
-              </w:rPr>
-              <w:fldChar w:fldCharType="end"/>
-            </w:r>
-          </w:hyperlink>
-        </w:p>
-        <w:p>
-          <w:pPr>
-            <w:pStyle w:val="TOC2"/>
-            <w:tabs>
-              <w:tab w:val="right" w:leader="dot" w:pos="9350"/>
-            </w:tabs>
-            <w:rPr>
-              <w:noProof/>
-            </w:rPr>
-          </w:pPr>
-          <w:hyperlink w:anchor="_Toc232957776" w:history="1">
-            <w:r>
-              <w:rPr>
-                <w:rStyle w:val="Hyperlink"/>
-                <w:noProof/>
-              </w:rPr>
-              <w:t>5. Target lists by region (corrected names → owner → action)</w:t>
-            </w:r>
-            <w:r>
-              <w:rPr>
-                <w:noProof/>
-                <w:webHidden/>
-              </w:rPr>
-              <w:tab/>
-            </w:r>
-            <w:r>
-              <w:rPr>
-                <w:noProof/>
-                <w:webHidden/>
-              </w:rPr>
-              <w:fldChar w:fldCharType="begin"/>
-            </w:r>
-            <w:r>
-              <w:rPr>
-                <w:noProof/>
-                <w:webHidden/>
-              </w:rPr>
-              <w:instrText xml:space="preserve"> PAGEREF _Toc232957776 \h </w:instrText>
-            </w:r>
-            <w:r>
-              <w:rPr>
-                <w:noProof/>
-                <w:webHidden/>
-              </w:rPr>
-            </w:r>
-            <w:r>
-              <w:rPr>
-                <w:noProof/>
-                <w:webHidden/>
-              </w:rPr>
-              <w:fldChar w:fldCharType="separate"/>
-            </w:r>
-            <w:r>
-              <w:rPr>
-                <w:noProof/>
-                <w:webHidden/>
-              </w:rPr>
-              <w:t>6</w:t>
-            </w:r>
-            <w:r>
-              <w:rPr>
-                <w:noProof/>
-                <w:webHidden/>
-              </w:rPr>
-              <w:fldChar w:fldCharType="end"/>
-            </w:r>
-          </w:hyperlink>
-        </w:p>
-        <w:p>
-          <w:pPr>
-            <w:pStyle w:val="TOC2"/>
-            <w:tabs>
-              <w:tab w:val="right" w:leader="dot" w:pos="9350"/>
-            </w:tabs>
-            <w:rPr>
-              <w:noProof/>
-            </w:rPr>
-          </w:pPr>
-          <w:hyperlink w:anchor="_Toc232957777" w:history="1">
-            <w:r>
-              <w:rPr>
-                <w:rStyle w:val="Hyperlink"/>
-                <w:noProof/>
-              </w:rPr>
-              <w:t>6. New-sector / “outside the box” ideas to chase</w:t>
-            </w:r>
-            <w:r>
-              <w:rPr>
-                <w:noProof/>
-                <w:webHidden/>
-              </w:rPr>
-              <w:tab/>
-            </w:r>
-            <w:r>
-              <w:rPr>
-                <w:noProof/>
-                <w:webHidden/>
-              </w:rPr>
-              <w:fldChar w:fldCharType="begin"/>
-            </w:r>
-            <w:r>
-              <w:rPr>
-                <w:noProof/>
-                <w:webHidden/>
-              </w:rPr>
-              <w:instrText xml:space="preserve"> PAGEREF _Toc232957777 \h </w:instrText>
-            </w:r>
-            <w:r>
-              <w:rPr>
-                <w:noProof/>
-                <w:webHidden/>
-              </w:rPr>
-            </w:r>
-            <w:r>
-              <w:rPr>
-                <w:noProof/>
-                <w:webHidden/>
-              </w:rPr>
-              <w:fldChar w:fldCharType="separate"/>
-            </w:r>
-            <w:r>
-              <w:rPr>
-                <w:noProof/>
-                <w:webHidden/>
-              </w:rPr>
-              <w:t>10</w:t>
-            </w:r>
-            <w:r>
-              <w:rPr>
-                <w:noProof/>
-                <w:webHidden/>
-              </w:rPr>
-              <w:fldChar w:fldCharType="end"/>
-            </w:r>
-          </w:hyperlink>
-        </w:p>
-        <w:p>
-          <w:pPr>
-            <w:pStyle w:val="TOC2"/>
-            <w:tabs>
-              <w:tab w:val="right" w:leader="dot" w:pos="9350"/>
-            </w:tabs>
-            <w:rPr>
-              <w:noProof/>
-            </w:rPr>
-          </w:pPr>
-          <w:hyperlink w:anchor="_Toc232957778" w:history="1">
-            <w:r>
-              <w:rPr>
-                <w:rStyle w:val="Hyperlink"/>
-                <w:noProof/>
-              </w:rPr>
-              <w:t>7. Intel flags (read before acting)</w:t>
-            </w:r>
-            <w:r>
-              <w:rPr>
-                <w:noProof/>
-                <w:webHidden/>
-              </w:rPr>
-              <w:tab/>
-            </w:r>
-            <w:r>
-              <w:rPr>
-                <w:noProof/>
-                <w:webHidden/>
-              </w:rPr>
-              <w:fldChar w:fldCharType="begin"/>
-            </w:r>
-            <w:r>
-              <w:rPr>
-                <w:noProof/>
-                <w:webHidden/>
-              </w:rPr>
-              <w:instrText xml:space="preserve"> PAGEREF _Toc232957778 \h </w:instrText>
-            </w:r>
-            <w:r>
-              <w:rPr>
-                <w:noProof/>
-                <w:webHidden/>
-              </w:rPr>
-            </w:r>
-            <w:r>
-              <w:rPr>
-                <w:noProof/>
-                <w:webHidden/>
-              </w:rPr>
-              <w:fldChar w:fldCharType="separate"/>
-            </w:r>
-            <w:r>
-              <w:rPr>
-                <w:noProof/>
-                <w:webHidden/>
-              </w:rPr>
-              <w:t>11</w:t>
-            </w:r>
-            <w:r>
-              <w:rPr>
-                <w:noProof/>
-                <w:webHidden/>
-              </w:rPr>
-              <w:fldChar w:fldCharType="end"/>
-            </w:r>
-          </w:hyperlink>
-        </w:p>
-        <w:p>
-          <w:pPr>
-            <w:pStyle w:val="TOC2"/>
-            <w:tabs>
-              <w:tab w:val="right" w:leader="dot" w:pos="9350"/>
-            </w:tabs>
-            <w:rPr>
-              <w:noProof/>
-            </w:rPr>
-          </w:pPr>
-          <w:hyperlink w:anchor="_Toc232957779" w:history="1">
-            <w:r>
-              <w:rPr>
-                <w:rStyle w:val="Hyperlink"/>
-                <w:noProof/>
-              </w:rPr>
-              <w:t>8. Confirmed people directory</w:t>
-            </w:r>
-            <w:r>
-              <w:rPr>
-                <w:noProof/>
-                <w:webHidden/>
-              </w:rPr>
-              <w:tab/>
-            </w:r>
-            <w:r>
-              <w:rPr>
-                <w:noProof/>
-                <w:webHidden/>
-              </w:rPr>
-              <w:fldChar w:fldCharType="begin"/>
-            </w:r>
-            <w:r>
-              <w:rPr>
-                <w:noProof/>
-                <w:webHidden/>
-              </w:rPr>
-              <w:instrText xml:space="preserve"> PAGEREF _Toc232957779 \h </w:instrText>
-            </w:r>
-            <w:r>
-              <w:rPr>
-                <w:noProof/>
-                <w:webHidden/>
-              </w:rPr>
-            </w:r>
-            <w:r>
-              <w:rPr>
-                <w:noProof/>
-                <w:webHidden/>
-              </w:rPr>
-              <w:fldChar w:fldCharType="separate"/>
-            </w:r>
-            <w:r>
-              <w:rPr>
-                <w:noProof/>
-                <w:webHidden/>
-              </w:rPr>
-              <w:t>11</w:t>
-            </w:r>
-            <w:r>
-              <w:rPr>
-                <w:noProof/>
-                <w:webHidden/>
-              </w:rPr>
-              <w:fldChar w:fldCharType="end"/>
-            </w:r>
-          </w:hyperlink>
-        </w:p>
-        <w:p>
-          <w:pPr>
-            <w:pStyle w:val="TOC2"/>
-            <w:tabs>
-              <w:tab w:val="right" w:leader="dot" w:pos="9350"/>
-            </w:tabs>
-            <w:rPr>
-              <w:noProof/>
-            </w:rPr>
-          </w:pPr>
-          <w:hyperlink w:anchor="_Toc232957780" w:history="1">
-            <w:r>
-              <w:rPr>
-                <w:rStyle w:val="Hyperlink"/>
-                <w:noProof/>
-              </w:rPr>
-              <w:t>9. Verify directly (don’t guess further)</w:t>
-            </w:r>
-            <w:r>
-              <w:rPr>
-                <w:noProof/>
-                <w:webHidden/>
-              </w:rPr>
-              <w:tab/>
-            </w:r>
-            <w:r>
-              <w:rPr>
-                <w:noProof/>
-                <w:webHidden/>
-              </w:rPr>
-              <w:fldChar w:fldCharType="begin"/>
-            </w:r>
-            <w:r>
-              <w:rPr>
-                <w:noProof/>
-                <w:webHidden/>
-              </w:rPr>
-              <w:instrText xml:space="preserve"> PAGEREF _Toc232957780 \h </w:instrText>
-            </w:r>
-            <w:r>
-              <w:rPr>
-                <w:noProof/>
-                <w:webHidden/>
-              </w:rPr>
-            </w:r>
-            <w:r>
-              <w:rPr>
-                <w:noProof/>
-                <w:webHidden/>
-              </w:rPr>
-              <w:fldChar w:fldCharType="separate"/>
-            </w:r>
-            <w:r>
-              <w:rPr>
-                <w:noProof/>
-                <w:webHidden/>
-              </w:rPr>
-              <w:t>13</w:t>
-            </w:r>
-            <w:r>
-              <w:rPr>
-                <w:noProof/>
-                <w:webHidden/>
-              </w:rPr>
-              <w:fldChar w:fldCharType="end"/>
-            </w:r>
-          </w:hyperlink>
-        </w:p>
-        <w:p>
-          <w:pPr>
-            <w:pStyle w:val="TOC2"/>
-            <w:tabs>
-              <w:tab w:val="right" w:leader="dot" w:pos="9350"/>
-            </w:tabs>
-            <w:rPr>
-              <w:noProof/>
-            </w:rPr>
-          </w:pPr>
-          <w:hyperlink w:anchor="_Toc232957781" w:history="1">
-            <w:r>
-              <w:rPr>
-                <w:rStyle w:val="Hyperlink"/>
-                <w:noProof/>
-              </w:rPr>
-              <w:t>10. Biz Brain ingest (applied &amp; verified 2026-06-19)</w:t>
-            </w:r>
-            <w:r>
-              <w:rPr>
-                <w:noProof/>
-                <w:webHidden/>
-              </w:rPr>
-              <w:tab/>
-            </w:r>
-            <w:r>
-              <w:rPr>
-                <w:noProof/>
-                <w:webHidden/>
-              </w:rPr>
-              <w:fldChar w:fldCharType="begin"/>
-            </w:r>
-            <w:r>
-              <w:rPr>
-                <w:noProof/>
-                <w:webHidden/>
-              </w:rPr>
-              <w:instrText xml:space="preserve"> PAGEREF _Toc232957781 \h </w:instrText>
-            </w:r>
-            <w:r>
-              <w:rPr>
-                <w:noProof/>
-                <w:webHidden/>
-              </w:rPr>
-            </w:r>
-            <w:r>
-              <w:rPr>
-                <w:noProof/>
-                <w:webHidden/>
-              </w:rPr>
-              <w:fldChar w:fldCharType="separate"/>
-            </w:r>
-            <w:r>
-              <w:rPr>
-                <w:noProof/>
-                <w:webHidden/>
-              </w:rPr>
-              <w:t>13</w:t>
-            </w:r>
-            <w:r>
-              <w:rPr>
-                <w:noProof/>
-                <w:webHidden/>
-              </w:rPr>
-              <w:fldChar w:fldCharType="end"/>
-            </w:r>
-          </w:hyperlink>
-        </w:p>
-        <w:p>
-          <w:pPr>
-            <w:pStyle w:val="TOC2"/>
-            <w:tabs>
-              <w:tab w:val="right" w:leader="dot" w:pos="9350"/>
-            </w:tabs>
-            <w:rPr>
-              <w:noProof/>
-            </w:rPr>
-          </w:pPr>
-          <w:hyperlink w:anchor="_Toc232957782" w:history="1">
-            <w:r>
-              <w:rPr>
-                <w:rStyle w:val="Hyperlink"/>
-                <w:noProof/>
-              </w:rPr>
-              <w:t>11. CRM — pursuits loaded this session (applied &amp; verified 2026-06-19)</w:t>
-            </w:r>
-            <w:r>
-              <w:rPr>
-                <w:noProof/>
-                <w:webHidden/>
-              </w:rPr>
-              <w:tab/>
-            </w:r>
-            <w:r>
-              <w:rPr>
-                <w:noProof/>
-                <w:webHidden/>
-              </w:rPr>
-              <w:fldChar w:fldCharType="begin"/>
-            </w:r>
-            <w:r>
-              <w:rPr>
-                <w:noProof/>
-                <w:webHidden/>
-              </w:rPr>
-              <w:instrText xml:space="preserve"> PAGEREF _Toc232957782 \h </w:instrText>
-            </w:r>
-            <w:r>
-              <w:rPr>
-                <w:noProof/>
-                <w:webHidden/>
-              </w:rPr>
-            </w:r>
-            <w:r>
-              <w:rPr>
-                <w:noProof/>
-                <w:webHidden/>
-              </w:rPr>
-              <w:fldChar w:fldCharType="separate"/>
-            </w:r>
-            <w:r>
-              <w:rPr>
-                <w:noProof/>
-                <w:webHidden/>
-              </w:rPr>
-              <w:t>14</w:t>
-            </w:r>
-            <w:r>
-              <w:rPr>
-                <w:noProof/>
-                <w:webHidden/>
-              </w:rPr>
-              <w:fldChar w:fldCharType="end"/>
-            </w:r>
-          </w:hyperlink>
-        </w:p>
-        <w:p>
-          <w:r>
-            <w:fldChar w:fldCharType="end"/>
-          </w:r>
-        </w:p>
-      </w:sdtContent>
-    </w:sdt>
     <w:p>
       <w:pPr>
         <w:pStyle w:val="Heading1"/>
       </w:pPr>
       <w:bookmarkStart w:id="0" w:name="Xf82bafeb53a3c87ba169f235266c143b22ca82c"/>
-      <w:bookmarkStart w:id="1" w:name="_Toc232957770"/>
       <w:r>
         <w:t>BD Meeting — Vancouver Lower Mainland — Actionables &amp; Verified Targets</w:t>
       </w:r>
-      <w:bookmarkEnd w:id="1"/>
     </w:p>
     <w:p>
       <w:pPr>
@@ -1097,10 +164,10 @@
           <w:b/>
           <w:bCs/>
         </w:rPr>
-        <w:t>Full deep re-enrichment now running</w:t>
-      </w:r>
-      <w:r>
-        <w:t xml:space="preserve"> across all 6,401 + 4,211 BD-relevant orgs (Developers/Architects/GCs/Competitors/Buyers/KorClients) — so by the Tuesday intel deliverable, every target in §5 will carry fresh, web-verified narrative + people + signals on the clean graph, not the pre-cull state.</w:t>
+        <w:t>Targeted, cost-controlled enrichment — priority targets first.</w:t>
+      </w:r>
+      <w:r>
+        <w:t xml:space="preserve"> The indiscriminate always-on enrichment of the full ~10k-org base was retired (it was the main cost driver); enrichment now prioritises the high-value pursuit targets and runs in controlled, verified passes. The §5 targets sit on the cleaned graph with web-verified narrative + people + signals; lower-priority orgs are enriched only as they become relevant.</w:t>
       </w:r>
     </w:p>
     <w:p>
@@ -1131,7 +198,7 @@
         <w:t>kp=N</w:t>
       </w:r>
       <w:r>
-        <w:t xml:space="preserve"> — number of KOR projects on record with that org (warmth signal). ✅Deltek = linked Deltek client.</w:t>
+        <w:t xml:space="preserve"> — number of KOR projects on record with that org (warmth signal). Deltek = linked Deltek client.</w:t>
       </w:r>
     </w:p>
     <w:p>
@@ -1182,35 +249,7 @@
         <w:t>bold</w:t>
       </w:r>
       <w:r>
-        <w:t xml:space="preserve"> are the corrected/confirmed spellings; the transcript’s garbled version is shown in </w:t>
-      </w:r>
-      <w:r>
-        <w:rPr>
-          <w:i/>
-          <w:iCs/>
-        </w:rPr>
-        <w:t>(quotes)</w:t>
-      </w:r>
-      <w:r>
-        <w:t xml:space="preserve"> where useful.</w:t>
-      </w:r>
-    </w:p>
-    <w:p>
-      <w:pPr>
-        <w:pStyle w:val="Compact"/>
-        <w:numPr>
-          <w:ilvl w:val="0"/>
-          <w:numId w:val="3"/>
-        </w:numPr>
-      </w:pPr>
-      <w:r>
-        <w:t>⚠</w:t>
-      </w:r>
-      <w:r>
-        <w:t>️</w:t>
-      </w:r>
-      <w:r>
-        <w:t xml:space="preserve"> = an intel flag to read before acting.</w:t>
+        <w:t xml:space="preserve"> are the corrected/confirmed spellings.</w:t>
       </w:r>
     </w:p>
     <w:p>
@@ -1231,6 +270,7 @@
           <w:b/>
           <w:bCs/>
         </w:rPr>
+        <w:lastRenderedPageBreak/>
         <w:t>Already actioned &amp; verified (live CRM engagement IDs as of 2026-06-20):</w:t>
       </w:r>
       <w:r>
@@ -1370,22 +410,22 @@
         <w:t>(RBI moved from #90 → #4 when the session’s dedup remapped the org to canonical #14.)</w:t>
       </w:r>
       <w:r>
+        <w:t xml:space="preserve"> Names were also cleaned in the Biz Brain (dedup merges, reclassify, aliases, contacts). Full detail in </w:t>
+      </w:r>
+      <w:r>
+        <w:rPr>
+          <w:b/>
+          <w:bCs/>
+        </w:rPr>
+        <w:t>§10 (Brain)</w:t>
+      </w:r>
+      <w:r>
+        <w:t xml:space="preserve"> and</w:t>
+      </w:r>
+      <w:r>
         <w:t xml:space="preserve"> </w:t>
       </w:r>
       <w:r>
-        <w:t xml:space="preserve">Names were also cleaned in the Biz Brain (dedup merges, reclassify, aliases, contacts). Full detail in </w:t>
-      </w:r>
-      <w:r>
-        <w:rPr>
-          <w:b/>
-          <w:bCs/>
-        </w:rPr>
-        <w:t>§10 (Brain)</w:t>
-      </w:r>
-      <w:r>
-        <w:t xml:space="preserve"> and </w:t>
-      </w:r>
-      <w:r>
         <w:rPr>
           <w:b/>
           <w:bCs/>
@@ -1398,7 +438,7 @@
     </w:p>
     <w:p>
       <w:r>
-        <w:pict w14:anchorId="765778D4">
+        <w:pict w14:anchorId="0B208ED5">
           <v:rect id="_x0000_i1025" style="width:0;height:1.5pt" o:hralign="center" o:hrstd="t" o:hr="t"/>
         </w:pict>
       </w:r>
@@ -1408,12 +448,10 @@
         <w:pStyle w:val="Heading2"/>
         <w:pageBreakBefore/>
       </w:pPr>
-      <w:bookmarkStart w:id="2" w:name="X41b0927f7dbe2ef81759d3e6a32475b9cceaa65"/>
-      <w:bookmarkStart w:id="3" w:name="_Toc232957771"/>
+      <w:bookmarkStart w:id="1" w:name="X41b0927f7dbe2ef81759d3e6a32475b9cceaa65"/>
       <w:r>
         <w:t>0. Ian’s tasks — status tracker (added 2026-06-21)</w:t>
       </w:r>
-      <w:bookmarkEnd w:id="3"/>
     </w:p>
     <w:p>
       <w:pPr>
@@ -1429,7 +467,7 @@
     </w:p>
     <w:tbl>
       <w:tblPr>
-        <w:tblStyle w:val="GridTable5Dark-Accent1"/>
+        <w:tblStyle w:val="GridTable4-Accent1"/>
         <w:tblW w:w="5000" w:type="pct"/>
         <w:tblCellMar>
           <w:top w:w="40" w:type="dxa"/>
@@ -1459,13 +497,11 @@
             <w:pPr>
               <w:pStyle w:val="Compact"/>
               <w:rPr>
-                <w:b w:val="0"/>
-                <w:sz w:val="19"/>
-              </w:rPr>
-            </w:pPr>
-            <w:r>
-              <w:rPr>
-                <w:b w:val="0"/>
+                <w:sz w:val="19"/>
+              </w:rPr>
+            </w:pPr>
+            <w:r>
+              <w:rPr>
                 <w:sz w:val="19"/>
               </w:rPr>
               <w:t>#</w:t>
@@ -1480,13 +516,11 @@
             <w:pPr>
               <w:pStyle w:val="Compact"/>
               <w:rPr>
-                <w:b w:val="0"/>
-                <w:sz w:val="19"/>
-              </w:rPr>
-            </w:pPr>
-            <w:r>
-              <w:rPr>
-                <w:b w:val="0"/>
+                <w:sz w:val="19"/>
+              </w:rPr>
+            </w:pPr>
+            <w:r>
+              <w:rPr>
                 <w:sz w:val="19"/>
               </w:rPr>
               <w:t>Your task (source §)</w:t>
@@ -1501,13 +535,11 @@
             <w:pPr>
               <w:pStyle w:val="Compact"/>
               <w:rPr>
-                <w:b w:val="0"/>
-                <w:sz w:val="19"/>
-              </w:rPr>
-            </w:pPr>
-            <w:r>
-              <w:rPr>
-                <w:b w:val="0"/>
+                <w:sz w:val="19"/>
+              </w:rPr>
+            </w:pPr>
+            <w:r>
+              <w:rPr>
                 <w:sz w:val="19"/>
               </w:rPr>
               <w:t>Status</w:t>
@@ -1522,13 +554,11 @@
             <w:pPr>
               <w:pStyle w:val="Compact"/>
               <w:rPr>
-                <w:b w:val="0"/>
-                <w:sz w:val="19"/>
-              </w:rPr>
-            </w:pPr>
-            <w:r>
-              <w:rPr>
-                <w:b w:val="0"/>
+                <w:sz w:val="19"/>
+              </w:rPr>
+            </w:pPr>
+            <w:r>
+              <w:rPr>
                 <w:sz w:val="19"/>
               </w:rPr>
               <w:t>Note</w:t>
@@ -1600,19 +630,6 @@
             </w:pPr>
             <w:r>
               <w:rPr>
-                <w:rFonts w:ascii="Segoe UI Emoji" w:hAnsi="Segoe UI Emoji" w:cs="Segoe UI Emoji"/>
-                <w:sz w:val="19"/>
-              </w:rPr>
-              <w:t>✅</w:t>
-            </w:r>
-            <w:r>
-              <w:rPr>
-                <w:sz w:val="19"/>
-              </w:rPr>
-              <w:t xml:space="preserve"> </w:t>
-            </w:r>
-            <w:r>
-              <w:rPr>
                 <w:b/>
                 <w:bCs/>
                 <w:sz w:val="19"/>
@@ -1716,19 +733,6 @@
                 <w:sz w:val="19"/>
               </w:rPr>
             </w:pPr>
-            <w:r>
-              <w:rPr>
-                <w:rFonts w:ascii="Segoe UI Emoji" w:hAnsi="Segoe UI Emoji" w:cs="Segoe UI Emoji"/>
-                <w:sz w:val="19"/>
-              </w:rPr>
-              <w:t>✅</w:t>
-            </w:r>
-            <w:r>
-              <w:rPr>
-                <w:sz w:val="19"/>
-              </w:rPr>
-              <w:t xml:space="preserve"> </w:t>
-            </w:r>
             <w:r>
               <w:rPr>
                 <w:b/>
@@ -1823,19 +827,6 @@
             </w:pPr>
             <w:r>
               <w:rPr>
-                <w:rFonts w:ascii="Segoe UI Emoji" w:hAnsi="Segoe UI Emoji" w:cs="Segoe UI Emoji"/>
-                <w:sz w:val="19"/>
-              </w:rPr>
-              <w:t>✅</w:t>
-            </w:r>
-            <w:r>
-              <w:rPr>
-                <w:sz w:val="19"/>
-              </w:rPr>
-              <w:t xml:space="preserve"> </w:t>
-            </w:r>
-            <w:r>
-              <w:rPr>
                 <w:b/>
                 <w:bCs/>
                 <w:sz w:val="19"/>
@@ -1911,6 +902,7 @@
               <w:rPr>
                 <w:sz w:val="19"/>
               </w:rPr>
+              <w:lastRenderedPageBreak/>
               <w:t>D</w:t>
             </w:r>
           </w:p>
@@ -1955,19 +947,6 @@
             </w:pPr>
             <w:r>
               <w:rPr>
-                <w:rFonts w:ascii="Segoe UI Emoji" w:hAnsi="Segoe UI Emoji" w:cs="Segoe UI Emoji"/>
-                <w:sz w:val="19"/>
-              </w:rPr>
-              <w:t>✅</w:t>
-            </w:r>
-            <w:r>
-              <w:rPr>
-                <w:sz w:val="19"/>
-              </w:rPr>
-              <w:t xml:space="preserve"> </w:t>
-            </w:r>
-            <w:r>
-              <w:rPr>
                 <w:b/>
                 <w:bCs/>
                 <w:sz w:val="19"/>
@@ -1999,7 +978,13 @@
                 <w:bCs/>
                 <w:sz w:val="19"/>
               </w:rPr>
-              <w:t>Full deep re-enrichment now running.</w:t>
+              <w:t>Enrichment now targeted + cost-controlled</w:t>
+            </w:r>
+            <w:r>
+              <w:rPr>
+                <w:sz w:val="19"/>
+              </w:rPr>
+              <w:t xml:space="preserve"> (priority targets first; the always-on full-base pass was retired).</w:t>
             </w:r>
           </w:p>
         </w:tc>
@@ -2068,19 +1053,6 @@
             </w:pPr>
             <w:r>
               <w:rPr>
-                <w:rFonts w:ascii="Segoe UI Emoji" w:hAnsi="Segoe UI Emoji" w:cs="Segoe UI Emoji"/>
-                <w:sz w:val="19"/>
-              </w:rPr>
-              <w:t>🔄</w:t>
-            </w:r>
-            <w:r>
-              <w:rPr>
-                <w:sz w:val="19"/>
-              </w:rPr>
-              <w:t xml:space="preserve"> </w:t>
-            </w:r>
-            <w:r>
-              <w:rPr>
                 <w:b/>
                 <w:bCs/>
                 <w:sz w:val="19"/>
@@ -2170,19 +1142,6 @@
                 <w:sz w:val="19"/>
               </w:rPr>
             </w:pPr>
-            <w:r>
-              <w:rPr>
-                <w:rFonts w:ascii="Segoe UI Emoji" w:hAnsi="Segoe UI Emoji" w:cs="Segoe UI Emoji"/>
-                <w:sz w:val="19"/>
-              </w:rPr>
-              <w:t>🔄</w:t>
-            </w:r>
-            <w:r>
-              <w:rPr>
-                <w:sz w:val="19"/>
-              </w:rPr>
-              <w:t xml:space="preserve"> </w:t>
-            </w:r>
             <w:r>
               <w:rPr>
                 <w:b/>
@@ -2271,19 +1230,6 @@
             </w:pPr>
             <w:r>
               <w:rPr>
-                <w:rFonts w:ascii="Segoe UI Emoji" w:hAnsi="Segoe UI Emoji" w:cs="Segoe UI Emoji"/>
-                <w:sz w:val="19"/>
-              </w:rPr>
-              <w:t>✅</w:t>
-            </w:r>
-            <w:r>
-              <w:rPr>
-                <w:sz w:val="19"/>
-              </w:rPr>
-              <w:t xml:space="preserve"> </w:t>
-            </w:r>
-            <w:r>
-              <w:rPr>
                 <w:b/>
                 <w:bCs/>
                 <w:sz w:val="19"/>
@@ -2307,7 +1253,13 @@
               <w:rPr>
                 <w:sz w:val="19"/>
               </w:rPr>
-              <w:t xml:space="preserve">Org Dossier has a “Refresh Intel” button (→ queues a FirmNarrative research trigger the Worker drains). </w:t>
+              <w:t xml:space="preserve">Org Dossier has a “Refresh Intel” </w:t>
+            </w:r>
+            <w:r>
+              <w:rPr>
+                <w:sz w:val="19"/>
+              </w:rPr>
+              <w:t xml:space="preserve">button (→ queues a FirmNarrative research trigger the Worker drains). </w:t>
             </w:r>
             <w:r>
               <w:rPr>
@@ -2389,16 +1341,9 @@
             </w:pPr>
             <w:r>
               <w:rPr>
-                <w:rFonts w:ascii="Segoe UI Emoji" w:hAnsi="Segoe UI Emoji" w:cs="Segoe UI Emoji"/>
-                <w:sz w:val="19"/>
-              </w:rPr>
-              <w:t>⬜</w:t>
-            </w:r>
-            <w:r>
-              <w:rPr>
-                <w:sz w:val="19"/>
-              </w:rPr>
-              <w:t xml:space="preserve"> Open</w:t>
+                <w:sz w:val="19"/>
+              </w:rPr>
+              <w:t>Open</w:t>
             </w:r>
           </w:p>
         </w:tc>
@@ -2486,16 +1431,9 @@
             </w:pPr>
             <w:r>
               <w:rPr>
-                <w:rFonts w:ascii="Segoe UI Emoji" w:hAnsi="Segoe UI Emoji" w:cs="Segoe UI Emoji"/>
-                <w:sz w:val="19"/>
-              </w:rPr>
-              <w:t>⬜</w:t>
-            </w:r>
-            <w:r>
-              <w:rPr>
-                <w:sz w:val="19"/>
-              </w:rPr>
-              <w:t xml:space="preserve"> Blocked</w:t>
+                <w:sz w:val="19"/>
+              </w:rPr>
+              <w:t>Blocked</w:t>
             </w:r>
           </w:p>
         </w:tc>
@@ -2565,7 +1503,14 @@
               <w:rPr>
                 <w:sz w:val="19"/>
               </w:rPr>
-              <w:t xml:space="preserve"> (JM takes the course) (§1#1)</w:t>
+              <w:t xml:space="preserve"> (JM takes the course) </w:t>
+            </w:r>
+            <w:r>
+              <w:rPr>
+                <w:sz w:val="19"/>
+              </w:rPr>
+              <w:lastRenderedPageBreak/>
+              <w:t>(§1#1)</w:t>
             </w:r>
           </w:p>
         </w:tc>
@@ -2582,16 +1527,10 @@
             </w:pPr>
             <w:r>
               <w:rPr>
-                <w:rFonts w:ascii="Segoe UI Emoji" w:hAnsi="Segoe UI Emoji" w:cs="Segoe UI Emoji"/>
-                <w:sz w:val="19"/>
-              </w:rPr>
-              <w:t>⬜</w:t>
-            </w:r>
-            <w:r>
-              <w:rPr>
-                <w:sz w:val="19"/>
-              </w:rPr>
-              <w:t xml:space="preserve"> Open</w:t>
+                <w:sz w:val="19"/>
+              </w:rPr>
+              <w:lastRenderedPageBreak/>
+              <w:t>Open</w:t>
             </w:r>
           </w:p>
         </w:tc>
@@ -2673,16 +1612,9 @@
             </w:pPr>
             <w:r>
               <w:rPr>
-                <w:rFonts w:ascii="Segoe UI Emoji" w:hAnsi="Segoe UI Emoji" w:cs="Segoe UI Emoji"/>
-                <w:sz w:val="19"/>
-              </w:rPr>
-              <w:t>⬜</w:t>
-            </w:r>
-            <w:r>
-              <w:rPr>
-                <w:sz w:val="19"/>
-              </w:rPr>
-              <w:t xml:space="preserve"> Your call</w:t>
+                <w:sz w:val="19"/>
+              </w:rPr>
+              <w:t>Your call</w:t>
             </w:r>
           </w:p>
         </w:tc>
@@ -2709,7 +1641,7 @@
     </w:tbl>
     <w:p>
       <w:r>
-        <w:pict w14:anchorId="14C36144">
+        <w:pict w14:anchorId="7B144257">
           <v:rect id="_x0000_i1026" style="width:0;height:1.5pt" o:hralign="center" o:hrstd="t" o:hr="t"/>
         </w:pict>
       </w:r>
@@ -2719,17 +1651,15 @@
         <w:pStyle w:val="Heading2"/>
         <w:pageBreakBefore/>
       </w:pPr>
-      <w:bookmarkStart w:id="4" w:name="Xdfed9eb99d51080e80e136cd86e447e240bf84f"/>
-      <w:bookmarkStart w:id="5" w:name="_Toc232957772"/>
-      <w:bookmarkEnd w:id="2"/>
+      <w:bookmarkStart w:id="2" w:name="Xdfed9eb99d51080e80e136cd86e447e240bf84f"/>
+      <w:bookmarkEnd w:id="1"/>
       <w:r>
         <w:t>1. Firm-level actionables (lists, qualifications, proposals)</w:t>
       </w:r>
-      <w:bookmarkEnd w:id="5"/>
     </w:p>
     <w:tbl>
       <w:tblPr>
-        <w:tblStyle w:val="GridTable5Dark-Accent1"/>
+        <w:tblStyle w:val="GridTable4-Accent1"/>
         <w:tblW w:w="5000" w:type="pct"/>
         <w:tblCellMar>
           <w:top w:w="40" w:type="dxa"/>
@@ -3267,27 +2197,37 @@
                 <w:bCs/>
                 <w:sz w:val="19"/>
               </w:rPr>
-              <w:t>Ministry / big design-build (Graham-style) qualification requirements</w:t>
-            </w:r>
-          </w:p>
-        </w:tc>
-        <w:tc>
-          <w:tcPr>
-            <w:tcW w:w="1400" w:type="pct"/>
-          </w:tcPr>
-          <w:p>
-            <w:pPr>
-              <w:pStyle w:val="Compact"/>
-              <w:rPr>
-                <w:sz w:val="19"/>
-              </w:rPr>
-            </w:pPr>
+              <w:t xml:space="preserve">Ministry / big design-build (Graham-style) qualification </w:t>
+            </w:r>
             <w:r>
               <w:rPr>
                 <w:b/>
                 <w:bCs/>
                 <w:sz w:val="19"/>
               </w:rPr>
+              <w:lastRenderedPageBreak/>
+              <w:t>requirements</w:t>
+            </w:r>
+          </w:p>
+        </w:tc>
+        <w:tc>
+          <w:tcPr>
+            <w:tcW w:w="1400" w:type="pct"/>
+          </w:tcPr>
+          <w:p>
+            <w:pPr>
+              <w:pStyle w:val="Compact"/>
+              <w:rPr>
+                <w:sz w:val="19"/>
+              </w:rPr>
+            </w:pPr>
+            <w:r>
+              <w:rPr>
+                <w:b/>
+                <w:bCs/>
+                <w:sz w:val="19"/>
+              </w:rPr>
+              <w:lastRenderedPageBreak/>
               <w:t>Ian</w:t>
             </w:r>
             <w:r>
@@ -3313,7 +2253,14 @@
               <w:rPr>
                 <w:sz w:val="19"/>
               </w:rPr>
-              <w:t>Rory’s Q: what list/quals to play on big-fee design-build? Can a client/ministry contact sponsor us in?</w:t>
+              <w:t xml:space="preserve">Rory’s Q: what list/quals to play on big-fee design-build? Can a </w:t>
+            </w:r>
+            <w:r>
+              <w:rPr>
+                <w:sz w:val="19"/>
+              </w:rPr>
+              <w:lastRenderedPageBreak/>
+              <w:t>client/ministry contact sponsor us in?</w:t>
             </w:r>
           </w:p>
         </w:tc>
@@ -3337,6 +2284,7 @@
               <w:rPr>
                 <w:sz w:val="19"/>
               </w:rPr>
+              <w:lastRenderedPageBreak/>
               <w:t>6</w:t>
             </w:r>
           </w:p>
@@ -3413,13 +2361,14 @@
         <w:pStyle w:val="Heading2"/>
         <w:pageBreakBefore/>
       </w:pPr>
-      <w:bookmarkStart w:id="6" w:name="the-biz-brain-crm-process"/>
-      <w:bookmarkStart w:id="7" w:name="_Toc232957773"/>
-      <w:bookmarkEnd w:id="4"/>
-      <w:r>
-        <w:t>2. The “Biz Brain” + CRM + process</w:t>
-      </w:r>
-      <w:bookmarkEnd w:id="7"/>
+      <w:bookmarkStart w:id="3" w:name="the-biz-brain-crm-process"/>
+      <w:bookmarkEnd w:id="2"/>
+      <w:r>
+        <w:t xml:space="preserve">2. The </w:t>
+      </w:r>
+      <w:r>
+        <w:t>“Biz Brain” + CRM + process</w:t>
+      </w:r>
     </w:p>
     <w:p>
       <w:pPr>
@@ -3552,13 +2501,11 @@
         <w:pStyle w:val="Heading2"/>
         <w:pageBreakBefore/>
       </w:pPr>
-      <w:bookmarkStart w:id="8" w:name="X52b6e6d8cdd72e96d6a0e8c581c9930cbc3f0f7"/>
-      <w:bookmarkStart w:id="9" w:name="_Toc232957774"/>
-      <w:bookmarkEnd w:id="6"/>
+      <w:bookmarkStart w:id="4" w:name="X52b6e6d8cdd72e96d6a0e8c581c9930cbc3f0f7"/>
+      <w:bookmarkEnd w:id="3"/>
       <w:r>
         <w:t>3. Website overhaul — decision at Monday partnership meeting</w:t>
       </w:r>
-      <w:bookmarkEnd w:id="9"/>
     </w:p>
     <w:p>
       <w:pPr>
@@ -3676,13 +2623,12 @@
         <w:pStyle w:val="Heading2"/>
         <w:pageBreakBefore/>
       </w:pPr>
-      <w:bookmarkStart w:id="10" w:name="marketing-promotion"/>
-      <w:bookmarkStart w:id="11" w:name="_Toc232957775"/>
-      <w:bookmarkEnd w:id="8"/>
-      <w:r>
+      <w:bookmarkStart w:id="5" w:name="marketing-promotion"/>
+      <w:bookmarkEnd w:id="4"/>
+      <w:r>
+        <w:lastRenderedPageBreak/>
         <w:t>4. Marketing / promotion</w:t>
       </w:r>
-      <w:bookmarkEnd w:id="11"/>
     </w:p>
     <w:p>
       <w:pPr>
@@ -3850,7 +2796,7 @@
     </w:p>
     <w:p>
       <w:r>
-        <w:pict w14:anchorId="2677381C">
+        <w:pict w14:anchorId="5341EFF3">
           <v:rect id="_x0000_i1027" style="width:0;height:1.5pt" o:hralign="center" o:hrstd="t" o:hr="t"/>
         </w:pict>
       </w:r>
@@ -3860,19 +2806,17 @@
         <w:pStyle w:val="Heading2"/>
         <w:pageBreakBefore/>
       </w:pPr>
-      <w:bookmarkStart w:id="12" w:name="Xdcf932e8b8a22fec95416f7e96ea13fd4d70a8b"/>
-      <w:bookmarkStart w:id="13" w:name="_Toc232957776"/>
-      <w:bookmarkEnd w:id="10"/>
+      <w:bookmarkStart w:id="6" w:name="Xdcf932e8b8a22fec95416f7e96ea13fd4d70a8b"/>
+      <w:bookmarkEnd w:id="5"/>
       <w:r>
         <w:t>5. Target lists by region (corrected names → owner → action)</w:t>
       </w:r>
-      <w:bookmarkEnd w:id="13"/>
     </w:p>
     <w:p>
       <w:pPr>
         <w:pStyle w:val="Heading3"/>
       </w:pPr>
-      <w:bookmarkStart w:id="14" w:name="X713c3d34fc0a884761379e6e95a2ab0278eec25"/>
+      <w:bookmarkStart w:id="7" w:name="X713c3d34fc0a884761379e6e95a2ab0278eec25"/>
       <w:r>
         <w:t>Vancouver Lower Mainland — Omar (lead), John, Jim</w:t>
       </w:r>
@@ -3893,7 +2837,7 @@
         <w:t>Pinnacle International</w:t>
       </w:r>
       <w:r>
-        <w:t xml:space="preserve"> [conf: High] — kp=8, ✅CL00333. Work in Alberta, new San Diego properties, Vancouver business; warm but stale. → John + Omar meet </w:t>
+        <w:t xml:space="preserve"> [conf: High] — kp=8, CL00333. Work in Alberta, new San Diego properties, Vancouver business; warm but stale. → John + Omar meet </w:t>
       </w:r>
       <w:r>
         <w:rPr>
@@ -3903,23 +2847,7 @@
         <w:t>Michael De Cotiis</w:t>
       </w:r>
       <w:r>
-        <w:t xml:space="preserve"> </w:t>
-      </w:r>
-      <w:r>
-        <w:rPr>
-          <w:i/>
-          <w:iCs/>
-        </w:rPr>
-        <w:t>(“Mike Dakotis”)</w:t>
-      </w:r>
-      <w:r>
-        <w:t>, President/owner. ⚠</w:t>
-      </w:r>
-      <w:r>
-        <w:t>️</w:t>
-      </w:r>
-      <w:r>
-        <w:t xml:space="preserve"> See Pinnacle/Onni note in §7.</w:t>
+        <w:t>, President/owner. See Pinnacle/Onni note in §7.</w:t>
       </w:r>
     </w:p>
     <w:p>
@@ -3938,7 +2866,7 @@
         <w:t>Bosa Development</w:t>
       </w:r>
       <w:r>
-        <w:t xml:space="preserve"> [High] — kp=78, ✅CL00047. Reconnect </w:t>
+        <w:t xml:space="preserve"> [High] — kp=78, CL00047. Reconnect </w:t>
       </w:r>
       <w:r>
         <w:rPr>
@@ -3956,16 +2884,6 @@
           <w:bCs/>
         </w:rPr>
         <w:t>Paul Lamme</w:t>
-      </w:r>
-      <w:r>
-        <w:t xml:space="preserve"> </w:t>
-      </w:r>
-      <w:r>
-        <w:rPr>
-          <w:i/>
-          <w:iCs/>
-        </w:rPr>
-        <w:t>(“Paul LeMay”)</w:t>
       </w:r>
       <w:r>
         <w:t xml:space="preserve">, VP Development </w:t>
@@ -3997,7 +2915,7 @@
         <w:t>Bosa Properties</w:t>
       </w:r>
       <w:r>
-        <w:t xml:space="preserve"> [High] — kp=44, ✅CL00048 (separate entity). </w:t>
+        <w:t xml:space="preserve"> [High] — kp=44, CL00048 (separate entity). </w:t>
       </w:r>
       <w:r>
         <w:rPr>
@@ -4026,7 +2944,7 @@
         <w:t>Intergulf Development Group</w:t>
       </w:r>
       <w:r>
-        <w:t xml:space="preserve"> [High] — kp=8, ✅CL00204. One job under construction; John knows the “top dog”; an </w:t>
+        <w:t xml:space="preserve"> [High] — kp=8, CL00204. One job under construction; John knows the “top dog”; an </w:t>
       </w:r>
       <w:r>
         <w:rPr>
@@ -4055,7 +2973,10 @@
         <w:t>Ledcor</w:t>
       </w:r>
       <w:r>
-        <w:t xml:space="preserve"> [High] — kp=10. Soft intro via existing </w:t>
+        <w:t xml:space="preserve"> </w:t>
+      </w:r>
+      <w:r>
+        <w:t xml:space="preserve">[High] — kp=10. Soft intro via existing </w:t>
       </w:r>
       <w:r>
         <w:rPr>
@@ -4094,7 +3015,10 @@
         <w:t>Omicron Development Inc.</w:t>
       </w:r>
       <w:r>
-        <w:t xml:space="preserve"> [High] — kp=4, ✅CL00305. Soft intro, already doing TI; chase light-civil/infrastructure (Conor via </w:t>
+        <w:t xml:space="preserve"> </w:t>
+      </w:r>
+      <w:r>
+        <w:t xml:space="preserve">[High] — kp=4, CL00305. Soft intro, already doing TI; chase light-civil/infrastructure (Conor via </w:t>
       </w:r>
       <w:r>
         <w:rPr>
@@ -4346,16 +3270,6 @@
         <w:t>Mundi Hotel Enterprises</w:t>
       </w:r>
       <w:r>
-        <w:t xml:space="preserve"> </w:t>
-      </w:r>
-      <w:r>
-        <w:rPr>
-          <w:i/>
-          <w:iCs/>
-        </w:rPr>
-        <w:t>(“Mundai Group”)</w:t>
-      </w:r>
-      <w:r>
         <w:t xml:space="preserve"> [High company / Low person] — Kamloops; President </w:t>
       </w:r>
       <w:r>
@@ -4366,7 +3280,7 @@
         <w:t>Ron Mundi</w:t>
       </w:r>
       <w:r>
-        <w:t xml:space="preserve">. Not yet in our DB. </w:t>
+        <w:t xml:space="preserve">. (In the brain as #70864 — reclassified Unknown→Developer; CRM eng #61.) </w:t>
       </w:r>
       <w:r>
         <w:rPr>
@@ -4376,10 +3290,7 @@
         <w:t>Rory Allen</w:t>
       </w:r>
       <w:r>
-        <w:t xml:space="preserve"> there (ex-“CDA” </w:t>
-      </w:r>
-      <w:r>
-        <w:t xml:space="preserve">→ Tim Properties [folded] → Mundi). KOR did a hotel for them; hotels across the interior, expanding to Vancouver/Burnaby, lots in Alberta; </w:t>
+        <w:t xml:space="preserve"> there (ex-“CDA” → Tim Properties [folded] → Mundi). KOR did a hotel for them; hotels across the interior, expanding to Vancouver/Burnaby, lots in Alberta; </w:t>
       </w:r>
       <w:r>
         <w:rPr>
@@ -4481,17 +3392,7 @@
         <w:t>M’akola Development Services</w:t>
       </w:r>
       <w:r>
-        <w:t xml:space="preserve"> </w:t>
-      </w:r>
-      <w:r>
-        <w:rPr>
-          <w:i/>
-          <w:iCs/>
-        </w:rPr>
-        <w:t>(“Makola/Mákola”)</w:t>
-      </w:r>
-      <w:r>
-        <w:t xml:space="preserve"> [High] — KorClient, ✅Deltek (Indigenous housing, Victoria, office here). Target the dev lead (no “VP Development” title; closest is </w:t>
+        <w:t xml:space="preserve"> [High] — KorClient, Deltek (Indigenous housing, Victoria, office here). Target the dev lead (no “VP Development” title; closest is </w:t>
       </w:r>
       <w:r>
         <w:rPr>
@@ -4638,7 +3539,10 @@
         <w:t>Morris De Cotiis</w:t>
       </w:r>
       <w:r>
-        <w:t xml:space="preserve"> (Onni principal, construction &amp; property mgmt; #9303). Onni is run by the late founder Inno’s sons — </w:t>
+        <w:t xml:space="preserve"> </w:t>
+      </w:r>
+      <w:r>
+        <w:t xml:space="preserve">(Onni principal, construction &amp; property mgmt; #9303). Onni is run by the late founder Inno’s sons — </w:t>
       </w:r>
       <w:r>
         <w:rPr>
@@ -4678,13 +3582,7 @@
         <w:t>Paolo</w:t>
       </w:r>
       <w:r>
-        <w:t>. ⚠</w:t>
-      </w:r>
-      <w:r>
-        <w:t>️</w:t>
-      </w:r>
-      <w:r>
-        <w:t xml:space="preserve"> </w:t>
+        <w:t xml:space="preserve">. </w:t>
       </w:r>
       <w:r>
         <w:rPr>
@@ -4713,7 +3611,7 @@
         <w:t>Shape Properties</w:t>
       </w:r>
       <w:r>
-        <w:t xml:space="preserve"> [High] — ✅Deltek. “Nothing moving, don’t want to meet”; Omar will phone anyway. (JB issue surfaced here.)</w:t>
+        <w:t xml:space="preserve"> [High] — Deltek. “Nothing moving, don’t want to meet”; Omar will phone anyway. (JB issue surfaced here.)</w:t>
       </w:r>
     </w:p>
     <w:p>
@@ -4732,7 +3630,7 @@
         <w:t>RBI Group of Companies</w:t>
       </w:r>
       <w:r>
-        <w:t xml:space="preserve"> [High] — kp=6, ✅Deltek. New-ish client, cash-rich, buying property, heavy </w:t>
+        <w:t xml:space="preserve"> [High] — kp=6, Deltek. New-ish client, cash-rich, buying property, heavy </w:t>
       </w:r>
       <w:r>
         <w:rPr>
@@ -4840,7 +3738,7 @@
         <w:t>McAllister</w:t>
       </w:r>
       <w:r>
-        <w:t xml:space="preserve"> (“Let Mac”) — tougher revisit. </w:t>
+        <w:t xml:space="preserve"> — tougher revisit. </w:t>
       </w:r>
       <w:r>
         <w:rPr>
@@ -4886,7 +3784,7 @@
         <w:t>Axiom Builders</w:t>
       </w:r>
       <w:r>
-        <w:t xml:space="preserve"> [High] — kp=12, ✅CL00527. Argentina contact helping; set up Axiom Calgary meeting; team on Vancouver Island work.</w:t>
+        <w:t xml:space="preserve"> [High] — kp=12, CL00527. Argentina contact helping; set up Axiom Calgary meeting; team on Vancouver Island work.</w:t>
       </w:r>
     </w:p>
     <w:p>
@@ -4915,8 +3813,8 @@
       <w:pPr>
         <w:pStyle w:val="Heading3"/>
       </w:pPr>
-      <w:bookmarkStart w:id="15" w:name="vancouver-island-rory-lead"/>
-      <w:bookmarkEnd w:id="14"/>
+      <w:bookmarkStart w:id="8" w:name="vancouver-island-rory-lead"/>
+      <w:bookmarkEnd w:id="7"/>
       <w:r>
         <w:t>Vancouver Island — Rory (lead)</w:t>
       </w:r>
@@ -4937,10 +3835,7 @@
         <w:t>Merrick Architecture</w:t>
       </w:r>
       <w:r>
-        <w:t xml:space="preserve"> </w:t>
-      </w:r>
-      <w:r>
-        <w:t>[High] — ✅Deltek; has an Island office. John knows someone; get warm intro to Victoria; Rory + John go.</w:t>
+        <w:t xml:space="preserve"> [High] — Deltek; has an Island office. John knows someone; get warm intro to Victoria; Rory + John go.</w:t>
       </w:r>
     </w:p>
     <w:p>
@@ -5054,79 +3949,113 @@
           <w:b/>
           <w:bCs/>
         </w:rPr>
+        <w:t>Kirk Fisher</w:t>
+      </w:r>
+      <w:r>
+        <w:t xml:space="preserve">. </w:t>
+      </w:r>
+      <w:r>
+        <w:rPr>
+          <w:b/>
+          <w:bCs/>
+        </w:rPr>
+        <w:t>In the brain but duplicated</w:t>
+      </w:r>
+      <w:r>
+        <w:t xml:space="preserve"> — #53694 “The Lark Group” (Developer), #72260 “Lark Projects Ltd.” (GC, BC Housing-confirmed), plus #55097/#27243 (“Unknown”). Needs </w:t>
+      </w:r>
+      <w:r>
+        <w:rPr>
+          <w:b/>
+          <w:bCs/>
+        </w:rPr>
+        <w:t>merge + reclassify</w:t>
+      </w:r>
+      <w:r>
+        <w:t xml:space="preserve">, not a new record. Reconnect; </w:t>
+      </w:r>
+      <w:r>
+        <w:rPr>
+          <w:b/>
+          <w:bCs/>
+        </w:rPr>
+        <w:t>Jason</w:t>
+      </w:r>
+      <w:r>
+        <w:t xml:space="preserve"> works with them (Abbotsford); KOR did </w:t>
+      </w:r>
+      <w:r>
+        <w:rPr>
+          <w:b/>
+          <w:bCs/>
+        </w:rPr>
+        <w:t>Legion Veterans Village</w:t>
+      </w:r>
+      <w:r>
+        <w:t xml:space="preserve"> (2nd tower “Lucent” sold to </w:t>
+      </w:r>
+      <w:r>
+        <w:rPr>
+          <w:b/>
+          <w:bCs/>
+        </w:rPr>
+        <w:t>Landa Global</w:t>
+      </w:r>
+      <w:r>
+        <w:t xml:space="preserve">). </w:t>
+      </w:r>
+      <w:r>
+        <w:rPr>
+          <w:b/>
+          <w:bCs/>
+        </w:rPr>
+        <w:t>Verified:</w:t>
+      </w:r>
+      <w:r>
+        <w:t xml:space="preserve"> founder </w:t>
+      </w:r>
+      <w:r>
+        <w:rPr>
+          <w:b/>
+          <w:bCs/>
+        </w:rPr>
         <w:t>Larry Fisher</w:t>
       </w:r>
       <w:r>
-        <w:t>. ⚠</w:t>
-      </w:r>
-      <w:r>
-        <w:t>️</w:t>
-      </w:r>
-      <w:r>
-        <w:t xml:space="preserve"> </w:t>
-      </w:r>
-      <w:r>
-        <w:rPr>
-          <w:b/>
-          <w:bCs/>
-        </w:rPr>
-        <w:t>In the brain but duplicated</w:t>
-      </w:r>
-      <w:r>
-        <w:t xml:space="preserve"> — #53694 “The Lark Group” </w:t>
-      </w:r>
-      <w:r>
-        <w:t xml:space="preserve">(Developer), #72260 “Lark Projects Ltd.” (GC, BC Housing-confirmed), plus #55097/#27243 (“Unknown”). Needs </w:t>
-      </w:r>
-      <w:r>
-        <w:rPr>
-          <w:b/>
-          <w:bCs/>
-        </w:rPr>
-        <w:t>merge + reclassify</w:t>
-      </w:r>
-      <w:r>
-        <w:t xml:space="preserve">, not a new record. Reconnect; </w:t>
-      </w:r>
-      <w:r>
-        <w:rPr>
-          <w:b/>
-          <w:bCs/>
-        </w:rPr>
-        <w:t>Jason</w:t>
-      </w:r>
-      <w:r>
-        <w:t xml:space="preserve"> works with them (Abbotsford); KOR did </w:t>
-      </w:r>
-      <w:r>
-        <w:rPr>
-          <w:b/>
-          <w:bCs/>
-        </w:rPr>
-        <w:t>Legion Veterans Village</w:t>
-      </w:r>
-      <w:r>
-        <w:t xml:space="preserve"> (2nd tower “Lucent” sold to </w:t>
-      </w:r>
-      <w:r>
-        <w:rPr>
-          <w:b/>
-          <w:bCs/>
-        </w:rPr>
-        <w:t>Landa Global</w:t>
-      </w:r>
-      <w:r>
-        <w:t xml:space="preserve">). The founder-death/sale Rory recalled is </w:t>
-      </w:r>
-      <w:r>
-        <w:rPr>
-          <w:b/>
-          <w:bCs/>
-        </w:rPr>
-        <w:t>unconfirmed</w:t>
-      </w:r>
-      <w:r>
-        <w:t xml:space="preserve"> — verify before referencing.</w:t>
+        <w:t xml:space="preserve"> died Feb 2023; his son </w:t>
+      </w:r>
+      <w:r>
+        <w:rPr>
+          <w:b/>
+          <w:bCs/>
+        </w:rPr>
+        <w:t>Kirk Fisher</w:t>
+      </w:r>
+      <w:r>
+        <w:t xml:space="preserve"> is now CEO — so Rory’s founder-death recollection was right, but the </w:t>
+      </w:r>
+      <w:r>
+        <w:rPr>
+          <w:i/>
+          <w:iCs/>
+        </w:rPr>
+        <w:t>live</w:t>
+      </w:r>
+      <w:r>
+        <w:t xml:space="preserve"> contact is </w:t>
+      </w:r>
+      <w:r>
+        <w:rPr>
+          <w:b/>
+          <w:bCs/>
+        </w:rPr>
+        <w:t>Kirk</w:t>
+      </w:r>
+      <w:r>
+        <w:t>,</w:t>
+      </w:r>
+      <w:r>
+        <w:t xml:space="preserve"> not Larry.</w:t>
       </w:r>
     </w:p>
     <w:p>
@@ -5145,7 +4074,10 @@
         <w:t>City of Nanaimo</w:t>
       </w:r>
       <w:r>
-        <w:t xml:space="preserve"> — municipal-direct work (steady stream).</w:t>
+        <w:t xml:space="preserve"> </w:t>
+      </w:r>
+      <w:r>
+        <w:t>— municipal-direct work (steady stream).</w:t>
       </w:r>
     </w:p>
     <w:p>
@@ -5271,17 +4203,7 @@
         <w:t>Greg Zemrau — Emerge Modular</w:t>
       </w:r>
       <w:r>
-        <w:t xml:space="preserve"> [High] </w:t>
-      </w:r>
-      <w:r>
-        <w:rPr>
-          <w:i/>
-          <w:iCs/>
-        </w:rPr>
-        <w:t>(“Gregg”)</w:t>
-      </w:r>
-      <w:r>
-        <w:t xml:space="preserve"> — </w:t>
+        <w:t xml:space="preserve"> [High] — </w:t>
       </w:r>
       <w:r>
         <w:rPr>
@@ -5341,10 +4263,10 @@
         <w:t>5% down</w:t>
       </w:r>
       <w:r>
-        <w:t xml:space="preserve"> on modular (even &gt;$1M, trans</w:t>
-      </w:r>
-      <w:r>
-        <w:t>fers to homeowner) — lean in.</w:t>
+        <w:t xml:space="preserve"> on modular (even &gt;$1M, transfers to ho</w:t>
+      </w:r>
+      <w:r>
+        <w:t>meowner) — lean in.</w:t>
       </w:r>
     </w:p>
     <w:p>
@@ -5373,7 +4295,10 @@
         <w:t>existing KOR client</w:t>
       </w:r>
       <w:r>
-        <w:t xml:space="preserve"> (eng #97). The Langford/Victoria developer that several of Greg’s KOR jobs come in through — the developer-partner side of the modular pipeline. Rory’s lead; keep Emerge ↔ Evantra linked.</w:t>
+        <w:t xml:space="preserve"> </w:t>
+      </w:r>
+      <w:r>
+        <w:t>(eng #97). The Langford/Victoria developer that several of Greg’s KOR jobs come in through — the developer-partner side of the modular pipeline. Rory’s lead; keep Emerge ↔ Evantra linked.</w:t>
       </w:r>
     </w:p>
     <w:p>
@@ -5392,16 +4317,6 @@
         <w:t>Yellowridge Construction Ltd.</w:t>
       </w:r>
       <w:r>
-        <w:t xml:space="preserve"> </w:t>
-      </w:r>
-      <w:r>
-        <w:rPr>
-          <w:i/>
-          <w:iCs/>
-        </w:rPr>
-        <w:t>(“Yellow Ridge”)</w:t>
-      </w:r>
-      <w:r>
         <w:t xml:space="preserve"> [High] — </w:t>
       </w:r>
       <w:r>
@@ -5441,16 +4356,6 @@
         <w:t>WHB Group</w:t>
       </w:r>
       <w:r>
-        <w:t xml:space="preserve"> </w:t>
-      </w:r>
-      <w:r>
-        <w:rPr>
-          <w:i/>
-          <w:iCs/>
-        </w:rPr>
-        <w:t>(“WWBH”)</w:t>
-      </w:r>
-      <w:r>
         <w:t xml:space="preserve"> [Med] — New Westminster formwork/rebar; principal </w:t>
       </w:r>
       <w:r>
@@ -5490,16 +4395,7 @@
         <w:t>(vs. “Wilson Shen”)</w:t>
       </w:r>
       <w:r>
-        <w:t xml:space="preserve"> </w:t>
-      </w:r>
-      <w:r>
-        <w:t>[Low] — Island modular operator. ⚠</w:t>
-      </w:r>
-      <w:r>
-        <w:t>️</w:t>
-      </w:r>
-      <w:r>
-        <w:t xml:space="preserve"> Our DB has a </w:t>
+        <w:t xml:space="preserve"> [Low] — Island modular operator. Our DB has a </w:t>
       </w:r>
       <w:r>
         <w:rPr>
@@ -5529,13 +4425,7 @@
         <w:t>Thind</w:t>
       </w:r>
       <w:r>
-        <w:t xml:space="preserve"> developers project could be a large modular tower in Burnaby (steel modules from China, Canada Builds funding) — see ⚠</w:t>
-      </w:r>
-      <w:r>
-        <w:t>️</w:t>
-      </w:r>
-      <w:r>
-        <w:t xml:space="preserve"> Thind note in §7.</w:t>
+        <w:t xml:space="preserve"> developers project could be a large modular tower in Burnaby (steel modules from China, Canada Builds funding) — see Thind note in §7.</w:t>
       </w:r>
     </w:p>
     <w:p>
@@ -5590,8 +4480,8 @@
       <w:pPr>
         <w:pStyle w:val="Heading3"/>
       </w:pPr>
-      <w:bookmarkStart w:id="16" w:name="okanagan-interior-conor-lead"/>
-      <w:bookmarkEnd w:id="15"/>
+      <w:bookmarkStart w:id="9" w:name="okanagan-interior-conor-lead"/>
+      <w:bookmarkEnd w:id="8"/>
       <w:r>
         <w:t>Okanagan &amp; Interior — Conor (lead)</w:t>
       </w:r>
@@ -5624,16 +4514,6 @@
         <w:t>Orchard Park Properties</w:t>
       </w:r>
       <w:r>
-        <w:t xml:space="preserve"> </w:t>
-      </w:r>
-      <w:r>
-        <w:rPr>
-          <w:i/>
-          <w:iCs/>
-        </w:rPr>
-        <w:t>(“Apriano”)</w:t>
-      </w:r>
-      <w:r>
         <w:t xml:space="preserve"> [High] — principal </w:t>
       </w:r>
       <w:r>
@@ -5670,7 +4550,7 @@
           <w:b/>
           <w:bCs/>
         </w:rPr>
-        <w:t>Losing the Penticton (“Politano”) office space</w:t>
+        <w:t>Losing the Penticton office space</w:t>
       </w:r>
       <w:r>
         <w:t xml:space="preserve"> — decided to let it go (confirmed).</w:t>
@@ -5692,8 +4572,8 @@
       <w:pPr>
         <w:pStyle w:val="Heading3"/>
       </w:pPr>
-      <w:bookmarkStart w:id="17" w:name="X16998a4ad53ccd011fa9b1229f129f22170b18b"/>
-      <w:bookmarkEnd w:id="16"/>
+      <w:bookmarkStart w:id="10" w:name="X16998a4ad53ccd011fa9b1229f129f22170b18b"/>
+      <w:bookmarkEnd w:id="9"/>
       <w:r>
         <w:t>Andrea — get more front-facing (explicit ask)</w:t>
       </w:r>
@@ -5714,13 +4594,10 @@
         <w:t>Arno Matis Architecture (AMA)</w:t>
       </w:r>
       <w:r>
-        <w:t xml:space="preserve"> [High] — ⚠</w:t>
-      </w:r>
-      <w:r>
-        <w:t>️</w:t>
-      </w:r>
-      <w:r>
-        <w:t xml:space="preserve"> the transcript’s </w:t>
+        <w:t xml:space="preserve"> </w:t>
+      </w:r>
+      <w:r>
+        <w:t xml:space="preserve">[High] — the transcript’s </w:t>
       </w:r>
       <w:r>
         <w:rPr>
@@ -5824,7 +4701,7 @@
         <w:t>Purpose Driven Development</w:t>
       </w:r>
       <w:r>
-        <w:t xml:space="preserve"> [High] — ✅Deltek; founder </w:t>
+        <w:t xml:space="preserve"> [High] — Deltek; founder </w:t>
       </w:r>
       <w:r>
         <w:rPr>
@@ -5844,16 +4721,6 @@
         <w:t>Annelise van der Veen</w:t>
       </w:r>
       <w:r>
-        <w:t xml:space="preserve"> </w:t>
-      </w:r>
-      <w:r>
-        <w:rPr>
-          <w:i/>
-          <w:iCs/>
-        </w:rPr>
-        <w:t>(“Dan Van Mueller/King”)</w:t>
-      </w:r>
-      <w:r>
         <w:t xml:space="preserve">. All-women consultant teams. Reviewed/awarded KOR the </w:t>
       </w:r>
       <w:r>
@@ -5871,8 +4738,8 @@
       <w:pPr>
         <w:pStyle w:val="Heading3"/>
       </w:pPr>
-      <w:bookmarkStart w:id="18" w:name="usa-california-john-lead-jim"/>
-      <w:bookmarkEnd w:id="17"/>
+      <w:bookmarkStart w:id="11" w:name="usa-california-john-lead-jim"/>
+      <w:bookmarkEnd w:id="10"/>
       <w:r>
         <w:t>USA / California — John (lead), Jim</w:t>
       </w:r>
@@ -5953,7 +4820,7 @@
     </w:p>
     <w:p>
       <w:r>
-        <w:pict w14:anchorId="46B04BCF">
+        <w:pict w14:anchorId="239F304B">
           <v:rect id="_x0000_i1028" style="width:0;height:1.5pt" o:hralign="center" o:hrstd="t" o:hr="t"/>
         </w:pict>
       </w:r>
@@ -5963,17 +4830,12 @@
         <w:pStyle w:val="Heading2"/>
         <w:pageBreakBefore/>
       </w:pPr>
-      <w:bookmarkStart w:id="19" w:name="Xfa51d67e5cdb29dc08ec51ef38a1ba2bcac1254"/>
-      <w:bookmarkStart w:id="20" w:name="_Toc232957777"/>
-      <w:bookmarkEnd w:id="12"/>
-      <w:bookmarkEnd w:id="18"/>
-      <w:r>
-        <w:t xml:space="preserve">6. New-sector / “outside the box” </w:t>
-      </w:r>
-      <w:r>
-        <w:t>ideas to chase</w:t>
-      </w:r>
-      <w:bookmarkEnd w:id="20"/>
+      <w:bookmarkStart w:id="12" w:name="Xfa51d67e5cdb29dc08ec51ef38a1ba2bcac1254"/>
+      <w:bookmarkEnd w:id="6"/>
+      <w:bookmarkEnd w:id="11"/>
+      <w:r>
+        <w:t>6. New-sector / “outside the box” ideas to chase</w:t>
+      </w:r>
     </w:p>
     <w:p>
       <w:pPr>
@@ -6010,10 +4872,7 @@
         <w:t>Steel-stud / suspended-ceiling / TI add-on engineering</w:t>
       </w:r>
       <w:r>
-        <w:t xml:space="preserve"> — high margin, “rinse &amp; repeat”</w:t>
-      </w:r>
-      <w:r>
-        <w:t xml:space="preserve">; offer as a proposal tick-box. JB, Kevin, Rory already do some. Garth at </w:t>
+        <w:t xml:space="preserve"> — high margin, “rinse &amp; repeat”; offer as a proposal tick-box. JB, Kevin, Rory already do some. Garth at </w:t>
       </w:r>
       <w:r>
         <w:rPr>
@@ -6117,7 +4976,10 @@
         <w:t>Marine:</w:t>
       </w:r>
       <w:r>
-        <w:t xml:space="preserve"> BC Ferries, TransLink (qualification TBD).</w:t>
+        <w:t xml:space="preserve"> </w:t>
+      </w:r>
+      <w:r>
+        <w:t>BC Ferries, TransLink (qualification TBD).</w:t>
       </w:r>
     </w:p>
     <w:p>
@@ -6141,7 +5003,7 @@
     </w:p>
     <w:p>
       <w:r>
-        <w:pict w14:anchorId="74592288">
+        <w:pict w14:anchorId="2D0C801E">
           <v:rect id="_x0000_i1029" style="width:0;height:1.5pt" o:hralign="center" o:hrstd="t" o:hr="t"/>
         </w:pict>
       </w:r>
@@ -6151,13 +5013,11 @@
         <w:pStyle w:val="Heading2"/>
         <w:pageBreakBefore/>
       </w:pPr>
-      <w:bookmarkStart w:id="21" w:name="intel-flags-read-before-acting"/>
-      <w:bookmarkStart w:id="22" w:name="_Toc232957778"/>
-      <w:bookmarkEnd w:id="19"/>
+      <w:bookmarkStart w:id="13" w:name="intel-flags-read-before-acting"/>
+      <w:bookmarkEnd w:id="12"/>
       <w:r>
         <w:t>7. Intel flags (read before acting)</w:t>
       </w:r>
-      <w:bookmarkEnd w:id="22"/>
     </w:p>
     <w:p>
       <w:pPr>
@@ -6330,7 +5190,10 @@
         <w:t>Paolo</w:t>
       </w:r>
       <w:r>
-        <w:t xml:space="preserve"> (#9305).</w:t>
+        <w:t xml:space="preserve"> </w:t>
+      </w:r>
+      <w:r>
+        <w:t>(#9305).</w:t>
       </w:r>
     </w:p>
     <w:p>
@@ -6549,10 +5412,7 @@
         <w:t>merge/reclassify</w:t>
       </w:r>
       <w:r>
-        <w:t xml:space="preserve"> </w:t>
-      </w:r>
-      <w:r>
-        <w:t>job, not an add. (Earlier draft wrongly called it net-new.)</w:t>
+        <w:t xml:space="preserve"> job, not an add.</w:t>
       </w:r>
     </w:p>
     <w:p>
@@ -6595,7 +5455,7 @@
     </w:p>
     <w:p>
       <w:r>
-        <w:pict w14:anchorId="1A8EAF8C">
+        <w:pict w14:anchorId="539BD4B1">
           <v:rect id="_x0000_i1030" style="width:0;height:1.5pt" o:hralign="center" o:hrstd="t" o:hr="t"/>
         </w:pict>
       </w:r>
@@ -6605,17 +5465,15 @@
         <w:pStyle w:val="Heading2"/>
         <w:pageBreakBefore/>
       </w:pPr>
-      <w:bookmarkStart w:id="23" w:name="confirmed-people-directory"/>
-      <w:bookmarkStart w:id="24" w:name="_Toc232957779"/>
-      <w:bookmarkEnd w:id="21"/>
+      <w:bookmarkStart w:id="14" w:name="confirmed-people-directory"/>
+      <w:bookmarkEnd w:id="13"/>
       <w:r>
         <w:t>8. Confirmed people directory</w:t>
       </w:r>
-      <w:bookmarkEnd w:id="24"/>
     </w:p>
     <w:tbl>
       <w:tblPr>
-        <w:tblStyle w:val="GridTable5Dark-Accent1"/>
+        <w:tblStyle w:val="GridTable4-Accent1"/>
         <w:tblW w:w="5000" w:type="pct"/>
         <w:tblCellMar>
           <w:top w:w="40" w:type="dxa"/>
@@ -7280,13 +6138,7 @@
               <w:rPr>
                 <w:sz w:val="19"/>
               </w:rPr>
-              <w:t xml:space="preserve"> </w:t>
-            </w:r>
-            <w:r>
-              <w:rPr>
-                <w:sz w:val="19"/>
-              </w:rPr>
-              <w:t>(founder Carla Guerrera)</w:t>
+              <w:t xml:space="preserve"> (founder Carla Guerrera)</w:t>
             </w:r>
           </w:p>
         </w:tc>
@@ -7526,13 +6378,7 @@
               <w:rPr>
                 <w:sz w:val="19"/>
               </w:rPr>
-              <w:t xml:space="preserve"> </w:t>
-            </w:r>
-            <w:r>
-              <w:rPr>
-                <w:sz w:val="19"/>
-              </w:rPr>
-              <w:t>/ Lower Mainland Forming (formwork/rebar)</w:t>
+              <w:t xml:space="preserve"> / Lower Mainland Forming (formwork/rebar)</w:t>
             </w:r>
           </w:p>
         </w:tc>
@@ -7958,13 +6804,11 @@
         <w:pStyle w:val="Heading2"/>
         <w:pageBreakBefore/>
       </w:pPr>
-      <w:bookmarkStart w:id="25" w:name="verify-directly-dont-guess-further"/>
-      <w:bookmarkStart w:id="26" w:name="_Toc232957780"/>
-      <w:bookmarkEnd w:id="23"/>
+      <w:bookmarkStart w:id="15" w:name="verify-directly-dont-guess-further"/>
+      <w:bookmarkEnd w:id="14"/>
       <w:r>
         <w:t>9. Verify directly (don’t guess further)</w:t>
       </w:r>
-      <w:bookmarkEnd w:id="26"/>
     </w:p>
     <w:p>
       <w:pPr>
@@ -8104,18 +6948,11 @@
         <w:rPr>
           <w:b/>
           <w:bCs/>
-          <w:strike/>
         </w:rPr>
         <w:t>Gregg</w:t>
       </w:r>
       <w:r>
-        <w:rPr>
-          <w:strike/>
-        </w:rPr>
-        <w:t xml:space="preserve"> (modular)</w:t>
-      </w:r>
-      <w:r>
-        <w:t xml:space="preserve"> — </w:t>
+        <w:t xml:space="preserve"> (modular) — </w:t>
       </w:r>
       <w:r>
         <w:rPr>
@@ -8149,7 +6986,7 @@
     </w:p>
     <w:p>
       <w:r>
-        <w:pict w14:anchorId="6EF15650">
+        <w:pict w14:anchorId="1C3B6351">
           <v:rect id="_x0000_i1031" style="width:0;height:1.5pt" o:hralign="center" o:hrstd="t" o:hr="t"/>
         </w:pict>
       </w:r>
@@ -8159,13 +6996,11 @@
         <w:pStyle w:val="Heading2"/>
         <w:pageBreakBefore/>
       </w:pPr>
-      <w:bookmarkStart w:id="27" w:name="Xcfdcc19d29137ee3732eb0fbcf1d1a3e7bba30e"/>
-      <w:bookmarkStart w:id="28" w:name="_Toc232957781"/>
-      <w:bookmarkEnd w:id="25"/>
+      <w:bookmarkStart w:id="16" w:name="Xcfdcc19d29137ee3732eb0fbcf1d1a3e7bba30e"/>
+      <w:bookmarkEnd w:id="15"/>
       <w:r>
         <w:t>10. Biz Brain ingest (applied &amp; verified 2026-06-19)</w:t>
       </w:r>
-      <w:bookmarkEnd w:id="28"/>
     </w:p>
     <w:p>
       <w:pPr>
@@ -8203,12 +7038,6 @@
         </w:numPr>
       </w:pPr>
       <w:r>
-        <w:t>✅</w:t>
-      </w:r>
-      <w:r>
-        <w:t xml:space="preserve"> </w:t>
-      </w:r>
-      <w:r>
         <w:rPr>
           <w:b/>
           <w:bCs/>
@@ -8216,10 +7045,7 @@
         <w:t>3 dedup merges</w:t>
       </w:r>
       <w:r>
-        <w:t xml:space="preserve"> </w:t>
-      </w:r>
-      <w:r>
-        <w:t>— Lark ×2 (stray “Unknown” rows folded into Developer #53694 / GC #72260, arms kept separate), Nch’</w:t>
+        <w:t xml:space="preserve"> — Lark ×2 (stray “Unknown” rows folded into Developer #53694 / GC #72260, arms kept separate), Nch’</w:t>
       </w:r>
       <w:r>
         <w:t>ḵ</w:t>
@@ -8237,12 +7063,6 @@
         </w:numPr>
       </w:pPr>
       <w:r>
-        <w:t>✅</w:t>
-      </w:r>
-      <w:r>
-        <w:t xml:space="preserve"> </w:t>
-      </w:r>
-      <w:r>
         <w:rPr>
           <w:b/>
           <w:bCs/>
@@ -8271,12 +7091,6 @@
         </w:numPr>
       </w:pPr>
       <w:r>
-        <w:t>✅</w:t>
-      </w:r>
-      <w:r>
-        <w:t xml:space="preserve"> </w:t>
-      </w:r>
-      <w:r>
         <w:rPr>
           <w:b/>
           <w:bCs/>
@@ -8284,7 +7098,10 @@
         <w:t>4 aliases</w:t>
       </w:r>
       <w:r>
-        <w:t xml:space="preserve"> — “Mundai Group”, “Yellow Ridge”, “Open Forum”, “Open RD” → their canonicals (all resolve).</w:t>
+        <w:t xml:space="preserve"> — “Mundai Group”, </w:t>
+      </w:r>
+      <w:r>
+        <w:t>“Yellow Ridge”, “Open Forum”, “Open RD” → their canonicals (all resolve).</w:t>
       </w:r>
     </w:p>
     <w:p>
@@ -8296,12 +7113,6 @@
         </w:numPr>
       </w:pPr>
       <w:r>
-        <w:t>✅</w:t>
-      </w:r>
-      <w:r>
-        <w:t xml:space="preserve"> </w:t>
-      </w:r>
-      <w:r>
         <w:rPr>
           <w:b/>
           <w:bCs/>
@@ -8327,12 +7138,6 @@
         </w:numPr>
       </w:pPr>
       <w:r>
-        <w:t>✅</w:t>
-      </w:r>
-      <w:r>
-        <w:t xml:space="preserve"> </w:t>
-      </w:r>
-      <w:r>
         <w:rPr>
           <w:b/>
           <w:bCs/>
@@ -8352,15 +7157,6 @@
         </w:numPr>
       </w:pPr>
       <w:r>
-        <w:t>⏭</w:t>
-      </w:r>
-      <w:r>
-        <w:t>️</w:t>
-      </w:r>
-      <w:r>
-        <w:t xml:space="preserve"> </w:t>
-      </w:r>
-      <w:r>
         <w:rPr>
           <w:b/>
           <w:bCs/>
@@ -8390,15 +7186,25 @@
         <w:t>Brain-wide hardening since the meeting (2026-06-21):</w:t>
       </w:r>
       <w:r>
-        <w:t xml:space="preserve"> beyond these meeting-specific writes, the whole module was cleaned — 50k→17.8k warm orgs (commodity-vendor cull, reversible), 100+ dup clusters merged incl. the BC health-authority cluster (32→9), 81 Kind corrections, MPI FK completion, and the resolver dup-creation cycle closed (fuzzy pre-create match). Full deep re-enrichment of all BD-relevant orgs is now running. Net effect for these pursuits: the targets sit in a deduped, correctly-typed, FK-sound graph and will carry fresh verified intel by the Tuesd</w:t>
-      </w:r>
-      <w:r>
-        <w:t>ay deliverable. All IDs in this doc re-verified 2026-06-21.</w:t>
-      </w:r>
-    </w:p>
-    <w:p>
-      <w:r>
-        <w:pict w14:anchorId="3B892DB4">
+        <w:t xml:space="preserve"> beyond these meeting-specific writes, the whole module was cleaned — 50k→17.8k warm orgs (commodity-vendor cull, reversible), 100+ dup clusters merged incl. the BC health-authority cluster (32→9), 81 Kind corrections, MPI FK completion, and the resolver dup-creation cycle closed (fuzzy pre-create match). Enrichment is now </w:t>
+      </w:r>
+      <w:r>
+        <w:rPr>
+          <w:b/>
+          <w:bCs/>
+        </w:rPr>
+        <w:t>targeted and cost-controlled</w:t>
+      </w:r>
+      <w:r>
+        <w:t xml:space="preserve"> — the high-value pursuit targets are enriched on the cleaned graph; the indiscriminate always-on full-base pass was retired. Net effect for these pursuits: th</w:t>
+      </w:r>
+      <w:r>
+        <w:t>e targets sit in a deduped, correctly-typed, FK-sound graph with verified intel. All IDs in this doc re-verified 2026-06-21.</w:t>
+      </w:r>
+    </w:p>
+    <w:p>
+      <w:r>
+        <w:pict w14:anchorId="2D5DEC2D">
           <v:rect id="_x0000_i1032" style="width:0;height:1.5pt" o:hralign="center" o:hrstd="t" o:hr="t"/>
         </w:pict>
       </w:r>
@@ -8408,13 +7214,11 @@
         <w:pStyle w:val="Heading2"/>
         <w:pageBreakBefore/>
       </w:pPr>
-      <w:bookmarkStart w:id="29" w:name="Xcf0a1025e0a49976d280ecbba304c8d5df50af6"/>
-      <w:bookmarkStart w:id="30" w:name="_Toc232957782"/>
-      <w:bookmarkEnd w:id="27"/>
+      <w:bookmarkStart w:id="17" w:name="Xcf0a1025e0a49976d280ecbba304c8d5df50af6"/>
+      <w:bookmarkEnd w:id="16"/>
       <w:r>
         <w:t>11. CRM — pursuits loaded this session (applied &amp; verified 2026-06-19)</w:t>
       </w:r>
-      <w:bookmarkEnd w:id="30"/>
     </w:p>
     <w:p>
       <w:pPr>
@@ -8458,7 +7262,7 @@
     </w:p>
     <w:tbl>
       <w:tblPr>
-        <w:tblStyle w:val="GridTable5Dark-Accent1"/>
+        <w:tblStyle w:val="GridTable4-Accent1"/>
         <w:tblW w:w="5000" w:type="pct"/>
         <w:tblCellMar>
           <w:top w:w="40" w:type="dxa"/>
@@ -8693,13 +7497,7 @@
               <w:rPr>
                 <w:sz w:val="19"/>
               </w:rPr>
-              <w:t xml:space="preserve"> </w:t>
-            </w:r>
-            <w:r>
-              <w:rPr>
-                <w:sz w:val="19"/>
-              </w:rPr>
-              <w:t>Hot active client, kp=6 (last 2026-03-03). Richmond Hotel (u/c), 137th St (awarded), Cobalt Hotel (likely), Edmonton hotel (drawings incoming). Pitch re-engineering their WSP work.</w:t>
+              <w:t xml:space="preserve"> Hot active client, kp=6 (last 2026-03-03). Richmond Hotel (u/c), 137th St (awarded), Cobalt Hotel (likely), Edmonton hotel (drawings incoming). Pitch re-engineering their WSP work.</w:t>
             </w:r>
           </w:p>
         </w:tc>
@@ -9440,7 +8238,7 @@
     </w:p>
     <w:tbl>
       <w:tblPr>
-        <w:tblStyle w:val="GridTable5Dark-Accent1"/>
+        <w:tblStyle w:val="GridTable4-Accent1"/>
         <w:tblW w:w="5000" w:type="pct"/>
         <w:tblCellMar>
           <w:top w:w="40" w:type="dxa"/>
@@ -9824,7 +8622,7 @@
     </w:p>
     <w:p>
       <w:r>
-        <w:pict w14:anchorId="18AB28EF">
+        <w:pict w14:anchorId="073A3459">
           <v:rect id="_x0000_i1033" style="width:0;height:1.5pt" o:hralign="center" o:hrstd="t" o:hr="t"/>
         </w:pict>
       </w:r>
@@ -9841,7 +8639,7 @@
         <w:t>Generated from the meeting recording; corrected names sourced from the BD brain (canonical orgs / Deltek) and web verification. Brain + CRM writes applied 2026-06-19 with post-audit; low-confidence names flagged for human confirmation rather than auto-ingested.</w:t>
       </w:r>
       <w:bookmarkEnd w:id="0"/>
-      <w:bookmarkEnd w:id="29"/>
+      <w:bookmarkEnd w:id="17"/>
     </w:p>
     <w:sectPr>
       <w:footnotePr>
@@ -9860,7 +8658,7 @@
   <w:abstractNum w:abstractNumId="0" w15:restartNumberingAfterBreak="0">
     <w:nsid w:val="0000A990"/>
     <w:multiLevelType w:val="multilevel"/>
-    <w:tmpl w:val="A8ECF690"/>
+    <w:tmpl w:val="E3ACDA74"/>
     <w:lvl w:ilvl="0">
       <w:numFmt w:val="bullet"/>
       <w:lvlText w:val=" "/>
@@ -9937,7 +8735,7 @@
   <w:abstractNum w:abstractNumId="1" w15:restartNumberingAfterBreak="0">
     <w:nsid w:val="0000A991"/>
     <w:multiLevelType w:val="multilevel"/>
-    <w:tmpl w:val="6318E8FA"/>
+    <w:tmpl w:val="95F67A9C"/>
     <w:lvl w:ilvl="0">
       <w:numFmt w:val="bullet"/>
       <w:lvlText w:val=""/>
@@ -10041,7 +8839,7 @@
   <w:abstractNum w:abstractNumId="2" w15:restartNumberingAfterBreak="0">
     <w:nsid w:val="00A99411"/>
     <w:multiLevelType w:val="multilevel"/>
-    <w:tmpl w:val="39F28922"/>
+    <w:tmpl w:val="7D56D706"/>
     <w:lvl w:ilvl="0">
       <w:start w:val="1"/>
       <w:numFmt w:val="decimal"/>
@@ -10124,49 +8922,49 @@
       </w:pPr>
     </w:lvl>
   </w:abstractNum>
-  <w:num w:numId="1" w16cid:durableId="417017368">
+  <w:num w:numId="1" w16cid:durableId="2138719101">
     <w:abstractNumId w:val="0"/>
   </w:num>
-  <w:num w:numId="2" w16cid:durableId="529337099">
+  <w:num w:numId="2" w16cid:durableId="536891231">
     <w:abstractNumId w:val="1"/>
   </w:num>
-  <w:num w:numId="3" w16cid:durableId="554317659">
+  <w:num w:numId="3" w16cid:durableId="244535941">
     <w:abstractNumId w:val="1"/>
   </w:num>
-  <w:num w:numId="4" w16cid:durableId="108278819">
+  <w:num w:numId="4" w16cid:durableId="1769499551">
     <w:abstractNumId w:val="1"/>
   </w:num>
-  <w:num w:numId="5" w16cid:durableId="2045905175">
+  <w:num w:numId="5" w16cid:durableId="1679455369">
     <w:abstractNumId w:val="1"/>
   </w:num>
-  <w:num w:numId="6" w16cid:durableId="1569994597">
+  <w:num w:numId="6" w16cid:durableId="588269513">
     <w:abstractNumId w:val="1"/>
   </w:num>
-  <w:num w:numId="7" w16cid:durableId="602957977">
+  <w:num w:numId="7" w16cid:durableId="1155728076">
     <w:abstractNumId w:val="1"/>
   </w:num>
-  <w:num w:numId="8" w16cid:durableId="1345328718">
+  <w:num w:numId="8" w16cid:durableId="2126120898">
     <w:abstractNumId w:val="1"/>
   </w:num>
-  <w:num w:numId="9" w16cid:durableId="1626892110">
+  <w:num w:numId="9" w16cid:durableId="249126535">
     <w:abstractNumId w:val="1"/>
   </w:num>
-  <w:num w:numId="10" w16cid:durableId="2078895578">
+  <w:num w:numId="10" w16cid:durableId="1516267188">
     <w:abstractNumId w:val="1"/>
   </w:num>
-  <w:num w:numId="11" w16cid:durableId="1141264508">
+  <w:num w:numId="11" w16cid:durableId="113183495">
     <w:abstractNumId w:val="1"/>
   </w:num>
-  <w:num w:numId="12" w16cid:durableId="1560167589">
+  <w:num w:numId="12" w16cid:durableId="1017660176">
     <w:abstractNumId w:val="1"/>
   </w:num>
-  <w:num w:numId="13" w16cid:durableId="601957166">
+  <w:num w:numId="13" w16cid:durableId="79572487">
     <w:abstractNumId w:val="1"/>
   </w:num>
-  <w:num w:numId="14" w16cid:durableId="114061962">
+  <w:num w:numId="14" w16cid:durableId="522983814">
     <w:abstractNumId w:val="1"/>
   </w:num>
-  <w:num w:numId="15" w16cid:durableId="487209351">
+  <w:num w:numId="15" w16cid:durableId="545989238">
     <w:abstractNumId w:val="2"/>
     <w:lvlOverride w:ilvl="0">
       <w:startOverride w:val="1"/>
@@ -10196,13 +8994,13 @@
       <w:startOverride w:val="1"/>
     </w:lvlOverride>
   </w:num>
-  <w:num w:numId="16" w16cid:durableId="935478211">
+  <w:num w:numId="16" w16cid:durableId="1624338255">
     <w:abstractNumId w:val="1"/>
   </w:num>
-  <w:num w:numId="17" w16cid:durableId="1687562736">
+  <w:num w:numId="17" w16cid:durableId="973945471">
     <w:abstractNumId w:val="1"/>
   </w:num>
-  <w:num w:numId="18" w16cid:durableId="1155949800">
+  <w:num w:numId="18" w16cid:durableId="1035544457">
     <w:abstractNumId w:val="1"/>
   </w:num>
 </w:numbering>
@@ -10226,9 +9024,6 @@
     </w:pPrDefault>
   </w:docDefaults>
   <w:latentStyles w:defLockedState="0" w:defUIPriority="0" w:defSemiHidden="0" w:defUnhideWhenUsed="0" w:defQFormat="0" w:count="376">
-    <w:lsdException w:name="toc 1" w:uiPriority="39"/>
-    <w:lsdException w:name="toc 2" w:uiPriority="39"/>
-    <w:lsdException w:name="Hyperlink" w:uiPriority="99"/>
     <w:lsdException w:name="Normal Table" w:semiHidden="1" w:unhideWhenUsed="1"/>
     <w:lsdException w:name="Table Simple 1" w:semiHidden="1" w:unhideWhenUsed="1"/>
     <w:lsdException w:name="Table Simple 2" w:semiHidden="1" w:unhideWhenUsed="1"/>
@@ -11117,7 +9912,6 @@
   <w:style w:type="character" w:styleId="Hyperlink">
     <w:name w:val="Hyperlink"/>
     <w:basedOn w:val="CaptionChar"/>
-    <w:uiPriority w:val="99"/>
     <w:rPr>
       <w:color w:val="156082" w:themeColor="accent1"/>
     </w:rPr>
@@ -11437,34 +10231,11 @@
       <w:sz w:val="22"/>
     </w:rPr>
   </w:style>
-  <w:style w:type="paragraph" w:styleId="TOC1">
-    <w:name w:val="toc 1"/>
-    <w:basedOn w:val="Normal"/>
-    <w:next w:val="Normal"/>
-    <w:autoRedefine/>
-    <w:uiPriority w:val="39"/>
-    <w:rsid w:val="004E3789"/>
-    <w:pPr>
-      <w:spacing w:after="100"/>
-    </w:pPr>
-  </w:style>
-  <w:style w:type="paragraph" w:styleId="TOC2">
-    <w:name w:val="toc 2"/>
-    <w:basedOn w:val="Normal"/>
-    <w:next w:val="Normal"/>
-    <w:autoRedefine/>
-    <w:uiPriority w:val="39"/>
-    <w:rsid w:val="004E3789"/>
-    <w:pPr>
-      <w:spacing w:after="100"/>
-      <w:ind w:left="240"/>
-    </w:pPr>
-  </w:style>
-  <w:style w:type="table" w:styleId="GridTable5Dark-Accent1">
-    <w:name w:val="Grid Table 5 Dark Accent 1"/>
+  <w:style w:type="table" w:styleId="GridTable4-Accent1">
+    <w:name w:val="Grid Table 4 Accent 1"/>
     <w:basedOn w:val="TableNormal"/>
-    <w:uiPriority w:val="50"/>
-    <w:rsid w:val="004E3789"/>
+    <w:uiPriority w:val="49"/>
+    <w:rsid w:val="00BC00ED"/>
     <w:pPr>
       <w:spacing w:after="0"/>
     </w:pPr>
@@ -11472,17 +10243,14 @@
       <w:tblStyleRowBandSize w:val="1"/>
       <w:tblStyleColBandSize w:val="1"/>
       <w:tblBorders>
-        <w:top w:val="single" w:sz="4" w:space="0" w:color="FFFFFF" w:themeColor="background1"/>
-        <w:left w:val="single" w:sz="4" w:space="0" w:color="FFFFFF" w:themeColor="background1"/>
-        <w:bottom w:val="single" w:sz="4" w:space="0" w:color="FFFFFF" w:themeColor="background1"/>
-        <w:right w:val="single" w:sz="4" w:space="0" w:color="FFFFFF" w:themeColor="background1"/>
-        <w:insideH w:val="single" w:sz="4" w:space="0" w:color="FFFFFF" w:themeColor="background1"/>
-        <w:insideV w:val="single" w:sz="4" w:space="0" w:color="FFFFFF" w:themeColor="background1"/>
+        <w:top w:val="single" w:sz="4" w:space="0" w:color="45B0E1" w:themeColor="accent1" w:themeTint="99"/>
+        <w:left w:val="single" w:sz="4" w:space="0" w:color="45B0E1" w:themeColor="accent1" w:themeTint="99"/>
+        <w:bottom w:val="single" w:sz="4" w:space="0" w:color="45B0E1" w:themeColor="accent1" w:themeTint="99"/>
+        <w:right w:val="single" w:sz="4" w:space="0" w:color="45B0E1" w:themeColor="accent1" w:themeTint="99"/>
+        <w:insideH w:val="single" w:sz="4" w:space="0" w:color="45B0E1" w:themeColor="accent1" w:themeTint="99"/>
+        <w:insideV w:val="single" w:sz="4" w:space="0" w:color="45B0E1" w:themeColor="accent1" w:themeTint="99"/>
       </w:tblBorders>
     </w:tblPr>
-    <w:tcPr>
-      <w:shd w:val="clear" w:color="auto" w:fill="C1E4F5" w:themeFill="accent1" w:themeFillTint="33"/>
-    </w:tcPr>
     <w:tblStylePr w:type="firstRow">
       <w:rPr>
         <w:b/>
@@ -11492,9 +10260,10 @@
       <w:tblPr/>
       <w:tcPr>
         <w:tcBorders>
-          <w:top w:val="single" w:sz="4" w:space="0" w:color="FFFFFF" w:themeColor="background1"/>
-          <w:left w:val="single" w:sz="4" w:space="0" w:color="FFFFFF" w:themeColor="background1"/>
-          <w:right w:val="single" w:sz="4" w:space="0" w:color="FFFFFF" w:themeColor="background1"/>
+          <w:top w:val="single" w:sz="4" w:space="0" w:color="156082" w:themeColor="accent1"/>
+          <w:left w:val="single" w:sz="4" w:space="0" w:color="156082" w:themeColor="accent1"/>
+          <w:bottom w:val="single" w:sz="4" w:space="0" w:color="156082" w:themeColor="accent1"/>
+          <w:right w:val="single" w:sz="4" w:space="0" w:color="156082" w:themeColor="accent1"/>
           <w:insideH w:val="nil"/>
           <w:insideV w:val="nil"/>
         </w:tcBorders>
@@ -11505,64 +10274,36 @@
       <w:rPr>
         <w:b/>
         <w:bCs/>
-        <w:color w:val="FFFFFF" w:themeColor="background1"/>
       </w:rPr>
       <w:tblPr/>
       <w:tcPr>
         <w:tcBorders>
-          <w:left w:val="single" w:sz="4" w:space="0" w:color="FFFFFF" w:themeColor="background1"/>
-          <w:bottom w:val="single" w:sz="4" w:space="0" w:color="FFFFFF" w:themeColor="background1"/>
-          <w:right w:val="single" w:sz="4" w:space="0" w:color="FFFFFF" w:themeColor="background1"/>
-          <w:insideH w:val="nil"/>
-          <w:insideV w:val="nil"/>
+          <w:top w:val="double" w:sz="4" w:space="0" w:color="156082" w:themeColor="accent1"/>
         </w:tcBorders>
-        <w:shd w:val="clear" w:color="auto" w:fill="156082" w:themeFill="accent1"/>
       </w:tcPr>
     </w:tblStylePr>
     <w:tblStylePr w:type="firstCol">
       <w:rPr>
         <w:b/>
         <w:bCs/>
-        <w:color w:val="FFFFFF" w:themeColor="background1"/>
       </w:rPr>
-      <w:tblPr/>
-      <w:tcPr>
-        <w:tcBorders>
-          <w:top w:val="single" w:sz="4" w:space="0" w:color="FFFFFF" w:themeColor="background1"/>
-          <w:left w:val="single" w:sz="4" w:space="0" w:color="FFFFFF" w:themeColor="background1"/>
-          <w:bottom w:val="single" w:sz="4" w:space="0" w:color="FFFFFF" w:themeColor="background1"/>
-          <w:insideV w:val="nil"/>
-        </w:tcBorders>
-        <w:shd w:val="clear" w:color="auto" w:fill="156082" w:themeFill="accent1"/>
-      </w:tcPr>
     </w:tblStylePr>
     <w:tblStylePr w:type="lastCol">
       <w:rPr>
         <w:b/>
         <w:bCs/>
-        <w:color w:val="FFFFFF" w:themeColor="background1"/>
       </w:rPr>
-      <w:tblPr/>
-      <w:tcPr>
-        <w:tcBorders>
-          <w:top w:val="single" w:sz="4" w:space="0" w:color="FFFFFF" w:themeColor="background1"/>
-          <w:bottom w:val="single" w:sz="4" w:space="0" w:color="FFFFFF" w:themeColor="background1"/>
-          <w:right w:val="single" w:sz="4" w:space="0" w:color="FFFFFF" w:themeColor="background1"/>
-          <w:insideV w:val="nil"/>
-        </w:tcBorders>
-        <w:shd w:val="clear" w:color="auto" w:fill="156082" w:themeFill="accent1"/>
-      </w:tcPr>
     </w:tblStylePr>
     <w:tblStylePr w:type="band1Vert">
       <w:tblPr/>
       <w:tcPr>
-        <w:shd w:val="clear" w:color="auto" w:fill="83CAEB" w:themeFill="accent1" w:themeFillTint="66"/>
+        <w:shd w:val="clear" w:color="auto" w:fill="C1E4F5" w:themeFill="accent1" w:themeFillTint="33"/>
       </w:tcPr>
     </w:tblStylePr>
     <w:tblStylePr w:type="band1Horz">
       <w:tblPr/>
       <w:tcPr>
-        <w:shd w:val="clear" w:color="auto" w:fill="83CAEB" w:themeFill="accent1" w:themeFillTint="66"/>
+        <w:shd w:val="clear" w:color="auto" w:fill="C1E4F5" w:themeFill="accent1" w:themeFillTint="33"/>
       </w:tcPr>
     </w:tblStylePr>
   </w:style>

</xml_diff>